<commit_message>
Publish website from fea539d
</commit_message>
<xml_diff>
--- a/99_writing/mapping-the-field-manuscript.docx
+++ b/99_writing/mapping-the-field-manuscript.docx
@@ -24,7 +24,7 @@
         <w:pStyle w:val="Heading1"/>
       </w:pPr>
       <w:r>
-        <w:t xml:space="preserve">Mapping the Field: Learnings from a Quarter-Century of Consumer-Technology Research</w:t>
+        <w:t xml:space="preserve">Mapping the Field: Learnings from a Quarter-Century of Consumer-Technology Research and the Case of Generative AI</w:t>
       </w:r>
     </w:p>
     <w:p>
@@ -183,7 +183,7 @@
         <w:pStyle w:val="AbstractFirstParagraph"/>
       </w:pPr>
       <w:r>
-        <w:t xml:space="preserve">Consumer technology research continually shifts as new technologies emerge, challenging cumulative science in a domain where the empirical object itself keeps changing. We build a quarter-century overview of how the field adapts and accumulates knowledge by screening 10,000 articles from seven leading marketing and consumer research journals and mapping out 16 technology clusters through semantic modeling. Specifically, we (1) map how academic attention moves across successive technology waves, (2) examine co-citation, historiographic coupling, and journal citation patterns to determine whether domains build on shared intellectual foundations, and (3) compare these trajectories with media attention to assess whether the field redirects its attention toward technologies that become salient in its external environment. We find distinct academic waves that are generally weakly aligned with media attention but remain substantially intellectually interconnected. Benchmarking Generative AI against these historical patterns, we find that it has been adopted across journals at unprecedented speed, yet rests on a comparatively narrow intellectual foundation and draws on earlier technology clusters less than those clusters already draw on it. We derive implications for researchers, and for journals, whose agenda-setting role makes them central to ensuring that attention to emerging technologies advances cumulative rather than merely novel knowledge.</w:t>
+        <w:t xml:space="preserve">Consumer technology research continually shifts as new technologies emerge, challenging cumulative science in a domain where the empirical object itself keeps changing, Generative AI being the latest of these technologies. We ask whether our field’s response to it differs from its response to earlier ones. Specifically, we (1) map how academic attention moves across successive technology waves, (2) examine co-citation, historiographic coupling, and journal citation patterns to determine whether domains build on shared intellectual foundations, and (3) compare these trajectories with media attention to assess whether the field redirects its attention toward technologies that become salient in its external environment. We build a quarter-century overview of how the field adapts and accumulates knowledge by screening 10,000 articles from seven leading marketing and consumer research journals and mapping out 16 technology clusters through semantic modeling. We find distinct academic waves that are generally weakly aligned with media attention but remain substantially intellectually interconnected. Benchmarking Generative AI against these historical patterns, we find that it has been adopted across journals at unprecedented speed, yet rests on a comparatively narrow intellectual foundation and draws on earlier technology clusters less than those clusters already draw on it. We derive implications for researchers, and for journals, whose agenda-setting role makes them central to ensuring that attention to emerging technologies advances cumulative rather than merely novel knowledge.</w:t>
       </w:r>
     </w:p>
     <w:p>
@@ -213,7 +213,7 @@
         <w:pStyle w:val="Heading1"/>
       </w:pPr>
       <w:r>
-        <w:t xml:space="preserve">Mapping the Field: Learnings from a Quarter-Century of Consumer-Technology Research</w:t>
+        <w:t xml:space="preserve">Mapping the Field: Learnings from a Quarter-Century of Consumer-Technology Research and the Case of Generative AI</w:t>
       </w:r>
     </w:p>
     <w:bookmarkEnd w:id="24"/>
@@ -251,7 +251,7 @@
         <w:t xml:space="preserve">)</w:t>
       </w:r>
       <w:r>
-        <w:t xml:space="preserve">, with Generative Artificial Intelligence (Generative AI) latest in line. Generative AI has permeated many aspects of individuals’, marketers’, and researchers’ experience at an unprecedented impact and pace</w:t>
+        <w:t xml:space="preserve">, with Generative Artificial Intelligence (Generative AI) the latest in line. Generative AI has permeated many aspects of individuals’, marketers’, and researchers’ experience with an unprecedented impact and at a rapid pace</w:t>
       </w:r>
       <w:r>
         <w:t xml:space="preserve"> </w:t>
@@ -464,7 +464,27 @@
         <w:t xml:space="preserve">)</w:t>
       </w:r>
       <w:r>
-        <w:t xml:space="preserve">. While other work discusses how Generative AI disrupts patterns in consumers’ usage of technologies [source], or marketers’ approach to integrating new technologies into their business</w:t>
+        <w:t xml:space="preserve">. While other work discusses how Generative AI disrupts patterns in consumers’ usage of technologies</w:t>
+      </w:r>
+      <w:r>
+        <w:t xml:space="preserve"> </w:t>
+      </w:r>
+      <w:r>
+        <w:t xml:space="preserve">(</w:t>
+      </w:r>
+      <w:hyperlink w:anchor="ref-mogajiHowGenerativeAI2024">
+        <w:r>
+          <w:rPr>
+            <w:rStyle w:val="Hyperlink"/>
+          </w:rPr>
+          <w:t xml:space="preserve">Mogaji &amp; Jain, 2024</w:t>
+        </w:r>
+      </w:hyperlink>
+      <w:r>
+        <w:t xml:space="preserve">)</w:t>
+      </w:r>
+      <w:r>
+        <w:t xml:space="preserve">, or marketers’ approach to integrating new technologies into their business</w:t>
       </w:r>
       <w:r>
         <w:t xml:space="preserve"> </w:t>
@@ -484,7 +504,7 @@
         <w:t xml:space="preserve">)</w:t>
       </w:r>
       <w:r>
-        <w:t xml:space="preserve">, in this paper we turn the perspective towards ourselves as researchers in the domain of consumer technology research, and ask: Is Generative AI as a new consumer technology different than what our field has studied before?</w:t>
+        <w:t xml:space="preserve">, in this paper we turn the perspective towards ourselves as researchers in the domain of consumer technology research, and ask: Is Generative AI as a new consumer technology different from what our field has studied before? As such, in this paper, we treat Generative AI not as the technology it is, but as the knowledge phenomenon claiming its place in our field of consumer technology research.</w:t>
       </w:r>
       <w:r>
         <w:t xml:space="preserve"> </w:t>
@@ -495,7 +515,109 @@
         <w:pStyle w:val="BodyText"/>
       </w:pPr>
       <w:r>
-        <w:t xml:space="preserve">We consider the answer to this question is consequential on three grounds: First, researchers in marketing and consumer research can have substantive impact on consumer wellbeing, policymaking and regulations [source]. Generative AI has undoubtedly had a profound impact in a relatively short amount of time, warranting the attention devoted to it by both academics and the public. Yet we must ask if this comes at a cost: The attention we can devote as a field is limited due to factors such as the publishing and review process [], funding [], and – at the end of the day – simply the researcher’s time. The question is therefore not only how much attention we pay to Generative AI, but also at the cost of what else. We therefore ask: How does our field allocate attention to consumer technologies, and does Generative AI disrupt these patterns?</w:t>
+        <w:t xml:space="preserve">We consider the answer to this question consequential on three grounds: First, researchers in marketing and consumer research can have substantive impact on consumer wellbeing, policymaking and regulations</w:t>
+      </w:r>
+      <w:r>
+        <w:t xml:space="preserve"> </w:t>
+      </w:r>
+      <w:r>
+        <w:t xml:space="preserve">(</w:t>
+      </w:r>
+      <w:hyperlink w:anchor="ref-VisibleMeasurableImmediate">
+        <w:r>
+          <w:rPr>
+            <w:rStyle w:val="Hyperlink"/>
+          </w:rPr>
+          <w:t xml:space="preserve">de Bellis et al., 2026</w:t>
+        </w:r>
+      </w:hyperlink>
+      <w:r>
+        <w:t xml:space="preserve">;</w:t>
+      </w:r>
+      <w:r>
+        <w:t xml:space="preserve"> </w:t>
+      </w:r>
+      <w:hyperlink w:anchor="X7433f4f71f98d02ca93f48fa89ef156863d0469">
+        <w:r>
+          <w:rPr>
+            <w:rStyle w:val="Hyperlink"/>
+          </w:rPr>
+          <w:t xml:space="preserve">Kaltenbrunner, 2020</w:t>
+        </w:r>
+      </w:hyperlink>
+      <w:r>
+        <w:t xml:space="preserve">)</w:t>
+      </w:r>
+      <w:r>
+        <w:t xml:space="preserve">. Generative AI has undoubtedly had a profound impact in a relatively short amount of time, warranting the attention devoted to it by both academics and the public. Yet we must ask whether this comes at a cost: the attention we can devote as a field is limited due to factors such as the publishing and review process</w:t>
+      </w:r>
+      <w:r>
+        <w:t xml:space="preserve"> </w:t>
+      </w:r>
+      <w:r>
+        <w:t xml:space="preserve">(</w:t>
+      </w:r>
+      <w:hyperlink w:anchor="ref-bjorkPublishingDelayScholarly2013">
+        <w:r>
+          <w:rPr>
+            <w:rStyle w:val="Hyperlink"/>
+          </w:rPr>
+          <w:t xml:space="preserve">Björk &amp; Solomon, 2013</w:t>
+        </w:r>
+      </w:hyperlink>
+      <w:r>
+        <w:t xml:space="preserve">;</w:t>
+      </w:r>
+      <w:r>
+        <w:t xml:space="preserve"> </w:t>
+      </w:r>
+      <w:hyperlink w:anchor="Xe2d6bc7484b7c2393b057240f09a7c5cc958e61">
+        <w:r>
+          <w:rPr>
+            <w:rStyle w:val="Hyperlink"/>
+          </w:rPr>
+          <w:t xml:space="preserve">Ellison, 2002</w:t>
+        </w:r>
+      </w:hyperlink>
+      <w:r>
+        <w:t xml:space="preserve">)</w:t>
+      </w:r>
+      <w:r>
+        <w:t xml:space="preserve">, funding</w:t>
+      </w:r>
+      <w:r>
+        <w:t xml:space="preserve"> </w:t>
+      </w:r>
+      <w:r>
+        <w:t xml:space="preserve">(</w:t>
+      </w:r>
+      <w:hyperlink w:anchor="Xe87f13889cec6d7c1674b0e46cf32c9a203961a">
+        <w:r>
+          <w:rPr>
+            <w:rStyle w:val="Hyperlink"/>
+          </w:rPr>
+          <w:t xml:space="preserve">Fabbri et al., 2018</w:t>
+        </w:r>
+      </w:hyperlink>
+      <w:r>
+        <w:t xml:space="preserve">;</w:t>
+      </w:r>
+      <w:r>
+        <w:t xml:space="preserve"> </w:t>
+      </w:r>
+      <w:hyperlink w:anchor="X7433f4f71f98d02ca93f48fa89ef156863d0469">
+        <w:r>
+          <w:rPr>
+            <w:rStyle w:val="Hyperlink"/>
+          </w:rPr>
+          <w:t xml:space="preserve">Kaltenbrunner, 2020</w:t>
+        </w:r>
+      </w:hyperlink>
+      <w:r>
+        <w:t xml:space="preserve">)</w:t>
+      </w:r>
+      <w:r>
+        <w:t xml:space="preserve">, and, ultimately, the researchers’ time. The question is therefore not only how much attention we pay to Generative AI, but also what other topics forgo attention as a result. We therefore ask: How does our field allocate attention to consumer technologies, and does Generative AI disrupt these patterns?</w:t>
       </w:r>
     </w:p>
     <w:p>
@@ -503,7 +625,7 @@
         <w:pStyle w:val="BodyText"/>
       </w:pPr>
       <w:r>
-        <w:t xml:space="preserve">Second, research on consumer technologies is fast-paced and evolving as fast as the technologies themselves</w:t>
+        <w:t xml:space="preserve">Second, research on consumer technologies is fast-paced and evolves as fast as the technologies themselves</w:t>
       </w:r>
       <w:r>
         <w:t xml:space="preserve"> </w:t>
@@ -591,7 +713,7 @@
         <w:t xml:space="preserve">)</w:t>
       </w:r>
       <w:r>
-        <w:t xml:space="preserve">. Especially with a technology such as Generative AI, we must carefully investigate our fields response, as its adoption and proliferation happens at unprecedented speed</w:t>
+        <w:t xml:space="preserve">. Especially with a technology such as Generative AI, we must carefully investigate our field’s response, as its adoption and proliferation happen at unprecedented speed</w:t>
       </w:r>
       <w:r>
         <w:t xml:space="preserve"> </w:t>
@@ -625,7 +747,7 @@
         <w:t xml:space="preserve">)</w:t>
       </w:r>
       <w:r>
-        <w:t xml:space="preserve">, but also its scope [source]. Without relying on what we already know, we will not be able to build a cumulative understanding of what is to come, limiting our ability to offer value to consumers and policymakers (point 1). We therefore ask: How does our field connect its research within and across technologies, what theories do we build on, and does Generative AI demonstrate a different type of connectedness than we produced before?</w:t>
+        <w:t xml:space="preserve">. Without relying on what we already know, we will not be able to build a cumulative understanding of what is to come, limiting our ability to offer value to consumers and policymakers (point 1). We therefore ask: How does our field connect its research within and across technologies, what theories do we build on, and does Generative AI demonstrate a different type of connectedness than earlier technologies?</w:t>
       </w:r>
     </w:p>
     <w:p>
@@ -633,7 +755,7 @@
         <w:pStyle w:val="BodyText"/>
       </w:pPr>
       <w:r>
-        <w:t xml:space="preserve">Third, research does not happen in isolation. The attention we devote to consumer technologies must match the importance given to these technologies by the public at least to a certain extent, as our research has value to offer, and we must direct our limited attention to the areas that matter to the public [some sources]. In the context of Generative AI, it is easy to be fooled into thinking that it is all consumers talk about. But is this truly the case, and if not, what else has mattered in the past, and matters now in the current landscape of consumer technologies? Understanding where the public puts its attention may also help us understand if the cost we pay to study Generative AI (point 1) is set in the right place. We therefore ask: How strongly is our research agenda influenced by what matters to the public, and is it different for Generative AI?</w:t>
+        <w:t xml:space="preserve">Third, research does not happen in isolation. The attention we devote to consumer technologies must match the importance given to these technologies by the public at least to a certain extent, as our research has value to offer, and we must direct our limited attention to the areas that matter to the public [some sources]. In the context of Generative AI, it is easy to assume that it is all consumers talk about. But is this truly the case, and if not, what else has mattered in the past, and matters now in the current landscape of consumer technologies? Understanding where the public puts its attention may also help us understand if the cost we pay to study Generative AI (point 1) is justified. We therefore ask: How strongly is our research agenda influenced by what matters to the public, and is it different for Generative AI?</w:t>
       </w:r>
     </w:p>
     <w:p>
@@ -641,7 +763,7 @@
         <w:pStyle w:val="BodyText"/>
       </w:pPr>
       <w:r>
-        <w:t xml:space="preserve">Understanding how Generative AI compares to earlier consumer technologies is relevant for stakeholders across the scientific ecosystem: Journals are influential in how they set their agendas, and therefore substantively shape where researchers put their attention. Researchers on the other hand side are both motivated by what type of research is called for in journals, but also by what calls for attention in the public domain. At the same time, demands for innovation and novelty may disincentivize research on so-called hype topics [sources]. Lastly, institutions and funding bodies are called to allocate resources to research that has impact and matters to the public, but also to ensure that our field advances cumulatively over building many isolated streams of research, missing out on vital learnings from each other.</w:t>
+        <w:t xml:space="preserve">Understanding how Generative AI compares to earlier consumer technologies is relevant for stakeholders across the scientific ecosystem: Journals are influential in how they set their agendas, and therefore substantively shape where researchers put their attention. Researchers, on the other hand, are motivated both by what type of research is called for in journals and by what calls for attention in the public domain. At the same time, demands for innovation and novelty may disincentivize research on so-called hype topics [sources]. Lastly, institutions and funding bodies are called to allocate resources to research that has impact and matters to the public, but also to ensure that our field advances cumulatively rather than through many isolated streams of research, missing out on vital learnings from each other.</w:t>
       </w:r>
     </w:p>
     <w:p>
@@ -649,7 +771,7 @@
         <w:pStyle w:val="BodyText"/>
       </w:pPr>
       <w:r>
-        <w:t xml:space="preserve">All of our questions are inherently comparative, and cannot be answered by looking at Generative AI in isolation. Resultingly, in this paper, we follow two objectives: First, we aim to get a comprehensive overview of how consumer technology research has evolved at large, understanding diffusion patterns of attention to individual consumer technologies, the research domains’ intellectual foundation and interconnectedness, and how academic attention towards consumer technologies tracks against public salience. Second, we aim to use this overview as a baseline and contrast it with the case of Generative AI across all three dimensions. As we argue that journals play a major role in how a research agenda evolves, we additionally aim to understand the influence of individual leading marketing journals on the trajectory of consumer technology research as a whole, and the case of Generative AI specifically.</w:t>
+        <w:t xml:space="preserve">All of our questions are inherently comparative, and cannot be answered by looking at Generative AI in isolation. Consequently, in this paper, we follow two objectives: First, we aim to build a comprehensive overview of how consumer technology research has evolved at large, understanding diffusion patterns of attention to individual consumer technologies, the research domain’s intellectual foundation and interconnectedness, and how academic attention towards consumer technologies tracks public salience. Second, we aim to use this overview as a baseline and contrast it with the case of Generative AI across all three dimensions. As we argue that journals play a major role in how a research agenda evolves, we additionally aim to understand the influence of individual leading marketing journals on the trajectory of consumer technology research as a whole, and the case of Generative AI specifically.</w:t>
       </w:r>
     </w:p>
     <w:p>
@@ -657,7 +779,7 @@
         <w:pStyle w:val="BodyText"/>
       </w:pPr>
       <w:r>
-        <w:t xml:space="preserve">This paper contributes to the understanding of our field in three ways: While several studies demonstrate the speed and breadth of publications disseminating Generative AI</w:t>
+        <w:t xml:space="preserve">This paper contributes to the understanding of our field in three ways. While several studies demonstrate the speed and breadth of publications on Generative AI</w:t>
       </w:r>
       <w:r>
         <w:t xml:space="preserve"> </w:t>
@@ -691,7 +813,7 @@
         <w:t xml:space="preserve">)</w:t>
       </w:r>
       <w:r>
-        <w:t xml:space="preserve">, to the best of our knowledge, there is currently no study systematically comparing our fields response to Generative AI with earlier technologies. We address this by building an overview of a quarter-century of empirical consumer technology research in marketing and classifying consumer technologies into clusters, thereby providing a baseline against which we can compare our fields reaction to previous technology clusters to the one to Generative AI (analysis 1). Second, we conduct a bibliometric analysis on this overview, highlighting the interconnectedness of our field within and across research on specific clusters of consumer technologies. We again highlight where the reaction to Generative AI falls within the established connectedness and theoretical foundation of our field, and where it breaks out (analysis 3). Lastly, we contribute to literature by extending our perspective from looking within our field, to looking at public salience of consumer technologies discussed in academic literature by constructing a public attention benchmark by using media mentions as a proxy for public salience. We contrast academic and public attention overall and across time, and again highlight how Generative AI breaks previous patterns.</w:t>
+        <w:t xml:space="preserve">, to the best of our knowledge there is currently no study systematically comparing our field’s response to Generative AI with its response to earlier technologies. We address this by building an overview of a quarter-century of empirical consumer technology research in marketing and classifying consumer technologies into clusters, which gives us a baseline against which we can compare the reaction to Generative AI with the reaction to previous technology clusters (Analysis 1). Second, we conduct a bibliometric analysis on this overview, showing how connected our field is within and across research on specific clusters of consumer technologies, and which theoretical foundations it builds on. Our corpus covers 26 years of consumer technology research, which allows us to say where the reaction to Generative AI falls within the established connectedness and theoretical foundation of our field, and where it breaks out (Analysis 2). Due to our bottom-up corpus generation, our analysis and implications are not constrained by top-down, a priori defined inclusion criteria typical for bibliometric analyses, letting us locate Generative AI within the field’s established patterns of connectedness empirically. Lastly, we extend our perspective from looking within our field to looking at the public salience of the consumer technologies we study, using media mentions as a proxy. Because both are built on the same semantic basis, academic and public attention can be contrasted directly. This allows us to show, for the first time, where our field’s agenda aligns with public salience and where it diverges, and how Generative AI breaks with the historical pattern (Analysis 3).</w:t>
       </w:r>
     </w:p>
     <w:p>
@@ -10296,7 +10418,7 @@
       </w:r>
     </w:p>
     <w:bookmarkEnd w:id="71"/>
-    <w:bookmarkStart w:id="154" w:name="references"/>
+    <w:bookmarkStart w:id="164" w:name="references"/>
     <w:p>
       <w:pPr>
         <w:pStyle w:val="Heading1"/>
@@ -10305,7 +10427,7 @@
         <w:t xml:space="preserve">References</w:t>
       </w:r>
     </w:p>
-    <w:bookmarkStart w:id="153" w:name="refs"/>
+    <w:bookmarkStart w:id="163" w:name="refs"/>
     <w:bookmarkStart w:id="72" w:name="ref-andrewBayesianDataAnalysis"/>
     <w:p>
       <w:pPr>
@@ -10670,12 +10792,59 @@
       </w:hyperlink>
     </w:p>
     <w:bookmarkEnd w:id="80"/>
-    <w:bookmarkStart w:id="82" w:name="ref-blondelFastUnfoldingCommunities2008"/>
+    <w:bookmarkStart w:id="82" w:name="ref-bjorkPublishingDelayScholarly2013"/>
     <w:p>
       <w:pPr>
         <w:pStyle w:val="Bibliography"/>
       </w:pPr>
       <w:r>
+        <w:t xml:space="preserve">Björk, B.-C., &amp; Solomon, D. (2013). The publishing delay in scholarly peer-reviewed journals.</w:t>
+      </w:r>
+      <w:r>
+        <w:t xml:space="preserve"> </w:t>
+      </w:r>
+      <w:r>
+        <w:rPr>
+          <w:i/>
+          <w:iCs/>
+        </w:rPr>
+        <w:t xml:space="preserve">Journal of Informetrics</w:t>
+      </w:r>
+      <w:r>
+        <w:t xml:space="preserve">,</w:t>
+      </w:r>
+      <w:r>
+        <w:t xml:space="preserve"> </w:t>
+      </w:r>
+      <w:r>
+        <w:rPr>
+          <w:i/>
+          <w:iCs/>
+        </w:rPr>
+        <w:t xml:space="preserve">7</w:t>
+      </w:r>
+      <w:r>
+        <w:t xml:space="preserve">(4), 914–923.</w:t>
+      </w:r>
+      <w:r>
+        <w:t xml:space="preserve"> </w:t>
+      </w:r>
+      <w:hyperlink r:id="rId81">
+        <w:r>
+          <w:rPr>
+            <w:rStyle w:val="Hyperlink"/>
+          </w:rPr>
+          <w:t xml:space="preserve">https://doi.org/10.1016/j.joi.2013.09.001</w:t>
+        </w:r>
+      </w:hyperlink>
+    </w:p>
+    <w:bookmarkEnd w:id="82"/>
+    <w:bookmarkStart w:id="84" w:name="ref-blondelFastUnfoldingCommunities2008"/>
+    <w:p>
+      <w:pPr>
+        <w:pStyle w:val="Bibliography"/>
+      </w:pPr>
+      <w:r>
         <w:t xml:space="preserve">Blondel, V. D., Guillaume, J.-L., Lambiotte, R., &amp; Lefebvre, E. (2008). Fast unfolding of communities in large networks.</w:t>
       </w:r>
       <w:r>
@@ -10707,7 +10876,7 @@
       <w:r>
         <w:t xml:space="preserve"> </w:t>
       </w:r>
-      <w:hyperlink r:id="rId81">
+      <w:hyperlink r:id="rId83">
         <w:r>
           <w:rPr>
             <w:rStyle w:val="Hyperlink"/>
@@ -10716,8 +10885,8 @@
         </w:r>
       </w:hyperlink>
     </w:p>
-    <w:bookmarkEnd w:id="82"/>
-    <w:bookmarkStart w:id="84" w:name="ref-calinskiDendriteMethodCluster1974"/>
+    <w:bookmarkEnd w:id="84"/>
+    <w:bookmarkStart w:id="86" w:name="ref-calinskiDendriteMethodCluster1974"/>
     <w:p>
       <w:pPr>
         <w:pStyle w:val="Bibliography"/>
@@ -10754,7 +10923,7 @@
       <w:r>
         <w:t xml:space="preserve"> </w:t>
       </w:r>
-      <w:hyperlink r:id="rId83">
+      <w:hyperlink r:id="rId85">
         <w:r>
           <w:rPr>
             <w:rStyle w:val="Hyperlink"/>
@@ -10763,8 +10932,8 @@
         </w:r>
       </w:hyperlink>
     </w:p>
-    <w:bookmarkEnd w:id="84"/>
-    <w:bookmarkStart w:id="86" w:name="ref-cilloGenerativeAIInnovation2025"/>
+    <w:bookmarkEnd w:id="86"/>
+    <w:bookmarkStart w:id="88" w:name="ref-cilloGenerativeAIInnovation2025"/>
     <w:p>
       <w:pPr>
         <w:pStyle w:val="Bibliography"/>
@@ -10825,7 +10994,7 @@
       <w:r>
         <w:t xml:space="preserve"> </w:t>
       </w:r>
-      <w:hyperlink r:id="rId85">
+      <w:hyperlink r:id="rId87">
         <w:r>
           <w:rPr>
             <w:rStyle w:val="Hyperlink"/>
@@ -10834,8 +11003,8 @@
         </w:r>
       </w:hyperlink>
     </w:p>
-    <w:bookmarkEnd w:id="86"/>
-    <w:bookmarkStart w:id="88" w:name="ref-daviesClusterSeparationMeasure1979"/>
+    <w:bookmarkEnd w:id="88"/>
+    <w:bookmarkStart w:id="90" w:name="ref-daviesClusterSeparationMeasure1979"/>
     <w:p>
       <w:pPr>
         <w:pStyle w:val="Bibliography"/>
@@ -10881,7 +11050,7 @@
       <w:r>
         <w:t xml:space="preserve"> </w:t>
       </w:r>
-      <w:hyperlink r:id="rId87">
+      <w:hyperlink r:id="rId89">
         <w:r>
           <w:rPr>
             <w:rStyle w:val="Hyperlink"/>
@@ -10890,8 +11059,8 @@
         </w:r>
       </w:hyperlink>
     </w:p>
-    <w:bookmarkEnd w:id="88"/>
-    <w:bookmarkStart w:id="89" w:name="ref-VisibleMeasurableImmediate"/>
+    <w:bookmarkEnd w:id="90"/>
+    <w:bookmarkStart w:id="91" w:name="ref-VisibleMeasurableImmediate"/>
     <w:p>
       <w:pPr>
         <w:pStyle w:val="Bibliography"/>
@@ -10969,8 +11138,8 @@
         <w:t xml:space="preserve">.</w:t>
       </w:r>
     </w:p>
-    <w:bookmarkEnd w:id="89"/>
-    <w:bookmarkStart w:id="91" w:name="ref-donthuHowConductBibliometric2021"/>
+    <w:bookmarkEnd w:id="91"/>
+    <w:bookmarkStart w:id="93" w:name="ref-donthuHowConductBibliometric2021"/>
     <w:p>
       <w:pPr>
         <w:pStyle w:val="Bibliography"/>
@@ -11019,7 +11188,7 @@
       <w:r>
         <w:t xml:space="preserve"> </w:t>
       </w:r>
-      <w:hyperlink r:id="rId90">
+      <w:hyperlink r:id="rId92">
         <w:r>
           <w:rPr>
             <w:rStyle w:val="Hyperlink"/>
@@ -11028,13 +11197,149 @@
         </w:r>
       </w:hyperlink>
     </w:p>
-    <w:bookmarkEnd w:id="91"/>
-    <w:bookmarkStart w:id="93" w:name="ref-fischerReuseNeedlePay2024"/>
+    <w:bookmarkEnd w:id="93"/>
+    <w:bookmarkStart w:id="95" w:name="Xe2d6bc7484b7c2393b057240f09a7c5cc958e61"/>
     <w:p>
       <w:pPr>
         <w:pStyle w:val="Bibliography"/>
       </w:pPr>
       <w:r>
+        <w:t xml:space="preserve">Ellison, G. (2002). The slowdown of the economics publishing process.</w:t>
+      </w:r>
+      <w:r>
+        <w:t xml:space="preserve"> </w:t>
+      </w:r>
+      <w:r>
+        <w:rPr>
+          <w:i/>
+          <w:iCs/>
+        </w:rPr>
+        <w:t xml:space="preserve">Journal of Political Economy</w:t>
+      </w:r>
+      <w:r>
+        <w:t xml:space="preserve">,</w:t>
+      </w:r>
+      <w:r>
+        <w:t xml:space="preserve"> </w:t>
+      </w:r>
+      <w:r>
+        <w:rPr>
+          <w:i/>
+          <w:iCs/>
+        </w:rPr>
+        <w:t xml:space="preserve">110</w:t>
+      </w:r>
+      <w:r>
+        <w:t xml:space="preserve">(5), 947–993.</w:t>
+      </w:r>
+      <w:r>
+        <w:t xml:space="preserve"> </w:t>
+      </w:r>
+      <w:hyperlink r:id="rId94">
+        <w:r>
+          <w:rPr>
+            <w:rStyle w:val="Hyperlink"/>
+          </w:rPr>
+          <w:t xml:space="preserve">https://doi.org/10.1086/341868</w:t>
+        </w:r>
+      </w:hyperlink>
+    </w:p>
+    <w:bookmarkEnd w:id="95"/>
+    <w:bookmarkStart w:id="97" w:name="Xe87f13889cec6d7c1674b0e46cf32c9a203961a"/>
+    <w:p>
+      <w:pPr>
+        <w:pStyle w:val="Bibliography"/>
+      </w:pPr>
+      <w:r>
+        <w:t xml:space="preserve">Fabbri, A., Lai, A., Grundy, Q., &amp; Bero, L. A. (2018). The</w:t>
+      </w:r>
+      <w:r>
+        <w:t xml:space="preserve"> </w:t>
+      </w:r>
+      <w:r>
+        <w:t xml:space="preserve">Influence</w:t>
+      </w:r>
+      <w:r>
+        <w:t xml:space="preserve"> </w:t>
+      </w:r>
+      <w:r>
+        <w:t xml:space="preserve">of</w:t>
+      </w:r>
+      <w:r>
+        <w:t xml:space="preserve"> </w:t>
+      </w:r>
+      <w:r>
+        <w:t xml:space="preserve">Industry Sponsorship</w:t>
+      </w:r>
+      <w:r>
+        <w:t xml:space="preserve"> </w:t>
+      </w:r>
+      <w:r>
+        <w:t xml:space="preserve">on the</w:t>
+      </w:r>
+      <w:r>
+        <w:t xml:space="preserve"> </w:t>
+      </w:r>
+      <w:r>
+        <w:t xml:space="preserve">Research Agenda</w:t>
+      </w:r>
+      <w:r>
+        <w:t xml:space="preserve">:</w:t>
+      </w:r>
+      <w:r>
+        <w:t xml:space="preserve"> </w:t>
+      </w:r>
+      <w:r>
+        <w:t xml:space="preserve">A Scoping Review</w:t>
+      </w:r>
+      <w:r>
+        <w:t xml:space="preserve">.</w:t>
+      </w:r>
+      <w:r>
+        <w:t xml:space="preserve"> </w:t>
+      </w:r>
+      <w:r>
+        <w:rPr>
+          <w:i/>
+          <w:iCs/>
+        </w:rPr>
+        <w:t xml:space="preserve">American Journal of Public Health</w:t>
+      </w:r>
+      <w:r>
+        <w:t xml:space="preserve">,</w:t>
+      </w:r>
+      <w:r>
+        <w:t xml:space="preserve"> </w:t>
+      </w:r>
+      <w:r>
+        <w:rPr>
+          <w:i/>
+          <w:iCs/>
+        </w:rPr>
+        <w:t xml:space="preserve">108</w:t>
+      </w:r>
+      <w:r>
+        <w:t xml:space="preserve">(11), e9–e16.</w:t>
+      </w:r>
+      <w:r>
+        <w:t xml:space="preserve"> </w:t>
+      </w:r>
+      <w:hyperlink r:id="rId96">
+        <w:r>
+          <w:rPr>
+            <w:rStyle w:val="Hyperlink"/>
+          </w:rPr>
+          <w:t xml:space="preserve">https://doi.org/10.2105/AJPH.2018.304677</w:t>
+        </w:r>
+      </w:hyperlink>
+    </w:p>
+    <w:bookmarkEnd w:id="97"/>
+    <w:bookmarkStart w:id="99" w:name="ref-fischerReuseNeedlePay2024"/>
+    <w:p>
+      <w:pPr>
+        <w:pStyle w:val="Bibliography"/>
+      </w:pPr>
+      <w:r>
         <w:t xml:space="preserve">Fischer, O., Lob, A. B., &amp; Frey, R. (2024, November 22).</w:t>
       </w:r>
       <w:r>
@@ -11102,7 +11407,7 @@
       <w:r>
         <w:t xml:space="preserve"> </w:t>
       </w:r>
-      <w:hyperlink r:id="rId92">
+      <w:hyperlink r:id="rId98">
         <w:r>
           <w:rPr>
             <w:rStyle w:val="Hyperlink"/>
@@ -11111,8 +11416,8 @@
         </w:r>
       </w:hyperlink>
     </w:p>
-    <w:bookmarkEnd w:id="93"/>
-    <w:bookmarkStart w:id="95" w:name="X18974fea3fe182b56cf39c321495ac6ff97ecd7"/>
+    <w:bookmarkEnd w:id="99"/>
+    <w:bookmarkStart w:id="101" w:name="X18974fea3fe182b56cf39c321495ac6ff97ecd7"/>
     <w:p>
       <w:pPr>
         <w:pStyle w:val="Bibliography"/>
@@ -11170,7 +11475,7 @@
       <w:r>
         <w:t xml:space="preserve"> </w:t>
       </w:r>
-      <w:hyperlink r:id="rId94">
+      <w:hyperlink r:id="rId100">
         <w:r>
           <w:rPr>
             <w:rStyle w:val="Hyperlink"/>
@@ -11179,8 +11484,8 @@
         </w:r>
       </w:hyperlink>
     </w:p>
-    <w:bookmarkEnd w:id="95"/>
-    <w:bookmarkStart w:id="97" w:name="ref-grewalHowGenerativeAI2025"/>
+    <w:bookmarkEnd w:id="101"/>
+    <w:bookmarkStart w:id="103" w:name="ref-grewalHowGenerativeAI2025"/>
     <w:p>
       <w:pPr>
         <w:pStyle w:val="Bibliography"/>
@@ -11229,7 +11534,7 @@
       <w:r>
         <w:t xml:space="preserve"> </w:t>
       </w:r>
-      <w:hyperlink r:id="rId96">
+      <w:hyperlink r:id="rId102">
         <w:r>
           <w:rPr>
             <w:rStyle w:val="Hyperlink"/>
@@ -11238,8 +11543,8 @@
         </w:r>
       </w:hyperlink>
     </w:p>
-    <w:bookmarkEnd w:id="97"/>
-    <w:bookmarkStart w:id="99" w:name="ref-hoffmanRiseNewTechnologies2022"/>
+    <w:bookmarkEnd w:id="103"/>
+    <w:bookmarkStart w:id="105" w:name="ref-hoffmanRiseNewTechnologies2022"/>
     <w:p>
       <w:pPr>
         <w:pStyle w:val="Bibliography"/>
@@ -11330,7 +11635,7 @@
       <w:r>
         <w:t xml:space="preserve"> </w:t>
       </w:r>
-      <w:hyperlink r:id="rId98">
+      <w:hyperlink r:id="rId104">
         <w:r>
           <w:rPr>
             <w:rStyle w:val="Hyperlink"/>
@@ -11339,8 +11644,8 @@
         </w:r>
       </w:hyperlink>
     </w:p>
-    <w:bookmarkEnd w:id="99"/>
-    <w:bookmarkStart w:id="101" w:name="ref-huChatGPTSetsRecord2023"/>
+    <w:bookmarkEnd w:id="105"/>
+    <w:bookmarkStart w:id="107" w:name="ref-huChatGPTSetsRecord2023"/>
     <w:p>
       <w:pPr>
         <w:pStyle w:val="Bibliography"/>
@@ -11376,7 +11681,7 @@
       <w:r>
         <w:t xml:space="preserve"> </w:t>
       </w:r>
-      <w:hyperlink r:id="rId100">
+      <w:hyperlink r:id="rId106">
         <w:r>
           <w:rPr>
             <w:rStyle w:val="Hyperlink"/>
@@ -11385,8 +11690,8 @@
         </w:r>
       </w:hyperlink>
     </w:p>
-    <w:bookmarkEnd w:id="101"/>
-    <w:bookmarkStart w:id="103" w:name="X4bfed5635d964a1a6a21f3afa9bf4834a89002d"/>
+    <w:bookmarkEnd w:id="107"/>
+    <w:bookmarkStart w:id="109" w:name="X4bfed5635d964a1a6a21f3afa9bf4834a89002d"/>
     <w:p>
       <w:pPr>
         <w:pStyle w:val="Bibliography"/>
@@ -11447,7 +11752,7 @@
       <w:r>
         <w:t xml:space="preserve"> </w:t>
       </w:r>
-      <w:hyperlink r:id="rId102">
+      <w:hyperlink r:id="rId108">
         <w:r>
           <w:rPr>
             <w:rStyle w:val="Hyperlink"/>
@@ -11456,13 +11761,84 @@
         </w:r>
       </w:hyperlink>
     </w:p>
-    <w:bookmarkEnd w:id="103"/>
-    <w:bookmarkStart w:id="105" w:name="ref-kennedyHowAmericansView2025"/>
+    <w:bookmarkEnd w:id="109"/>
+    <w:bookmarkStart w:id="111" w:name="X7433f4f71f98d02ca93f48fa89ef156863d0469"/>
     <w:p>
       <w:pPr>
         <w:pStyle w:val="Bibliography"/>
       </w:pPr>
       <w:r>
+        <w:t xml:space="preserve">Kaltenbrunner, W. (2020). Managing budgetary uncertainty, interpreting policy.</w:t>
+      </w:r>
+      <w:r>
+        <w:t xml:space="preserve"> </w:t>
+      </w:r>
+      <w:r>
+        <w:t xml:space="preserve">How</w:t>
+      </w:r>
+      <w:r>
+        <w:t xml:space="preserve"> </w:t>
+      </w:r>
+      <w:r>
+        <w:t xml:space="preserve">researchers integrate</w:t>
+      </w:r>
+      <w:r>
+        <w:t xml:space="preserve"> </w:t>
+      </w:r>
+      <w:r>
+        <w:t xml:space="preserve">“grand challenges”</w:t>
+      </w:r>
+      <w:r>
+        <w:t xml:space="preserve"> </w:t>
+      </w:r>
+      <w:r>
+        <w:t xml:space="preserve">funding programs into their research agendas.</w:t>
+      </w:r>
+      <w:r>
+        <w:t xml:space="preserve"> </w:t>
+      </w:r>
+      <w:r>
+        <w:rPr>
+          <w:i/>
+          <w:iCs/>
+        </w:rPr>
+        <w:t xml:space="preserve">Journal of Responsible Innovation</w:t>
+      </w:r>
+      <w:r>
+        <w:t xml:space="preserve">,</w:t>
+      </w:r>
+      <w:r>
+        <w:t xml:space="preserve"> </w:t>
+      </w:r>
+      <w:r>
+        <w:rPr>
+          <w:i/>
+          <w:iCs/>
+        </w:rPr>
+        <w:t xml:space="preserve">7</w:t>
+      </w:r>
+      <w:r>
+        <w:t xml:space="preserve">(3), 320–341.</w:t>
+      </w:r>
+      <w:r>
+        <w:t xml:space="preserve"> </w:t>
+      </w:r>
+      <w:hyperlink r:id="rId110">
+        <w:r>
+          <w:rPr>
+            <w:rStyle w:val="Hyperlink"/>
+          </w:rPr>
+          <w:t xml:space="preserve">https://doi.org/10.1080/23299460.2020.1744401</w:t>
+        </w:r>
+      </w:hyperlink>
+    </w:p>
+    <w:bookmarkEnd w:id="111"/>
+    <w:bookmarkStart w:id="113" w:name="ref-kennedyHowAmericansView2025"/>
+    <w:p>
+      <w:pPr>
+        <w:pStyle w:val="Bibliography"/>
+      </w:pPr>
+      <w:r>
         <w:t xml:space="preserve">Kennedy, B., Yam, E., Kikuchi, E., Pula, I., &amp; Fuentes, J. (2025, September 17).</w:t>
       </w:r>
       <w:r>
@@ -11579,7 +11955,7 @@
       <w:r>
         <w:t xml:space="preserve"> </w:t>
       </w:r>
-      <w:hyperlink r:id="rId104">
+      <w:hyperlink r:id="rId112">
         <w:r>
           <w:rPr>
             <w:rStyle w:val="Hyperlink"/>
@@ -11588,8 +11964,8 @@
         </w:r>
       </w:hyperlink>
     </w:p>
-    <w:bookmarkEnd w:id="105"/>
-    <w:bookmarkStart w:id="107" w:name="ref-kirkWhyHumanAI2025"/>
+    <w:bookmarkEnd w:id="113"/>
+    <w:bookmarkStart w:id="115" w:name="ref-kirkWhyHumanAI2025"/>
     <w:p>
       <w:pPr>
         <w:pStyle w:val="Bibliography"/>
@@ -11635,7 +12011,7 @@
       <w:r>
         <w:t xml:space="preserve"> </w:t>
       </w:r>
-      <w:hyperlink r:id="rId106">
+      <w:hyperlink r:id="rId114">
         <w:r>
           <w:rPr>
             <w:rStyle w:val="Hyperlink"/>
@@ -11644,8 +12020,8 @@
         </w:r>
       </w:hyperlink>
     </w:p>
-    <w:bookmarkEnd w:id="107"/>
-    <w:bookmarkStart w:id="108" w:name="X1ee6c0be2793064c85ed6527d182657f89961b8"/>
+    <w:bookmarkEnd w:id="115"/>
+    <w:bookmarkStart w:id="116" w:name="X1ee6c0be2793064c85ed6527d182657f89961b8"/>
     <w:p>
       <w:pPr>
         <w:pStyle w:val="Bibliography"/>
@@ -11670,8 +12046,8 @@
         <w:t xml:space="preserve">(Vol. 1, pp. 281–297). University of California Press.</w:t>
       </w:r>
     </w:p>
-    <w:bookmarkEnd w:id="108"/>
-    <w:bookmarkStart w:id="110" w:name="ref-malterPresentFutureConsumer2020"/>
+    <w:bookmarkEnd w:id="116"/>
+    <w:bookmarkStart w:id="118" w:name="ref-malterPresentFutureConsumer2020"/>
     <w:p>
       <w:pPr>
         <w:pStyle w:val="Bibliography"/>
@@ -11708,7 +12084,7 @@
       <w:r>
         <w:t xml:space="preserve"> </w:t>
       </w:r>
-      <w:hyperlink r:id="rId109">
+      <w:hyperlink r:id="rId117">
         <w:r>
           <w:rPr>
             <w:rStyle w:val="Hyperlink"/>
@@ -11717,8 +12093,8 @@
         </w:r>
       </w:hyperlink>
     </w:p>
-    <w:bookmarkEnd w:id="110"/>
-    <w:bookmarkStart w:id="112" w:name="ref-mcinnesUMAPUniformManifold2018"/>
+    <w:bookmarkEnd w:id="118"/>
+    <w:bookmarkStart w:id="120" w:name="ref-mcinnesUMAPUniformManifold2018"/>
     <w:p>
       <w:pPr>
         <w:pStyle w:val="Bibliography"/>
@@ -11785,7 +12161,7 @@
       <w:r>
         <w:t xml:space="preserve"> </w:t>
       </w:r>
-      <w:hyperlink r:id="rId111">
+      <w:hyperlink r:id="rId119">
         <w:r>
           <w:rPr>
             <w:rStyle w:val="Hyperlink"/>
@@ -11794,13 +12170,87 @@
         </w:r>
       </w:hyperlink>
     </w:p>
-    <w:bookmarkEnd w:id="112"/>
-    <w:bookmarkStart w:id="114" w:name="ref-mollerImpactGenerativeAI2026"/>
+    <w:bookmarkEnd w:id="120"/>
+    <w:bookmarkStart w:id="122" w:name="ref-mogajiHowGenerativeAI2024"/>
     <w:p>
       <w:pPr>
         <w:pStyle w:val="Bibliography"/>
       </w:pPr>
       <w:r>
+        <w:t xml:space="preserve">Mogaji, E., &amp; Jain, V. (2024). How generative</w:t>
+      </w:r>
+      <w:r>
+        <w:t xml:space="preserve"> </w:t>
+      </w:r>
+      <w:r>
+        <w:rPr>
+          <w:smallCaps/>
+        </w:rPr>
+        <w:t xml:space="preserve">AI</w:t>
+      </w:r>
+      <w:r>
+        <w:t xml:space="preserve"> </w:t>
+      </w:r>
+      <w:r>
+        <w:t xml:space="preserve">is (will) change consumer behaviour:</w:t>
+      </w:r>
+      <w:r>
+        <w:t xml:space="preserve"> </w:t>
+      </w:r>
+      <w:r>
+        <w:t xml:space="preserve">Postulating</w:t>
+      </w:r>
+      <w:r>
+        <w:t xml:space="preserve"> </w:t>
+      </w:r>
+      <w:r>
+        <w:t xml:space="preserve">the potential impact and implications for research, practice, and policy.</w:t>
+      </w:r>
+      <w:r>
+        <w:t xml:space="preserve"> </w:t>
+      </w:r>
+      <w:r>
+        <w:rPr>
+          <w:i/>
+          <w:iCs/>
+        </w:rPr>
+        <w:t xml:space="preserve">Journal of Consumer Behaviour</w:t>
+      </w:r>
+      <w:r>
+        <w:t xml:space="preserve">,</w:t>
+      </w:r>
+      <w:r>
+        <w:t xml:space="preserve"> </w:t>
+      </w:r>
+      <w:r>
+        <w:rPr>
+          <w:i/>
+          <w:iCs/>
+        </w:rPr>
+        <w:t xml:space="preserve">23</w:t>
+      </w:r>
+      <w:r>
+        <w:t xml:space="preserve">(5), 2379–2389.</w:t>
+      </w:r>
+      <w:r>
+        <w:t xml:space="preserve"> </w:t>
+      </w:r>
+      <w:hyperlink r:id="rId121">
+        <w:r>
+          <w:rPr>
+            <w:rStyle w:val="Hyperlink"/>
+          </w:rPr>
+          <w:t xml:space="preserve">https://doi.org/10.1002/cb.2345</w:t>
+        </w:r>
+      </w:hyperlink>
+    </w:p>
+    <w:bookmarkEnd w:id="122"/>
+    <w:bookmarkStart w:id="124" w:name="ref-mollerImpactGenerativeAI2026"/>
+    <w:p>
+      <w:pPr>
+        <w:pStyle w:val="Bibliography"/>
+      </w:pPr>
+      <w:r>
         <w:t xml:space="preserve">Møller, A. G., Romero, D. M., Jurgens, D., &amp; Aiello, L. M. (2026). The impact of generative</w:t>
       </w:r>
       <w:r>
@@ -11844,7 +12294,7 @@
       <w:r>
         <w:t xml:space="preserve"> </w:t>
       </w:r>
-      <w:hyperlink r:id="rId113">
+      <w:hyperlink r:id="rId123">
         <w:r>
           <w:rPr>
             <w:rStyle w:val="Hyperlink"/>
@@ -11853,8 +12303,8 @@
         </w:r>
       </w:hyperlink>
     </w:p>
-    <w:bookmarkEnd w:id="114"/>
-    <w:bookmarkStart w:id="116" w:name="ref-moschellaAIMuchMore2025"/>
+    <w:bookmarkEnd w:id="124"/>
+    <w:bookmarkStart w:id="126" w:name="ref-moschellaAIMuchMore2025"/>
     <w:p>
       <w:pPr>
         <w:pStyle w:val="Bibliography"/>
@@ -11878,7 +12328,7 @@
       <w:r>
         <w:t xml:space="preserve"> </w:t>
       </w:r>
-      <w:hyperlink r:id="rId115">
+      <w:hyperlink r:id="rId125">
         <w:r>
           <w:rPr>
             <w:rStyle w:val="Hyperlink"/>
@@ -11887,8 +12337,8 @@
         </w:r>
       </w:hyperlink>
     </w:p>
-    <w:bookmarkEnd w:id="116"/>
-    <w:bookmarkStart w:id="118" w:name="ref-muzumdarDeadInternetTheory2025"/>
+    <w:bookmarkEnd w:id="126"/>
+    <w:bookmarkStart w:id="128" w:name="ref-muzumdarDeadInternetTheory2025"/>
     <w:p>
       <w:pPr>
         <w:pStyle w:val="Bibliography"/>
@@ -11979,7 +12429,7 @@
       <w:r>
         <w:t xml:space="preserve"> </w:t>
       </w:r>
-      <w:hyperlink r:id="rId117">
+      <w:hyperlink r:id="rId127">
         <w:r>
           <w:rPr>
             <w:rStyle w:val="Hyperlink"/>
@@ -11988,8 +12438,8 @@
         </w:r>
       </w:hyperlink>
     </w:p>
-    <w:bookmarkEnd w:id="118"/>
-    <w:bookmarkStart w:id="120" w:name="ref-openai2022chatgpt"/>
+    <w:bookmarkEnd w:id="128"/>
+    <w:bookmarkStart w:id="130" w:name="ref-openai2022chatgpt"/>
     <w:p>
       <w:pPr>
         <w:pStyle w:val="Bibliography"/>
@@ -12027,7 +12477,7 @@
       <w:r>
         <w:t xml:space="preserve"> </w:t>
       </w:r>
-      <w:hyperlink r:id="rId119">
+      <w:hyperlink r:id="rId129">
         <w:r>
           <w:rPr>
             <w:rStyle w:val="Hyperlink"/>
@@ -12036,8 +12486,8 @@
         </w:r>
       </w:hyperlink>
     </w:p>
-    <w:bookmarkEnd w:id="120"/>
-    <w:bookmarkStart w:id="122" w:name="ref-ramanUnveilingDynamicsAI2024"/>
+    <w:bookmarkEnd w:id="130"/>
+    <w:bookmarkStart w:id="132" w:name="ref-ramanUnveilingDynamicsAI2024"/>
     <w:p>
       <w:pPr>
         <w:pStyle w:val="Bibliography"/>
@@ -12110,7 +12560,7 @@
       <w:r>
         <w:t xml:space="preserve"> </w:t>
       </w:r>
-      <w:hyperlink r:id="rId121">
+      <w:hyperlink r:id="rId131">
         <w:r>
           <w:rPr>
             <w:rStyle w:val="Hyperlink"/>
@@ -12119,8 +12569,8 @@
         </w:r>
       </w:hyperlink>
     </w:p>
-    <w:bookmarkEnd w:id="122"/>
-    <w:bookmarkStart w:id="124" w:name="ref-reimers2019sentencebert"/>
+    <w:bookmarkEnd w:id="132"/>
+    <w:bookmarkStart w:id="134" w:name="ref-reimers2019sentencebert"/>
     <w:p>
       <w:pPr>
         <w:pStyle w:val="Bibliography"/>
@@ -12171,7 +12621,7 @@
       <w:r>
         <w:t xml:space="preserve"> </w:t>
       </w:r>
-      <w:hyperlink r:id="rId123">
+      <w:hyperlink r:id="rId133">
         <w:r>
           <w:rPr>
             <w:rStyle w:val="Hyperlink"/>
@@ -12180,8 +12630,8 @@
         </w:r>
       </w:hyperlink>
     </w:p>
-    <w:bookmarkEnd w:id="124"/>
-    <w:bookmarkStart w:id="126" w:name="ref-riandhiAIConsumerBehavior2025"/>
+    <w:bookmarkEnd w:id="134"/>
+    <w:bookmarkStart w:id="136" w:name="ref-riandhiAIConsumerBehavior2025"/>
     <w:p>
       <w:pPr>
         <w:pStyle w:val="Bibliography"/>
@@ -12239,7 +12689,7 @@
       <w:r>
         <w:t xml:space="preserve"> </w:t>
       </w:r>
-      <w:hyperlink r:id="rId125">
+      <w:hyperlink r:id="rId135">
         <w:r>
           <w:rPr>
             <w:rStyle w:val="Hyperlink"/>
@@ -12248,8 +12698,8 @@
         </w:r>
       </w:hyperlink>
     </w:p>
-    <w:bookmarkEnd w:id="126"/>
-    <w:bookmarkStart w:id="128" w:name="ref-roberts2021mediacloud"/>
+    <w:bookmarkEnd w:id="136"/>
+    <w:bookmarkStart w:id="138" w:name="ref-roberts2021mediacloud"/>
     <w:p>
       <w:pPr>
         <w:pStyle w:val="Bibliography"/>
@@ -12326,7 +12776,7 @@
       <w:r>
         <w:t xml:space="preserve"> </w:t>
       </w:r>
-      <w:hyperlink r:id="rId127">
+      <w:hyperlink r:id="rId137">
         <w:r>
           <w:rPr>
             <w:rStyle w:val="Hyperlink"/>
@@ -12335,8 +12785,8 @@
         </w:r>
       </w:hyperlink>
     </w:p>
-    <w:bookmarkEnd w:id="128"/>
-    <w:bookmarkStart w:id="130" w:name="ref-roggenkampEXPRESSDICEAdvancing2025"/>
+    <w:bookmarkEnd w:id="138"/>
+    <w:bookmarkStart w:id="140" w:name="ref-roggenkampEXPRESSDICEAdvancing2025"/>
     <w:p>
       <w:pPr>
         <w:pStyle w:val="Bibliography"/>
@@ -12399,7 +12849,7 @@
       <w:r>
         <w:t xml:space="preserve"> </w:t>
       </w:r>
-      <w:hyperlink r:id="rId129">
+      <w:hyperlink r:id="rId139">
         <w:r>
           <w:rPr>
             <w:rStyle w:val="Hyperlink"/>
@@ -12408,8 +12858,8 @@
         </w:r>
       </w:hyperlink>
     </w:p>
-    <w:bookmarkEnd w:id="130"/>
-    <w:bookmarkStart w:id="132" w:name="ref-rousseeuwSilhouettesGraphicalAid1987"/>
+    <w:bookmarkEnd w:id="140"/>
+    <w:bookmarkStart w:id="142" w:name="ref-rousseeuwSilhouettesGraphicalAid1987"/>
     <w:p>
       <w:pPr>
         <w:pStyle w:val="Bibliography"/>
@@ -12458,7 +12908,7 @@
       <w:r>
         <w:t xml:space="preserve"> </w:t>
       </w:r>
-      <w:hyperlink r:id="rId131">
+      <w:hyperlink r:id="rId141">
         <w:r>
           <w:rPr>
             <w:rStyle w:val="Hyperlink"/>
@@ -12467,8 +12917,8 @@
         </w:r>
       </w:hyperlink>
     </w:p>
-    <w:bookmarkEnd w:id="132"/>
-    <w:bookmarkStart w:id="134" w:name="ref-scheufeleFramingTheoryMedia1999"/>
+    <w:bookmarkEnd w:id="142"/>
+    <w:bookmarkStart w:id="144" w:name="ref-scheufeleFramingTheoryMedia1999"/>
     <w:p>
       <w:pPr>
         <w:pStyle w:val="Bibliography"/>
@@ -12526,7 +12976,7 @@
       <w:r>
         <w:t xml:space="preserve"> </w:t>
       </w:r>
-      <w:hyperlink r:id="rId133">
+      <w:hyperlink r:id="rId143">
         <w:r>
           <w:rPr>
             <w:rStyle w:val="Hyperlink"/>
@@ -12535,8 +12985,8 @@
         </w:r>
       </w:hyperlink>
     </w:p>
-    <w:bookmarkEnd w:id="134"/>
-    <w:bookmarkStart w:id="136" w:name="ref-MostVisitedWebsites"/>
+    <w:bookmarkEnd w:id="144"/>
+    <w:bookmarkStart w:id="146" w:name="ref-MostVisitedWebsites"/>
     <w:p>
       <w:pPr>
         <w:pStyle w:val="Bibliography"/>
@@ -12658,7 +13108,7 @@
       <w:r>
         <w:t xml:space="preserve"> </w:t>
       </w:r>
-      <w:hyperlink r:id="rId135">
+      <w:hyperlink r:id="rId145">
         <w:r>
           <w:rPr>
             <w:rStyle w:val="Hyperlink"/>
@@ -12667,8 +13117,8 @@
         </w:r>
       </w:hyperlink>
     </w:p>
-    <w:bookmarkEnd w:id="136"/>
-    <w:bookmarkStart w:id="138" w:name="ref-sentenceTransformersAllMiniLML6v2"/>
+    <w:bookmarkEnd w:id="146"/>
+    <w:bookmarkStart w:id="148" w:name="ref-sentenceTransformersAllMiniLML6v2"/>
     <w:p>
       <w:pPr>
         <w:pStyle w:val="Bibliography"/>
@@ -12699,7 +13149,7 @@
       <w:r>
         <w:t xml:space="preserve"> </w:t>
       </w:r>
-      <w:hyperlink r:id="rId137">
+      <w:hyperlink r:id="rId147">
         <w:r>
           <w:rPr>
             <w:rStyle w:val="Hyperlink"/>
@@ -12708,8 +13158,8 @@
         </w:r>
       </w:hyperlink>
     </w:p>
-    <w:bookmarkEnd w:id="138"/>
-    <w:bookmarkStart w:id="140" w:name="ref-smallCOCITATIONCONTEXTANALYSIS1980"/>
+    <w:bookmarkEnd w:id="148"/>
+    <w:bookmarkStart w:id="150" w:name="ref-smallCOCITATIONCONTEXTANALYSIS1980"/>
     <w:p>
       <w:pPr>
         <w:pStyle w:val="Bibliography"/>
@@ -12761,7 +13211,7 @@
       <w:r>
         <w:t xml:space="preserve"> </w:t>
       </w:r>
-      <w:hyperlink r:id="rId139">
+      <w:hyperlink r:id="rId149">
         <w:r>
           <w:rPr>
             <w:rStyle w:val="Hyperlink"/>
@@ -12770,8 +13220,8 @@
         </w:r>
       </w:hyperlink>
     </w:p>
-    <w:bookmarkEnd w:id="140"/>
-    <w:bookmarkStart w:id="141" w:name="ref-aigeneratedalgorithm2026"/>
+    <w:bookmarkEnd w:id="150"/>
+    <w:bookmarkStart w:id="151" w:name="ref-aigeneratedalgorithm2026"/>
     <w:p>
       <w:pPr>
         <w:pStyle w:val="Bibliography"/>
@@ -12802,8 +13252,8 @@
         <w:t xml:space="preserve">.</w:t>
       </w:r>
     </w:p>
-    <w:bookmarkEnd w:id="141"/>
-    <w:bookmarkStart w:id="143" w:name="X19b8dd2f280f6120269f36e58656b3b5b75516c"/>
+    <w:bookmarkEnd w:id="151"/>
+    <w:bookmarkStart w:id="153" w:name="X19b8dd2f280f6120269f36e58656b3b5b75516c"/>
     <w:p>
       <w:pPr>
         <w:pStyle w:val="Bibliography"/>
@@ -12916,7 +13366,7 @@
       <w:r>
         <w:t xml:space="preserve"> </w:t>
       </w:r>
-      <w:hyperlink r:id="rId142">
+      <w:hyperlink r:id="rId152">
         <w:r>
           <w:rPr>
             <w:rStyle w:val="Hyperlink"/>
@@ -12925,8 +13375,8 @@
         </w:r>
       </w:hyperlink>
     </w:p>
-    <w:bookmarkEnd w:id="143"/>
-    <w:bookmarkStart w:id="145" w:name="ref-wangEditorialChangingLandscape2026"/>
+    <w:bookmarkEnd w:id="153"/>
+    <w:bookmarkStart w:id="155" w:name="ref-wangEditorialChangingLandscape2026"/>
     <w:p>
       <w:pPr>
         <w:pStyle w:val="Bibliography"/>
@@ -12987,7 +13437,7 @@
       <w:r>
         <w:t xml:space="preserve"> </w:t>
       </w:r>
-      <w:hyperlink r:id="rId144">
+      <w:hyperlink r:id="rId154">
         <w:r>
           <w:rPr>
             <w:rStyle w:val="Hyperlink"/>
@@ -12996,8 +13446,8 @@
         </w:r>
       </w:hyperlink>
     </w:p>
-    <w:bookmarkEnd w:id="145"/>
-    <w:bookmarkStart w:id="146" w:name="ref-wang2020minilm"/>
+    <w:bookmarkEnd w:id="155"/>
+    <w:bookmarkStart w:id="156" w:name="ref-wang2020minilm"/>
     <w:p>
       <w:pPr>
         <w:pStyle w:val="Bibliography"/>
@@ -13053,8 +13503,8 @@
         <w:t xml:space="preserve">, 5776–5788.</w:t>
       </w:r>
     </w:p>
-    <w:bookmarkEnd w:id="146"/>
-    <w:bookmarkStart w:id="148" w:name="ref-winderBiasedEchoesLarge2025"/>
+    <w:bookmarkEnd w:id="156"/>
+    <w:bookmarkStart w:id="158" w:name="ref-winderBiasedEchoesLarge2025"/>
     <w:p>
       <w:pPr>
         <w:pStyle w:val="Bibliography"/>
@@ -13103,7 +13553,7 @@
       <w:r>
         <w:t xml:space="preserve"> </w:t>
       </w:r>
-      <w:hyperlink r:id="rId147">
+      <w:hyperlink r:id="rId157">
         <w:r>
           <w:rPr>
             <w:rStyle w:val="Hyperlink"/>
@@ -13112,8 +13562,8 @@
         </w:r>
       </w:hyperlink>
     </w:p>
-    <w:bookmarkEnd w:id="148"/>
-    <w:bookmarkStart w:id="150" w:name="ref-wulffEscapingJingleJangleJungle2026"/>
+    <w:bookmarkEnd w:id="158"/>
+    <w:bookmarkStart w:id="160" w:name="ref-wulffEscapingJingleJangleJungle2026"/>
     <w:p>
       <w:pPr>
         <w:pStyle w:val="Bibliography"/>
@@ -13180,7 +13630,7 @@
       <w:r>
         <w:t xml:space="preserve"> </w:t>
       </w:r>
-      <w:hyperlink r:id="rId149">
+      <w:hyperlink r:id="rId159">
         <w:r>
           <w:rPr>
             <w:rStyle w:val="Hyperlink"/>
@@ -13189,8 +13639,8 @@
         </w:r>
       </w:hyperlink>
     </w:p>
-    <w:bookmarkEnd w:id="150"/>
-    <w:bookmarkStart w:id="152" w:name="ref-zacharyAIRevolutionLatest2026"/>
+    <w:bookmarkEnd w:id="160"/>
+    <w:bookmarkStart w:id="162" w:name="ref-zacharyAIRevolutionLatest2026"/>
     <w:p>
       <w:pPr>
         <w:pStyle w:val="Bibliography"/>
@@ -13319,7 +13769,7 @@
       <w:r>
         <w:t xml:space="preserve"> </w:t>
       </w:r>
-      <w:hyperlink r:id="rId151">
+      <w:hyperlink r:id="rId161">
         <w:r>
           <w:rPr>
             <w:rStyle w:val="Hyperlink"/>
@@ -13328,9 +13778,9 @@
         </w:r>
       </w:hyperlink>
     </w:p>
-    <w:bookmarkEnd w:id="152"/>
-    <w:bookmarkEnd w:id="153"/>
-    <w:bookmarkEnd w:id="154"/>
+    <w:bookmarkEnd w:id="162"/>
+    <w:bookmarkEnd w:id="163"/>
+    <w:bookmarkEnd w:id="164"/>
     <w:sectPr>
       <w:headerReference r:id="rId9" w:type="even"/>
       <w:headerReference r:id="rId11" w:type="default"/>
@@ -14629,6 +15079,10 @@
     <w:pPr>
       <w:spacing w:after="60" w:before="60"/>
     </w:pPr>
+    <w:rPr>
+      <w:sz w:val="16"/>
+      <w:szCs w:val="16"/>
+    </w:rPr>
     <w:tblPr>
       <w:tblInd w:type="dxa" w:w="0"/>
       <w:tblBorders>

</xml_diff>

<commit_message>
Publish website from d09f262
</commit_message>
<xml_diff>
--- a/99_writing/mapping-the-field-manuscript.docx
+++ b/99_writing/mapping-the-field-manuscript.docx
@@ -18,7 +18,7 @@
         <w:t xml:space="preserve"> </w:t>
       </w:r>
     </w:p>
-    <w:bookmarkStart w:id="20" w:name="title"/>
+    <w:bookmarkStart w:id="22" w:name="title"/>
     <w:p>
       <w:pPr>
         <w:pStyle w:val="Heading1"/>
@@ -134,8 +134,8 @@
         <w:t xml:space="preserve"> </w:t>
       </w:r>
     </w:p>
-    <w:bookmarkEnd w:id="20"/>
-    <w:bookmarkStart w:id="22" w:name="author-note"/>
+    <w:bookmarkEnd w:id="22"/>
+    <w:bookmarkStart w:id="24" w:name="author-note"/>
     <w:p>
       <w:pPr>
         <w:pStyle w:val="Heading1"/>
@@ -154,7 +154,7 @@
       <w:r>
         <w:t xml:space="preserve"> </w:t>
       </w:r>
-      <w:hyperlink r:id="rId21">
+      <w:hyperlink r:id="rId23">
         <w:r>
           <w:rPr>
             <w:rStyle w:val="Hyperlink"/>
@@ -168,8 +168,8 @@
         <w:br w:type="page"/>
       </w:r>
     </w:p>
-    <w:bookmarkEnd w:id="22"/>
-    <w:bookmarkStart w:id="23" w:name="abstract"/>
+    <w:bookmarkEnd w:id="24"/>
+    <w:bookmarkStart w:id="25" w:name="abstract"/>
     <w:p>
       <w:pPr>
         <w:pStyle w:val="Heading1"/>
@@ -206,8 +206,8 @@
         <w:br w:type="page"/>
       </w:r>
     </w:p>
-    <w:bookmarkEnd w:id="23"/>
-    <w:bookmarkStart w:id="24" w:name="firstheader"/>
+    <w:bookmarkEnd w:id="25"/>
+    <w:bookmarkStart w:id="26" w:name="firstheader"/>
     <w:p>
       <w:pPr>
         <w:pStyle w:val="Heading1"/>
@@ -216,8 +216,8 @@
         <w:t xml:space="preserve">Mapping the Field: Learnings from a Quarter-Century of Consumer-Technology Research and the Case of Generative AI</w:t>
       </w:r>
     </w:p>
-    <w:bookmarkEnd w:id="24"/>
-    <w:bookmarkStart w:id="25" w:name="introduction"/>
+    <w:bookmarkEnd w:id="26"/>
+    <w:bookmarkStart w:id="27" w:name="introduction"/>
     <w:p>
       <w:pPr>
         <w:pStyle w:val="Heading1"/>
@@ -821,8 +821,8 @@
         <w:br w:type="page"/>
       </w:r>
     </w:p>
-    <w:bookmarkEnd w:id="25"/>
-    <w:bookmarkStart w:id="36" w:name="Xe0edb79da80fb455bcf5cb4a9ff2c106b5eea2e"/>
+    <w:bookmarkEnd w:id="27"/>
+    <w:bookmarkStart w:id="38" w:name="Xe0edb79da80fb455bcf5cb4a9ff2c106b5eea2e"/>
     <w:p>
       <w:pPr>
         <w:pStyle w:val="Heading1"/>
@@ -1029,7 +1029,7 @@
         <w:t xml:space="preserve">.</w:t>
       </w:r>
     </w:p>
-    <w:bookmarkStart w:id="30" w:name="inclusion-and-exclusion-of-articles"/>
+    <w:bookmarkStart w:id="32" w:name="inclusion-and-exclusion-of-articles"/>
     <w:p>
       <w:pPr>
         <w:pStyle w:val="Heading2"/>
@@ -1346,7 +1346,7 @@
         <w:t xml:space="preserve">. These technologies have changed the world of consumers and firms, but also how we as researchers operate within this space.</w:t>
       </w:r>
     </w:p>
-    <w:bookmarkStart w:id="29" w:name="fig-inclusion"/>
+    <w:bookmarkStart w:id="31" w:name="fig-inclusion"/>
     <w:p>
       <w:pPr>
         <w:pStyle w:val="FigureTitle"/>
@@ -1480,12 +1480,12 @@
           <wp:inline>
             <wp:extent cx="5943600" cy="874422"/>
             <wp:effectExtent b="0" l="0" r="0" t="0"/>
-            <wp:docPr descr="" title="" id="27" name="Picture"/>
+            <wp:docPr descr="" title="" id="29" name="Picture"/>
             <a:graphic>
               <a:graphicData uri="http://schemas.openxmlformats.org/drawingml/2006/picture">
                 <pic:pic>
                   <pic:nvPicPr>
-                    <pic:cNvPr descr="..\99_writing/figures/inclusionexclusion.svg" id="28" name="Picture"/>
+                    <pic:cNvPr descr="../99_writing/figures/inclusionexclusion.svg" id="30" name="Picture"/>
                     <pic:cNvPicPr>
                       <a:picLocks noChangeArrowheads="1" noChangeAspect="1"/>
                     </pic:cNvPicPr>
@@ -1497,7 +1497,7 @@
                           <a14:useLocalDpi xmlns:a14="http://schemas.microsoft.com/office/drawing/2010/main" val="0"/>
                         </a:ext>
                         <a:ext uri="{96DAC541-7B7A-43D3-8B79-37D633B846F1}">
-                          <asvg:svgBlip xmlns:asvg="http://schemas.microsoft.com/office/drawing/2016/SVG/main" r:embed="rId26"/>
+                          <asvg:svgBlip xmlns:asvg="http://schemas.microsoft.com/office/drawing/2016/SVG/main" r:embed="rId28"/>
                         </a:ext>
                       </a:extLst>
                     </a:blip>
@@ -1527,9 +1527,9 @@
         </w:drawing>
       </w:r>
     </w:p>
-    <w:bookmarkEnd w:id="29"/>
-    <w:bookmarkEnd w:id="30"/>
-    <w:bookmarkStart w:id="31" w:name="semantic-deduplication-and-clustering"/>
+    <w:bookmarkEnd w:id="31"/>
+    <w:bookmarkEnd w:id="32"/>
+    <w:bookmarkStart w:id="33" w:name="semantic-deduplication-and-clustering"/>
     <w:p>
       <w:pPr>
         <w:pStyle w:val="Heading2"/>
@@ -1780,8 +1780,8 @@
         <w:t xml:space="preserve">, and the human interpretability of the resulting clusters, which we then check and label manually.</w:t>
       </w:r>
     </w:p>
-    <w:bookmarkEnd w:id="31"/>
-    <w:bookmarkStart w:id="32" w:name="bibliometric-analysis"/>
+    <w:bookmarkEnd w:id="33"/>
+    <w:bookmarkStart w:id="34" w:name="bibliometric-analysis"/>
     <w:p>
       <w:pPr>
         <w:pStyle w:val="Heading2"/>
@@ -2406,8 +2406,8 @@
         <w:t xml:space="preserve">In the Supplementary Materials, we provide additional bibliometric perspectives by computing bibliographic coupling metrics, and analyze the academic fields referenced by the consumer technology corpus using Scopus’ top-level field and broad subject area classification of the cited sources.</w:t>
       </w:r>
     </w:p>
-    <w:bookmarkEnd w:id="32"/>
-    <w:bookmarkStart w:id="35" w:name="media-benchmark"/>
+    <w:bookmarkEnd w:id="34"/>
+    <w:bookmarkStart w:id="37" w:name="media-benchmark"/>
     <w:p>
       <w:pPr>
         <w:pStyle w:val="Heading2"/>
@@ -2454,7 +2454,13 @@
           <w:rPr>
             <w:rStyle w:val="Hyperlink"/>
           </w:rPr>
-          <w:t xml:space="preserve">Roberts et al., 2021</w:t>
+          <w:t xml:space="preserve">Roberts et al.</w:t>
+        </w:r>
+        <w:r>
+          <w:rPr>
+            <w:rStyle w:val="Hyperlink"/>
+          </w:rPr>
+          <w:t xml:space="preserve">, 2021</w:t>
         </w:r>
       </w:hyperlink>
       <w:r>
@@ -2504,7 +2510,7 @@
         <w:rPr>
           <w:rStyle w:val="FootnoteReference"/>
         </w:rPr>
-        <w:footnoteReference w:id="33"/>
+        <w:footnoteReference w:id="35"/>
       </w:r>
       <w:r>
         <w:t xml:space="preserve">. We are interested in which consumer technologies hold focal attention in consumer’s minds, which is why we search for mentions of these technologies in the indexed story titles. We count the number of stories mentioning each consumer technology, removing duplicate-stories within technologies, and aggregate the counts to the clusters identified through semantic modeling.</w:t>
@@ -2639,7 +2645,7 @@
       <w:r>
         <w:t xml:space="preserve"> </w:t>
       </w:r>
-      <w:hyperlink r:id="rId34">
+      <w:hyperlink r:id="rId36">
         <w:r>
           <w:rPr>
             <w:rStyle w:val="Hyperlink"/>
@@ -2701,9 +2707,9 @@
         <w:br w:type="page"/>
       </w:r>
     </w:p>
-    <w:bookmarkEnd w:id="35"/>
-    <w:bookmarkEnd w:id="36"/>
-    <w:bookmarkStart w:id="67" w:name="results"/>
+    <w:bookmarkEnd w:id="37"/>
+    <w:bookmarkEnd w:id="38"/>
+    <w:bookmarkStart w:id="69" w:name="results"/>
     <w:p>
       <w:pPr>
         <w:pStyle w:val="Heading1"/>
@@ -2762,7 +2768,7 @@
         <w:t xml:space="preserve">, we extend our analysis to contrast academic attention with media attention over time. For all three analyses, we first examine how consumer technology research has evolved at large over the past 26 years, and then ask: is Generative AI different?</w:t>
       </w:r>
     </w:p>
-    <w:bookmarkStart w:id="51" w:name="sec-analysis-1"/>
+    <w:bookmarkStart w:id="53" w:name="sec-analysis-1"/>
     <w:p>
       <w:pPr>
         <w:pStyle w:val="Heading2"/>
@@ -2779,7 +2785,7 @@
         <w:t xml:space="preserve">In Analysis 1, we pursue two goals: First, we semantically map a quarter-century of consumer technology research. We treat the language authors use to describe a technology as an indicator for its relatedness to other technologies, closer semantic similarity indicating closer relatedness. Second, we trace the resulting clusters of consumer technologies over time.</w:t>
       </w:r>
     </w:p>
-    <w:bookmarkStart w:id="49" w:name="the-field-at-large"/>
+    <w:bookmarkStart w:id="51" w:name="the-field-at-large"/>
     <w:p>
       <w:pPr>
         <w:pStyle w:val="Heading3"/>
@@ -2938,7 +2944,7 @@
       <w:r>
         <w:t xml:space="preserve"> </w:t>
       </w:r>
-      <w:hyperlink r:id="rId37">
+      <w:hyperlink r:id="rId39">
         <w:r>
           <w:rPr>
             <w:rStyle w:val="Hyperlink"/>
@@ -2984,7 +2990,7 @@
         <w:t xml:space="preserve">.</w:t>
       </w:r>
     </w:p>
-    <w:bookmarkStart w:id="41" w:name="fig-map"/>
+    <w:bookmarkStart w:id="43" w:name="fig-map"/>
     <w:p>
       <w:pPr>
         <w:pStyle w:val="FigureTitle"/>
@@ -3010,18 +3016,18 @@
           <wp:inline>
             <wp:extent cx="5943600" cy="2786062"/>
             <wp:effectExtent b="0" l="0" r="0" t="0"/>
-            <wp:docPr descr="" title="" id="39" name="Picture"/>
+            <wp:docPr descr="" title="" id="41" name="Picture"/>
             <a:graphic>
               <a:graphicData uri="http://schemas.openxmlformats.org/drawingml/2006/picture">
                 <pic:pic>
                   <pic:nvPicPr>
-                    <pic:cNvPr descr="..\11_semantic_mapping_output/1_semantic_map16.png" id="40" name="Picture"/>
+                    <pic:cNvPr descr="../11_semantic_mapping_output/1_semantic_map16.png" id="42" name="Picture"/>
                     <pic:cNvPicPr>
                       <a:picLocks noChangeArrowheads="1" noChangeAspect="1"/>
                     </pic:cNvPicPr>
                   </pic:nvPicPr>
                   <pic:blipFill>
-                    <a:blip r:embed="rId38"/>
+                    <a:blip r:embed="rId40"/>
                     <a:stretch>
                       <a:fillRect/>
                     </a:stretch>
@@ -3048,7 +3054,7 @@
         </w:drawing>
       </w:r>
     </w:p>
-    <w:bookmarkEnd w:id="41"/>
+    <w:bookmarkEnd w:id="43"/>
     <w:p>
       <w:pPr>
         <w:pStyle w:val="AfterWithoutNote"/>
@@ -3059,7 +3065,7 @@
       <w:r>
         <w:t xml:space="preserve"> </w:t>
       </w:r>
-      <w:hyperlink r:id="rId42">
+      <w:hyperlink r:id="rId44">
         <w:r>
           <w:rPr>
             <w:rStyle w:val="Hyperlink"/>
@@ -3194,7 +3200,7 @@
       <w:r>
         <w:t xml:space="preserve"> </w:t>
       </w:r>
-      <w:hyperlink r:id="rId42">
+      <w:hyperlink r:id="rId44">
         <w:r>
           <w:rPr>
             <w:rStyle w:val="Hyperlink"/>
@@ -3212,7 +3218,7 @@
         <w:t xml:space="preserve">for the fitted trajectories).</w:t>
       </w:r>
     </w:p>
-    <w:bookmarkStart w:id="44" w:name="tbl-peaks"/>
+    <w:bookmarkStart w:id="46" w:name="tbl-peaks"/>
     <w:p>
       <w:pPr>
         <w:pStyle w:val="FigureTitle"/>
@@ -3240,7 +3246,7 @@
         <w:t xml:space="preserve">-value tests the smooth against a flat trend. The fitted curves for all clusters are shown in Appendix B.</w:t>
       </w:r>
     </w:p>
-    <w:bookmarkStart w:id="43" w:name="tbl-peaks"/>
+    <w:bookmarkStart w:id="45" w:name="tbl-peaks"/>
     <w:tbl>
       <w:tblPr>
         <w:tblStyle w:val="Table"/>
@@ -4299,8 +4305,8 @@
         </w:tc>
       </w:tr>
     </w:tbl>
-    <w:bookmarkEnd w:id="43"/>
-    <w:bookmarkEnd w:id="44"/>
+    <w:bookmarkEnd w:id="45"/>
+    <w:bookmarkEnd w:id="46"/>
     <w:p>
       <w:pPr>
         <w:pStyle w:val="AfterWithoutNote"/>
@@ -4309,7 +4315,7 @@
         <w:t xml:space="preserve"> </w:t>
       </w:r>
     </w:p>
-    <w:bookmarkStart w:id="48" w:name="fig-temp"/>
+    <w:bookmarkStart w:id="50" w:name="fig-temp"/>
     <w:p>
       <w:pPr>
         <w:pStyle w:val="FigureTitle"/>
@@ -4335,18 +4341,18 @@
           <wp:inline>
             <wp:extent cx="5943600" cy="1708785"/>
             <wp:effectExtent b="0" l="0" r="0" t="0"/>
-            <wp:docPr descr="" title="" id="46" name="Picture"/>
+            <wp:docPr descr="" title="" id="48" name="Picture"/>
             <a:graphic>
               <a:graphicData uri="http://schemas.openxmlformats.org/drawingml/2006/picture">
                 <pic:pic>
                   <pic:nvPicPr>
-                    <pic:cNvPr descr="..\11_semantic_mapping_output/7_progression_panels_AB_k16.png" id="47" name="Picture"/>
+                    <pic:cNvPr descr="../11_semantic_mapping_output/7_progression_panels_AB_k16.png" id="49" name="Picture"/>
                     <pic:cNvPicPr>
                       <a:picLocks noChangeArrowheads="1" noChangeAspect="1"/>
                     </pic:cNvPicPr>
                   </pic:nvPicPr>
                   <pic:blipFill>
-                    <a:blip r:embed="rId45"/>
+                    <a:blip r:embed="rId47"/>
                     <a:stretch>
                       <a:fillRect/>
                     </a:stretch>
@@ -4373,9 +4379,9 @@
         </w:drawing>
       </w:r>
     </w:p>
-    <w:bookmarkEnd w:id="48"/>
-    <w:bookmarkEnd w:id="49"/>
-    <w:bookmarkStart w:id="50" w:name="the-case-of-generative-ai"/>
+    <w:bookmarkEnd w:id="50"/>
+    <w:bookmarkEnd w:id="51"/>
+    <w:bookmarkStart w:id="52" w:name="the-case-of-generative-ai"/>
     <w:p>
       <w:pPr>
         <w:pStyle w:val="Heading3"/>
@@ -4417,9 +4423,9 @@
         <w:t xml:space="preserve">). Being a clearly ubiquitous technology, that has become the most popular subject in the academic consumer technology discourse, it is unsurprising that all leading marketing journals have devoted a substantial share of their attention to Generative AI.</w:t>
       </w:r>
     </w:p>
-    <w:bookmarkEnd w:id="50"/>
-    <w:bookmarkEnd w:id="51"/>
-    <w:bookmarkStart w:id="57" w:name="sec-analysis-2"/>
+    <w:bookmarkEnd w:id="52"/>
+    <w:bookmarkEnd w:id="53"/>
+    <w:bookmarkStart w:id="59" w:name="sec-analysis-2"/>
     <w:p>
       <w:pPr>
         <w:pStyle w:val="Heading2"/>
@@ -4436,7 +4442,7 @@
         <w:t xml:space="preserve">In Analysis 2, we first analyze and map how our corpus of consumer technology literature is internally connected, and subsequently extend our bibliometric analysis to its intellectual foundation using co-citation metrics.</w:t>
       </w:r>
     </w:p>
-    <w:bookmarkStart w:id="55" w:name="the-field-at-large-1"/>
+    <w:bookmarkStart w:id="57" w:name="the-field-at-large-1"/>
     <w:p>
       <w:pPr>
         <w:pStyle w:val="Heading3"/>
@@ -4488,7 +4494,7 @@
       <w:r>
         <w:t xml:space="preserve"> </w:t>
       </w:r>
-      <w:hyperlink r:id="rId52">
+      <w:hyperlink r:id="rId54">
         <w:r>
           <w:rPr>
             <w:rStyle w:val="Hyperlink"/>
@@ -4604,7 +4610,7 @@
       <w:r>
         <w:t xml:space="preserve"> </w:t>
       </w:r>
-      <w:hyperlink r:id="rId52">
+      <w:hyperlink r:id="rId54">
         <w:r>
           <w:rPr>
             <w:rStyle w:val="Hyperlink"/>
@@ -4729,7 +4735,7 @@
         <w:sectPr/>
       </w:pPr>
     </w:p>
-    <w:bookmarkStart w:id="54" w:name="tbl-cocitation-foundation"/>
+    <w:bookmarkStart w:id="56" w:name="tbl-cocitation-foundation"/>
     <w:p>
       <w:pPr>
         <w:pStyle w:val="FigureTitle"/>
@@ -4746,7 +4752,7 @@
         <w:t xml:space="preserve">The shared knowledge foundation of the corpus as a whole. The first row pools all sixteen technology clusters and gives the matched article-reference mentions falling into each co-citation base cluster with the corresponding share; the second row gives the five most cited references of that base cluster with their titles, ranked by the number of corpus articles citing them. Columns are alphabetical with the residual Other category last.</w:t>
       </w:r>
     </w:p>
-    <w:bookmarkStart w:id="53" w:name="tbl-cocitation-foundation"/>
+    <w:bookmarkStart w:id="55" w:name="tbl-cocitation-foundation"/>
     <w:tbl>
       <w:tblPr>
         <w:tblStyle w:val="Table"/>
@@ -6496,8 +6502,8 @@
         </w:tc>
       </w:tr>
     </w:tbl>
-    <w:bookmarkEnd w:id="53"/>
-    <w:bookmarkEnd w:id="54"/>
+    <w:bookmarkEnd w:id="55"/>
+    <w:bookmarkEnd w:id="56"/>
     <w:p>
       <w:pPr>
         <w:sectPr>
@@ -6505,8 +6511,8 @@
         </w:sectPr>
       </w:pPr>
     </w:p>
-    <w:bookmarkEnd w:id="55"/>
-    <w:bookmarkStart w:id="56" w:name="the-case-of-generative-ai-1"/>
+    <w:bookmarkEnd w:id="57"/>
+    <w:bookmarkStart w:id="58" w:name="the-case-of-generative-ai-1"/>
     <w:p>
       <w:pPr>
         <w:pStyle w:val="Heading3"/>
@@ -6531,9 +6537,9 @@
         <w:t xml:space="preserve">The co-citation analysis reveals the same concentration. Generative AI draws primarily on Algorithm and AI Perception, indicating that current studies predominantly discuss how AI is perceived. Despite making up the majority of consumer technology publications in 2026, the substance discussed remains narrow.</w:t>
       </w:r>
     </w:p>
-    <w:bookmarkEnd w:id="56"/>
-    <w:bookmarkEnd w:id="57"/>
-    <w:bookmarkStart w:id="66" w:name="sec-analysis-3"/>
+    <w:bookmarkEnd w:id="58"/>
+    <w:bookmarkEnd w:id="59"/>
+    <w:bookmarkStart w:id="68" w:name="sec-analysis-3"/>
     <w:p>
       <w:pPr>
         <w:pStyle w:val="Heading2"/>
@@ -6550,7 +6556,7 @@
         <w:t xml:space="preserve">In Analysis 3, we contrast the academic attention devoted to consumer technologies with the media attention devoted to these same technologies. Our goal in this study is to identify and quantify the relationship between interests in research, and what concerns the public.</w:t>
       </w:r>
     </w:p>
-    <w:bookmarkStart w:id="64" w:name="the-field-at-large-2"/>
+    <w:bookmarkStart w:id="66" w:name="the-field-at-large-2"/>
     <w:p>
       <w:pPr>
         <w:pStyle w:val="Heading3"/>
@@ -6648,19 +6654,21 @@
         <m:r>
           <m:t>G</m:t>
         </m:r>
-        <m:d>
-          <m:dPr>
-            <m:begChr m:val="("/>
-            <m:sepChr m:val=""/>
-            <m:endChr m:val=")"/>
-            <m:grow/>
-          </m:dPr>
-          <m:e>
-            <m:r>
-              <m:t>15</m:t>
-            </m:r>
-          </m:e>
-        </m:d>
+        <m:r>
+          <m:rPr>
+            <m:sty m:val="p"/>
+          </m:rPr>
+          <m:t>(</m:t>
+        </m:r>
+        <m:r>
+          <m:t>15</m:t>
+        </m:r>
+        <m:r>
+          <m:rPr>
+            <m:sty m:val="p"/>
+          </m:rPr>
+          <m:t>)</m:t>
+        </m:r>
         <m:r>
           <m:rPr>
             <m:sty m:val="p"/>
@@ -6917,7 +6925,7 @@
       <w:r>
         <w:t xml:space="preserve"> </w:t>
       </w:r>
-      <w:hyperlink r:id="rId34">
+      <w:hyperlink r:id="rId36">
         <w:r>
           <w:rPr>
             <w:rStyle w:val="Hyperlink"/>
@@ -6932,7 +6940,7 @@
         <w:t xml:space="preserve">.</w:t>
       </w:r>
     </w:p>
-    <w:bookmarkStart w:id="61" w:name="fig-coverage-gap"/>
+    <w:bookmarkStart w:id="63" w:name="fig-coverage-gap"/>
     <w:p>
       <w:pPr>
         <w:pStyle w:val="FigureTitle"/>
@@ -6956,20 +6964,20 @@
       <w:r>
         <w:drawing>
           <wp:inline>
-            <wp:extent cx="5943600" cy="4692315"/>
+            <wp:extent cx="5943600" cy="4909930"/>
             <wp:effectExtent b="0" l="0" r="0" t="0"/>
-            <wp:docPr descr="" title="" id="59" name="Picture"/>
+            <wp:docPr descr="" title="" id="61" name="Picture"/>
             <a:graphic>
               <a:graphicData uri="http://schemas.openxmlformats.org/drawingml/2006/picture">
                 <pic:pic>
                   <pic:nvPicPr>
-                    <pic:cNvPr descr="..\21_mediacloud_benchmark_output/coverage_gap_outputs/within_tech/coverage_scatter.png" id="60" name="Picture"/>
+                    <pic:cNvPr descr="../21_mediacloud_benchmark_output/coverage_gap_outputs/within_tech/coverage_scatter.png" id="62" name="Picture"/>
                     <pic:cNvPicPr>
                       <a:picLocks noChangeArrowheads="1" noChangeAspect="1"/>
                     </pic:cNvPicPr>
                   </pic:nvPicPr>
                   <pic:blipFill>
-                    <a:blip r:embed="rId58"/>
+                    <a:blip r:embed="rId60"/>
                     <a:stretch>
                       <a:fillRect/>
                     </a:stretch>
@@ -6977,7 +6985,7 @@
                   <pic:spPr bwMode="auto">
                     <a:xfrm>
                       <a:off x="0" y="0"/>
-                      <a:ext cx="5943600" cy="4692315"/>
+                      <a:ext cx="5943600" cy="4909930"/>
                     </a:xfrm>
                     <a:prstGeom prst="rect">
                       <a:avLst/>
@@ -6996,13 +7004,13 @@
         </w:drawing>
       </w:r>
     </w:p>
-    <w:bookmarkEnd w:id="61"/>
+    <w:bookmarkEnd w:id="63"/>
     <w:p>
       <w:pPr>
         <w:sectPr/>
       </w:pPr>
     </w:p>
-    <w:bookmarkStart w:id="63" w:name="tbl-lag-pvalues"/>
+    <w:bookmarkStart w:id="65" w:name="tbl-lag-pvalues"/>
     <w:p>
       <w:pPr>
         <w:pStyle w:val="FigureTitle"/>
@@ -7019,7 +7027,7 @@
         <w:t xml:space="preserve">Correlation between annual academic and media attention at each lag, with the exact two-sided circular-shift permutation p-value in parentheses. The highest correlation in each row is set in bold and corresponds to the best lag. The smallest attainable p-value ranges from .053 at lag 0 to .071 at lag -5 and +5.</w:t>
       </w:r>
     </w:p>
-    <w:bookmarkStart w:id="62" w:name="tbl-lag-pvalues"/>
+    <w:bookmarkStart w:id="64" w:name="tbl-lag-pvalues"/>
     <w:tbl>
       <w:tblPr>
         <w:tblStyle w:val="Table"/>
@@ -9779,8 +9787,8 @@
         </w:tc>
       </w:tr>
     </w:tbl>
-    <w:bookmarkEnd w:id="62"/>
-    <w:bookmarkEnd w:id="63"/>
+    <w:bookmarkEnd w:id="64"/>
+    <w:bookmarkEnd w:id="65"/>
     <w:p>
       <w:pPr>
         <w:sectPr>
@@ -9788,8 +9796,8 @@
         </w:sectPr>
       </w:pPr>
     </w:p>
-    <w:bookmarkEnd w:id="64"/>
-    <w:bookmarkStart w:id="65" w:name="the-case-of-generative-ai-2"/>
+    <w:bookmarkEnd w:id="66"/>
+    <w:bookmarkStart w:id="67" w:name="the-case-of-generative-ai-2"/>
     <w:p>
       <w:pPr>
         <w:pStyle w:val="Heading3"/>
@@ -9952,10 +9960,10 @@
         <w:br w:type="page"/>
       </w:r>
     </w:p>
-    <w:bookmarkEnd w:id="65"/>
-    <w:bookmarkEnd w:id="66"/>
     <w:bookmarkEnd w:id="67"/>
-    <w:bookmarkStart w:id="69" w:name="general-discussion"/>
+    <w:bookmarkEnd w:id="68"/>
+    <w:bookmarkEnd w:id="69"/>
+    <w:bookmarkStart w:id="71" w:name="general-discussion"/>
     <w:p>
       <w:pPr>
         <w:pStyle w:val="Heading1"/>
@@ -9988,7 +9996,7 @@
         <w:t xml:space="preserve">Academic attention has so far only weakly aligned with public attention (Analysis 3): although the relative attention assigned to technologies is moderately correlated across the two corpora, their temporal relationships are weak. Generative AI departs from this historical pattern, carrying the largest academic over-representation of any cluster, and being the only cluster whose academic and media attention correlate highly across time.</w:t>
       </w:r>
     </w:p>
-    <w:bookmarkStart w:id="68" w:name="the-case-of-generative-ai-3"/>
+    <w:bookmarkStart w:id="70" w:name="the-case-of-generative-ai-3"/>
     <w:p>
       <w:pPr>
         <w:pStyle w:val="Heading2"/>
@@ -10194,9 +10202,9 @@
         <w:t xml:space="preserve">to consumer experience: fields such as relationships, or online virality and word of mouth are currently credibly below the overall baseline, yet developments in AI call for a better understanding of its impact on these aspects of consumer behavior [sources].</w:t>
       </w:r>
     </w:p>
-    <w:bookmarkEnd w:id="68"/>
-    <w:bookmarkEnd w:id="69"/>
-    <w:bookmarkStart w:id="70" w:name="implications"/>
+    <w:bookmarkEnd w:id="70"/>
+    <w:bookmarkEnd w:id="71"/>
+    <w:bookmarkStart w:id="72" w:name="implications"/>
     <w:p>
       <w:pPr>
         <w:pStyle w:val="Heading1"/>
@@ -10391,8 +10399,8 @@
         <w:t xml:space="preserve">For journals and their editors, we derive a different, yet related set of implications. First, our analyses imply a strong relationship between the priorities set by journals and the research agendas that stem from them. Generative AI has universally been adopted as the next consumer technology to study, from theory building to applied research. It is however important for journals to condition their publication agenda on how we can actually advance our understanding of this technology: just as for researchers, we recommend that journal editors assess propositions on Generative AI not in isolation, but also with regard to how they contribute to our understanding of how this technology builds on, and diverges from, earlier work on consumer technologies. Constructing a parsimonious and integrated network of theories and technology understanding might be our best chance as a field to keep up with a subject matter that evolves faster than we are able to publish. Beyond Generative AI, we also recommend that journals not chase novelty at the cost of cumulative knowledge advancement. Our analysis shows that early-dominant technology clusters have fallen out of academic focus, yet remain relevant in the media and offer further theoretical angles from which they can be approached. Understanding the latent technologies that shape more specific applications, such as Algorithms &amp; Recommendations as a broader baseline influencing more specific technologies such as E-Commerce, or Social Media as a particular family of algorithms, may further contribute to a substantive and sustainable understanding of the technological world consumers operate in.</w:t>
       </w:r>
     </w:p>
-    <w:bookmarkEnd w:id="70"/>
-    <w:bookmarkStart w:id="71" w:name="limitations-and-further-research"/>
+    <w:bookmarkEnd w:id="72"/>
+    <w:bookmarkStart w:id="73" w:name="limitations-and-further-research"/>
     <w:p>
       <w:pPr>
         <w:pStyle w:val="Heading1"/>
@@ -10417,8 +10425,8 @@
         <w:t xml:space="preserve">In three analyses, we provide an overview of 26 years of consumer technology research in marketing, and compare this baseline against the case of Generative AI. This foundation provides opportunities for further research: First, we assessed the body of empirical work on consumer technologies. It is worthwhile asking if our findings generalize to consumer technology research beyond empirical work, especially in terms of divergences from public attention. We might lag behind or disregard public attention in our empirical work, but conceptual work may be anticipating future trends. A second, natural extension would be to not only look at the technologies studied, and the intellectual foundation in terms of bibliometric analyses, but to extend our analysis to a full-text analysis identifying the mechansims studied in connection to these technologies. Lastly, we treat semantic information from consumer technology descriptions as the authors of articles provide them as a basis to form our bottom-up, empirical clustering of consumer technologies. This finding could be extended and validated from a more theoretical perspective, as semantic modeling is subject to subtle semantic changes, whereas a theoretical taxonomy of consumer technologies may prove useful for further understanding and advancing our field.</w:t>
       </w:r>
     </w:p>
-    <w:bookmarkEnd w:id="71"/>
-    <w:bookmarkStart w:id="164" w:name="references"/>
+    <w:bookmarkEnd w:id="73"/>
+    <w:bookmarkStart w:id="166" w:name="references"/>
     <w:p>
       <w:pPr>
         <w:pStyle w:val="Heading1"/>
@@ -10427,8 +10435,8 @@
         <w:t xml:space="preserve">References</w:t>
       </w:r>
     </w:p>
-    <w:bookmarkStart w:id="163" w:name="refs"/>
-    <w:bookmarkStart w:id="72" w:name="ref-andrewBayesianDataAnalysis"/>
+    <w:bookmarkStart w:id="165" w:name="refs"/>
+    <w:bookmarkStart w:id="74" w:name="ref-andrewBayesianDataAnalysis"/>
     <w:p>
       <w:pPr>
         <w:pStyle w:val="Bibliography"/>
@@ -10485,8 +10493,8 @@
         <w:t xml:space="preserve">.</w:t>
       </w:r>
     </w:p>
-    <w:bookmarkEnd w:id="72"/>
-    <w:bookmarkStart w:id="74" w:name="X77c6a6fb7e9371a37a306d4adddd389bde7954b"/>
+    <w:bookmarkEnd w:id="74"/>
+    <w:bookmarkStart w:id="76" w:name="X77c6a6fb7e9371a37a306d4adddd389bde7954b"/>
     <w:p>
       <w:pPr>
         <w:pStyle w:val="Bibliography"/>
@@ -10535,7 +10543,7 @@
       <w:r>
         <w:t xml:space="preserve"> </w:t>
       </w:r>
-      <w:hyperlink r:id="rId73">
+      <w:hyperlink r:id="rId75">
         <w:r>
           <w:rPr>
             <w:rStyle w:val="Hyperlink"/>
@@ -10544,8 +10552,8 @@
         </w:r>
       </w:hyperlink>
     </w:p>
-    <w:bookmarkEnd w:id="74"/>
-    <w:bookmarkStart w:id="76" w:name="ref-specialissue2026"/>
+    <w:bookmarkEnd w:id="76"/>
+    <w:bookmarkStart w:id="78" w:name="ref-specialissue2026"/>
     <w:p>
       <w:pPr>
         <w:pStyle w:val="Bibliography"/>
@@ -10667,7 +10675,7 @@
       <w:r>
         <w:t xml:space="preserve"> </w:t>
       </w:r>
-      <w:hyperlink r:id="rId75">
+      <w:hyperlink r:id="rId77">
         <w:r>
           <w:rPr>
             <w:rStyle w:val="Hyperlink"/>
@@ -10676,8 +10684,8 @@
         </w:r>
       </w:hyperlink>
     </w:p>
-    <w:bookmarkEnd w:id="76"/>
-    <w:bookmarkStart w:id="78" w:name="ref-bermejoMediaCloud202026"/>
+    <w:bookmarkEnd w:id="78"/>
+    <w:bookmarkStart w:id="80" w:name="ref-bermejoMediaCloud202026"/>
     <w:p>
       <w:pPr>
         <w:pStyle w:val="Bibliography"/>
@@ -10735,7 +10743,7 @@
       <w:r>
         <w:t xml:space="preserve"> </w:t>
       </w:r>
-      <w:hyperlink r:id="rId77">
+      <w:hyperlink r:id="rId79">
         <w:r>
           <w:rPr>
             <w:rStyle w:val="Hyperlink"/>
@@ -10744,8 +10752,8 @@
         </w:r>
       </w:hyperlink>
     </w:p>
-    <w:bookmarkEnd w:id="78"/>
-    <w:bookmarkStart w:id="80" w:name="ref-binzHowShouldAdvancement2025"/>
+    <w:bookmarkEnd w:id="80"/>
+    <w:bookmarkStart w:id="82" w:name="ref-binzHowShouldAdvancement2025"/>
     <w:p>
       <w:pPr>
         <w:pStyle w:val="Bibliography"/>
@@ -10782,7 +10790,7 @@
       <w:r>
         <w:t xml:space="preserve"> </w:t>
       </w:r>
-      <w:hyperlink r:id="rId79">
+      <w:hyperlink r:id="rId81">
         <w:r>
           <w:rPr>
             <w:rStyle w:val="Hyperlink"/>
@@ -10791,8 +10799,8 @@
         </w:r>
       </w:hyperlink>
     </w:p>
-    <w:bookmarkEnd w:id="80"/>
-    <w:bookmarkStart w:id="82" w:name="ref-bjorkPublishingDelayScholarly2013"/>
+    <w:bookmarkEnd w:id="82"/>
+    <w:bookmarkStart w:id="84" w:name="ref-bjorkPublishingDelayScholarly2013"/>
     <w:p>
       <w:pPr>
         <w:pStyle w:val="Bibliography"/>
@@ -10829,7 +10837,7 @@
       <w:r>
         <w:t xml:space="preserve"> </w:t>
       </w:r>
-      <w:hyperlink r:id="rId81">
+      <w:hyperlink r:id="rId83">
         <w:r>
           <w:rPr>
             <w:rStyle w:val="Hyperlink"/>
@@ -10838,8 +10846,8 @@
         </w:r>
       </w:hyperlink>
     </w:p>
-    <w:bookmarkEnd w:id="82"/>
-    <w:bookmarkStart w:id="84" w:name="ref-blondelFastUnfoldingCommunities2008"/>
+    <w:bookmarkEnd w:id="84"/>
+    <w:bookmarkStart w:id="86" w:name="ref-blondelFastUnfoldingCommunities2008"/>
     <w:p>
       <w:pPr>
         <w:pStyle w:val="Bibliography"/>
@@ -10876,7 +10884,7 @@
       <w:r>
         <w:t xml:space="preserve"> </w:t>
       </w:r>
-      <w:hyperlink r:id="rId83">
+      <w:hyperlink r:id="rId85">
         <w:r>
           <w:rPr>
             <w:rStyle w:val="Hyperlink"/>
@@ -10885,8 +10893,8 @@
         </w:r>
       </w:hyperlink>
     </w:p>
-    <w:bookmarkEnd w:id="84"/>
-    <w:bookmarkStart w:id="86" w:name="ref-calinskiDendriteMethodCluster1974"/>
+    <w:bookmarkEnd w:id="86"/>
+    <w:bookmarkStart w:id="88" w:name="ref-calinskiDendriteMethodCluster1974"/>
     <w:p>
       <w:pPr>
         <w:pStyle w:val="Bibliography"/>
@@ -10923,7 +10931,7 @@
       <w:r>
         <w:t xml:space="preserve"> </w:t>
       </w:r>
-      <w:hyperlink r:id="rId85">
+      <w:hyperlink r:id="rId87">
         <w:r>
           <w:rPr>
             <w:rStyle w:val="Hyperlink"/>
@@ -10932,8 +10940,8 @@
         </w:r>
       </w:hyperlink>
     </w:p>
-    <w:bookmarkEnd w:id="86"/>
-    <w:bookmarkStart w:id="88" w:name="ref-cilloGenerativeAIInnovation2025"/>
+    <w:bookmarkEnd w:id="88"/>
+    <w:bookmarkStart w:id="90" w:name="ref-cilloGenerativeAIInnovation2025"/>
     <w:p>
       <w:pPr>
         <w:pStyle w:val="Bibliography"/>
@@ -10994,7 +11002,7 @@
       <w:r>
         <w:t xml:space="preserve"> </w:t>
       </w:r>
-      <w:hyperlink r:id="rId87">
+      <w:hyperlink r:id="rId89">
         <w:r>
           <w:rPr>
             <w:rStyle w:val="Hyperlink"/>
@@ -11003,8 +11011,8 @@
         </w:r>
       </w:hyperlink>
     </w:p>
-    <w:bookmarkEnd w:id="88"/>
-    <w:bookmarkStart w:id="90" w:name="ref-daviesClusterSeparationMeasure1979"/>
+    <w:bookmarkEnd w:id="90"/>
+    <w:bookmarkStart w:id="92" w:name="ref-daviesClusterSeparationMeasure1979"/>
     <w:p>
       <w:pPr>
         <w:pStyle w:val="Bibliography"/>
@@ -11050,7 +11058,7 @@
       <w:r>
         <w:t xml:space="preserve"> </w:t>
       </w:r>
-      <w:hyperlink r:id="rId89">
+      <w:hyperlink r:id="rId91">
         <w:r>
           <w:rPr>
             <w:rStyle w:val="Hyperlink"/>
@@ -11059,8 +11067,8 @@
         </w:r>
       </w:hyperlink>
     </w:p>
-    <w:bookmarkEnd w:id="90"/>
-    <w:bookmarkStart w:id="91" w:name="ref-VisibleMeasurableImmediate"/>
+    <w:bookmarkEnd w:id="92"/>
+    <w:bookmarkStart w:id="93" w:name="ref-VisibleMeasurableImmediate"/>
     <w:p>
       <w:pPr>
         <w:pStyle w:val="Bibliography"/>
@@ -11138,8 +11146,8 @@
         <w:t xml:space="preserve">.</w:t>
       </w:r>
     </w:p>
-    <w:bookmarkEnd w:id="91"/>
-    <w:bookmarkStart w:id="93" w:name="ref-donthuHowConductBibliometric2021"/>
+    <w:bookmarkEnd w:id="93"/>
+    <w:bookmarkStart w:id="95" w:name="ref-donthuHowConductBibliometric2021"/>
     <w:p>
       <w:pPr>
         <w:pStyle w:val="Bibliography"/>
@@ -11188,7 +11196,7 @@
       <w:r>
         <w:t xml:space="preserve"> </w:t>
       </w:r>
-      <w:hyperlink r:id="rId92">
+      <w:hyperlink r:id="rId94">
         <w:r>
           <w:rPr>
             <w:rStyle w:val="Hyperlink"/>
@@ -11197,8 +11205,8 @@
         </w:r>
       </w:hyperlink>
     </w:p>
-    <w:bookmarkEnd w:id="93"/>
-    <w:bookmarkStart w:id="95" w:name="Xe2d6bc7484b7c2393b057240f09a7c5cc958e61"/>
+    <w:bookmarkEnd w:id="95"/>
+    <w:bookmarkStart w:id="97" w:name="Xe2d6bc7484b7c2393b057240f09a7c5cc958e61"/>
     <w:p>
       <w:pPr>
         <w:pStyle w:val="Bibliography"/>
@@ -11235,7 +11243,7 @@
       <w:r>
         <w:t xml:space="preserve"> </w:t>
       </w:r>
-      <w:hyperlink r:id="rId94">
+      <w:hyperlink r:id="rId96">
         <w:r>
           <w:rPr>
             <w:rStyle w:val="Hyperlink"/>
@@ -11244,8 +11252,8 @@
         </w:r>
       </w:hyperlink>
     </w:p>
-    <w:bookmarkEnd w:id="95"/>
-    <w:bookmarkStart w:id="97" w:name="Xe87f13889cec6d7c1674b0e46cf32c9a203961a"/>
+    <w:bookmarkEnd w:id="97"/>
+    <w:bookmarkStart w:id="99" w:name="Xe87f13889cec6d7c1674b0e46cf32c9a203961a"/>
     <w:p>
       <w:pPr>
         <w:pStyle w:val="Bibliography"/>
@@ -11324,7 +11332,7 @@
       <w:r>
         <w:t xml:space="preserve"> </w:t>
       </w:r>
-      <w:hyperlink r:id="rId96">
+      <w:hyperlink r:id="rId98">
         <w:r>
           <w:rPr>
             <w:rStyle w:val="Hyperlink"/>
@@ -11333,8 +11341,8 @@
         </w:r>
       </w:hyperlink>
     </w:p>
-    <w:bookmarkEnd w:id="97"/>
-    <w:bookmarkStart w:id="99" w:name="ref-fischerReuseNeedlePay2024"/>
+    <w:bookmarkEnd w:id="99"/>
+    <w:bookmarkStart w:id="101" w:name="ref-fischerReuseNeedlePay2024"/>
     <w:p>
       <w:pPr>
         <w:pStyle w:val="Bibliography"/>
@@ -11407,7 +11415,7 @@
       <w:r>
         <w:t xml:space="preserve"> </w:t>
       </w:r>
-      <w:hyperlink r:id="rId98">
+      <w:hyperlink r:id="rId100">
         <w:r>
           <w:rPr>
             <w:rStyle w:val="Hyperlink"/>
@@ -11416,8 +11424,8 @@
         </w:r>
       </w:hyperlink>
     </w:p>
-    <w:bookmarkEnd w:id="99"/>
-    <w:bookmarkStart w:id="101" w:name="X18974fea3fe182b56cf39c321495ac6ff97ecd7"/>
+    <w:bookmarkEnd w:id="101"/>
+    <w:bookmarkStart w:id="103" w:name="X18974fea3fe182b56cf39c321495ac6ff97ecd7"/>
     <w:p>
       <w:pPr>
         <w:pStyle w:val="Bibliography"/>
@@ -11475,7 +11483,7 @@
       <w:r>
         <w:t xml:space="preserve"> </w:t>
       </w:r>
-      <w:hyperlink r:id="rId100">
+      <w:hyperlink r:id="rId102">
         <w:r>
           <w:rPr>
             <w:rStyle w:val="Hyperlink"/>
@@ -11484,8 +11492,8 @@
         </w:r>
       </w:hyperlink>
     </w:p>
-    <w:bookmarkEnd w:id="101"/>
-    <w:bookmarkStart w:id="103" w:name="ref-grewalHowGenerativeAI2025"/>
+    <w:bookmarkEnd w:id="103"/>
+    <w:bookmarkStart w:id="105" w:name="ref-grewalHowGenerativeAI2025"/>
     <w:p>
       <w:pPr>
         <w:pStyle w:val="Bibliography"/>
@@ -11534,7 +11542,7 @@
       <w:r>
         <w:t xml:space="preserve"> </w:t>
       </w:r>
-      <w:hyperlink r:id="rId102">
+      <w:hyperlink r:id="rId104">
         <w:r>
           <w:rPr>
             <w:rStyle w:val="Hyperlink"/>
@@ -11543,8 +11551,8 @@
         </w:r>
       </w:hyperlink>
     </w:p>
-    <w:bookmarkEnd w:id="103"/>
-    <w:bookmarkStart w:id="105" w:name="ref-hoffmanRiseNewTechnologies2022"/>
+    <w:bookmarkEnd w:id="105"/>
+    <w:bookmarkStart w:id="107" w:name="ref-hoffmanRiseNewTechnologies2022"/>
     <w:p>
       <w:pPr>
         <w:pStyle w:val="Bibliography"/>
@@ -11635,7 +11643,7 @@
       <w:r>
         <w:t xml:space="preserve"> </w:t>
       </w:r>
-      <w:hyperlink r:id="rId104">
+      <w:hyperlink r:id="rId106">
         <w:r>
           <w:rPr>
             <w:rStyle w:val="Hyperlink"/>
@@ -11644,8 +11652,8 @@
         </w:r>
       </w:hyperlink>
     </w:p>
-    <w:bookmarkEnd w:id="105"/>
-    <w:bookmarkStart w:id="107" w:name="ref-huChatGPTSetsRecord2023"/>
+    <w:bookmarkEnd w:id="107"/>
+    <w:bookmarkStart w:id="109" w:name="ref-huChatGPTSetsRecord2023"/>
     <w:p>
       <w:pPr>
         <w:pStyle w:val="Bibliography"/>
@@ -11681,7 +11689,7 @@
       <w:r>
         <w:t xml:space="preserve"> </w:t>
       </w:r>
-      <w:hyperlink r:id="rId106">
+      <w:hyperlink r:id="rId108">
         <w:r>
           <w:rPr>
             <w:rStyle w:val="Hyperlink"/>
@@ -11690,8 +11698,8 @@
         </w:r>
       </w:hyperlink>
     </w:p>
-    <w:bookmarkEnd w:id="107"/>
-    <w:bookmarkStart w:id="109" w:name="X4bfed5635d964a1a6a21f3afa9bf4834a89002d"/>
+    <w:bookmarkEnd w:id="109"/>
+    <w:bookmarkStart w:id="111" w:name="X4bfed5635d964a1a6a21f3afa9bf4834a89002d"/>
     <w:p>
       <w:pPr>
         <w:pStyle w:val="Bibliography"/>
@@ -11752,7 +11760,7 @@
       <w:r>
         <w:t xml:space="preserve"> </w:t>
       </w:r>
-      <w:hyperlink r:id="rId108">
+      <w:hyperlink r:id="rId110">
         <w:r>
           <w:rPr>
             <w:rStyle w:val="Hyperlink"/>
@@ -11761,8 +11769,8 @@
         </w:r>
       </w:hyperlink>
     </w:p>
-    <w:bookmarkEnd w:id="109"/>
-    <w:bookmarkStart w:id="111" w:name="X7433f4f71f98d02ca93f48fa89ef156863d0469"/>
+    <w:bookmarkEnd w:id="111"/>
+    <w:bookmarkStart w:id="113" w:name="X7433f4f71f98d02ca93f48fa89ef156863d0469"/>
     <w:p>
       <w:pPr>
         <w:pStyle w:val="Bibliography"/>
@@ -11823,7 +11831,7 @@
       <w:r>
         <w:t xml:space="preserve"> </w:t>
       </w:r>
-      <w:hyperlink r:id="rId110">
+      <w:hyperlink r:id="rId112">
         <w:r>
           <w:rPr>
             <w:rStyle w:val="Hyperlink"/>
@@ -11832,8 +11840,8 @@
         </w:r>
       </w:hyperlink>
     </w:p>
-    <w:bookmarkEnd w:id="111"/>
-    <w:bookmarkStart w:id="113" w:name="ref-kennedyHowAmericansView2025"/>
+    <w:bookmarkEnd w:id="113"/>
+    <w:bookmarkStart w:id="115" w:name="ref-kennedyHowAmericansView2025"/>
     <w:p>
       <w:pPr>
         <w:pStyle w:val="Bibliography"/>
@@ -11955,7 +11963,7 @@
       <w:r>
         <w:t xml:space="preserve"> </w:t>
       </w:r>
-      <w:hyperlink r:id="rId112">
+      <w:hyperlink r:id="rId114">
         <w:r>
           <w:rPr>
             <w:rStyle w:val="Hyperlink"/>
@@ -11964,8 +11972,8 @@
         </w:r>
       </w:hyperlink>
     </w:p>
-    <w:bookmarkEnd w:id="113"/>
-    <w:bookmarkStart w:id="115" w:name="ref-kirkWhyHumanAI2025"/>
+    <w:bookmarkEnd w:id="115"/>
+    <w:bookmarkStart w:id="117" w:name="ref-kirkWhyHumanAI2025"/>
     <w:p>
       <w:pPr>
         <w:pStyle w:val="Bibliography"/>
@@ -12011,7 +12019,7 @@
       <w:r>
         <w:t xml:space="preserve"> </w:t>
       </w:r>
-      <w:hyperlink r:id="rId114">
+      <w:hyperlink r:id="rId116">
         <w:r>
           <w:rPr>
             <w:rStyle w:val="Hyperlink"/>
@@ -12020,8 +12028,8 @@
         </w:r>
       </w:hyperlink>
     </w:p>
-    <w:bookmarkEnd w:id="115"/>
-    <w:bookmarkStart w:id="116" w:name="X1ee6c0be2793064c85ed6527d182657f89961b8"/>
+    <w:bookmarkEnd w:id="117"/>
+    <w:bookmarkStart w:id="118" w:name="X1ee6c0be2793064c85ed6527d182657f89961b8"/>
     <w:p>
       <w:pPr>
         <w:pStyle w:val="Bibliography"/>
@@ -12046,8 +12054,8 @@
         <w:t xml:space="preserve">(Vol. 1, pp. 281–297). University of California Press.</w:t>
       </w:r>
     </w:p>
-    <w:bookmarkEnd w:id="116"/>
-    <w:bookmarkStart w:id="118" w:name="ref-malterPresentFutureConsumer2020"/>
+    <w:bookmarkEnd w:id="118"/>
+    <w:bookmarkStart w:id="120" w:name="ref-malterPresentFutureConsumer2020"/>
     <w:p>
       <w:pPr>
         <w:pStyle w:val="Bibliography"/>
@@ -12084,7 +12092,7 @@
       <w:r>
         <w:t xml:space="preserve"> </w:t>
       </w:r>
-      <w:hyperlink r:id="rId117">
+      <w:hyperlink r:id="rId119">
         <w:r>
           <w:rPr>
             <w:rStyle w:val="Hyperlink"/>
@@ -12093,8 +12101,8 @@
         </w:r>
       </w:hyperlink>
     </w:p>
-    <w:bookmarkEnd w:id="118"/>
-    <w:bookmarkStart w:id="120" w:name="ref-mcinnesUMAPUniformManifold2018"/>
+    <w:bookmarkEnd w:id="120"/>
+    <w:bookmarkStart w:id="122" w:name="ref-mcinnesUMAPUniformManifold2018"/>
     <w:p>
       <w:pPr>
         <w:pStyle w:val="Bibliography"/>
@@ -12161,7 +12169,7 @@
       <w:r>
         <w:t xml:space="preserve"> </w:t>
       </w:r>
-      <w:hyperlink r:id="rId119">
+      <w:hyperlink r:id="rId121">
         <w:r>
           <w:rPr>
             <w:rStyle w:val="Hyperlink"/>
@@ -12170,8 +12178,8 @@
         </w:r>
       </w:hyperlink>
     </w:p>
-    <w:bookmarkEnd w:id="120"/>
-    <w:bookmarkStart w:id="122" w:name="ref-mogajiHowGenerativeAI2024"/>
+    <w:bookmarkEnd w:id="122"/>
+    <w:bookmarkStart w:id="124" w:name="ref-mogajiHowGenerativeAI2024"/>
     <w:p>
       <w:pPr>
         <w:pStyle w:val="Bibliography"/>
@@ -12235,7 +12243,7 @@
       <w:r>
         <w:t xml:space="preserve"> </w:t>
       </w:r>
-      <w:hyperlink r:id="rId121">
+      <w:hyperlink r:id="rId123">
         <w:r>
           <w:rPr>
             <w:rStyle w:val="Hyperlink"/>
@@ -12244,8 +12252,8 @@
         </w:r>
       </w:hyperlink>
     </w:p>
-    <w:bookmarkEnd w:id="122"/>
-    <w:bookmarkStart w:id="124" w:name="ref-mollerImpactGenerativeAI2026"/>
+    <w:bookmarkEnd w:id="124"/>
+    <w:bookmarkStart w:id="126" w:name="ref-mollerImpactGenerativeAI2026"/>
     <w:p>
       <w:pPr>
         <w:pStyle w:val="Bibliography"/>
@@ -12294,7 +12302,7 @@
       <w:r>
         <w:t xml:space="preserve"> </w:t>
       </w:r>
-      <w:hyperlink r:id="rId123">
+      <w:hyperlink r:id="rId125">
         <w:r>
           <w:rPr>
             <w:rStyle w:val="Hyperlink"/>
@@ -12303,8 +12311,8 @@
         </w:r>
       </w:hyperlink>
     </w:p>
-    <w:bookmarkEnd w:id="124"/>
-    <w:bookmarkStart w:id="126" w:name="ref-moschellaAIMuchMore2025"/>
+    <w:bookmarkEnd w:id="126"/>
+    <w:bookmarkStart w:id="128" w:name="ref-moschellaAIMuchMore2025"/>
     <w:p>
       <w:pPr>
         <w:pStyle w:val="Bibliography"/>
@@ -12328,7 +12336,7 @@
       <w:r>
         <w:t xml:space="preserve"> </w:t>
       </w:r>
-      <w:hyperlink r:id="rId125">
+      <w:hyperlink r:id="rId127">
         <w:r>
           <w:rPr>
             <w:rStyle w:val="Hyperlink"/>
@@ -12337,8 +12345,8 @@
         </w:r>
       </w:hyperlink>
     </w:p>
-    <w:bookmarkEnd w:id="126"/>
-    <w:bookmarkStart w:id="128" w:name="ref-muzumdarDeadInternetTheory2025"/>
+    <w:bookmarkEnd w:id="128"/>
+    <w:bookmarkStart w:id="130" w:name="ref-muzumdarDeadInternetTheory2025"/>
     <w:p>
       <w:pPr>
         <w:pStyle w:val="Bibliography"/>
@@ -12429,7 +12437,7 @@
       <w:r>
         <w:t xml:space="preserve"> </w:t>
       </w:r>
-      <w:hyperlink r:id="rId127">
+      <w:hyperlink r:id="rId129">
         <w:r>
           <w:rPr>
             <w:rStyle w:val="Hyperlink"/>
@@ -12438,8 +12446,8 @@
         </w:r>
       </w:hyperlink>
     </w:p>
-    <w:bookmarkEnd w:id="128"/>
-    <w:bookmarkStart w:id="130" w:name="ref-openai2022chatgpt"/>
+    <w:bookmarkEnd w:id="130"/>
+    <w:bookmarkStart w:id="132" w:name="ref-openai2022chatgpt"/>
     <w:p>
       <w:pPr>
         <w:pStyle w:val="Bibliography"/>
@@ -12477,7 +12485,7 @@
       <w:r>
         <w:t xml:space="preserve"> </w:t>
       </w:r>
-      <w:hyperlink r:id="rId129">
+      <w:hyperlink r:id="rId131">
         <w:r>
           <w:rPr>
             <w:rStyle w:val="Hyperlink"/>
@@ -12486,8 +12494,8 @@
         </w:r>
       </w:hyperlink>
     </w:p>
-    <w:bookmarkEnd w:id="130"/>
-    <w:bookmarkStart w:id="132" w:name="ref-ramanUnveilingDynamicsAI2024"/>
+    <w:bookmarkEnd w:id="132"/>
+    <w:bookmarkStart w:id="134" w:name="ref-ramanUnveilingDynamicsAI2024"/>
     <w:p>
       <w:pPr>
         <w:pStyle w:val="Bibliography"/>
@@ -12560,7 +12568,7 @@
       <w:r>
         <w:t xml:space="preserve"> </w:t>
       </w:r>
-      <w:hyperlink r:id="rId131">
+      <w:hyperlink r:id="rId133">
         <w:r>
           <w:rPr>
             <w:rStyle w:val="Hyperlink"/>
@@ -12569,8 +12577,8 @@
         </w:r>
       </w:hyperlink>
     </w:p>
-    <w:bookmarkEnd w:id="132"/>
-    <w:bookmarkStart w:id="134" w:name="ref-reimers2019sentencebert"/>
+    <w:bookmarkEnd w:id="134"/>
+    <w:bookmarkStart w:id="136" w:name="ref-reimers2019sentencebert"/>
     <w:p>
       <w:pPr>
         <w:pStyle w:val="Bibliography"/>
@@ -12621,7 +12629,7 @@
       <w:r>
         <w:t xml:space="preserve"> </w:t>
       </w:r>
-      <w:hyperlink r:id="rId133">
+      <w:hyperlink r:id="rId135">
         <w:r>
           <w:rPr>
             <w:rStyle w:val="Hyperlink"/>
@@ -12630,8 +12638,8 @@
         </w:r>
       </w:hyperlink>
     </w:p>
-    <w:bookmarkEnd w:id="134"/>
-    <w:bookmarkStart w:id="136" w:name="ref-riandhiAIConsumerBehavior2025"/>
+    <w:bookmarkEnd w:id="136"/>
+    <w:bookmarkStart w:id="138" w:name="ref-riandhiAIConsumerBehavior2025"/>
     <w:p>
       <w:pPr>
         <w:pStyle w:val="Bibliography"/>
@@ -12689,7 +12697,7 @@
       <w:r>
         <w:t xml:space="preserve"> </w:t>
       </w:r>
-      <w:hyperlink r:id="rId135">
+      <w:hyperlink r:id="rId137">
         <w:r>
           <w:rPr>
             <w:rStyle w:val="Hyperlink"/>
@@ -12698,14 +12706,17 @@
         </w:r>
       </w:hyperlink>
     </w:p>
-    <w:bookmarkEnd w:id="136"/>
-    <w:bookmarkStart w:id="138" w:name="ref-roberts2021mediacloud"/>
+    <w:bookmarkEnd w:id="138"/>
+    <w:bookmarkStart w:id="140" w:name="ref-roberts2021mediacloud"/>
     <w:p>
       <w:pPr>
         <w:pStyle w:val="Bibliography"/>
       </w:pPr>
       <w:r>
-        <w:t xml:space="preserve">Roberts, H., Bhargava, R., Valiukas, L., Jen, D., Malik, M. M., Bishop, C. S., Ndulue, E. B., Dave, A., Clark, J., Etling, B., et al. (2021). Media cloud:</w:t>
+        <w:t xml:space="preserve">Roberts, H., Bhargava, R., Valiukas, L., Jen, D., Malik, M. M., Bishop, C. S., Ndulue, E. B., Dave, A., Clark, J., Etling, B., et al.</w:t>
+      </w:r>
+      <w:r>
+        <w:t xml:space="preserve"> (2021). Media cloud:</w:t>
       </w:r>
       <w:r>
         <w:t xml:space="preserve"> </w:t>
@@ -12776,7 +12787,7 @@
       <w:r>
         <w:t xml:space="preserve"> </w:t>
       </w:r>
-      <w:hyperlink r:id="rId137">
+      <w:hyperlink r:id="rId139">
         <w:r>
           <w:rPr>
             <w:rStyle w:val="Hyperlink"/>
@@ -12785,8 +12796,8 @@
         </w:r>
       </w:hyperlink>
     </w:p>
-    <w:bookmarkEnd w:id="138"/>
-    <w:bookmarkStart w:id="140" w:name="ref-roggenkampEXPRESSDICEAdvancing2025"/>
+    <w:bookmarkEnd w:id="140"/>
+    <w:bookmarkStart w:id="142" w:name="ref-roggenkampEXPRESSDICEAdvancing2025"/>
     <w:p>
       <w:pPr>
         <w:pStyle w:val="Bibliography"/>
@@ -12849,7 +12860,7 @@
       <w:r>
         <w:t xml:space="preserve"> </w:t>
       </w:r>
-      <w:hyperlink r:id="rId139">
+      <w:hyperlink r:id="rId141">
         <w:r>
           <w:rPr>
             <w:rStyle w:val="Hyperlink"/>
@@ -12858,8 +12869,8 @@
         </w:r>
       </w:hyperlink>
     </w:p>
-    <w:bookmarkEnd w:id="140"/>
-    <w:bookmarkStart w:id="142" w:name="ref-rousseeuwSilhouettesGraphicalAid1987"/>
+    <w:bookmarkEnd w:id="142"/>
+    <w:bookmarkStart w:id="144" w:name="ref-rousseeuwSilhouettesGraphicalAid1987"/>
     <w:p>
       <w:pPr>
         <w:pStyle w:val="Bibliography"/>
@@ -12908,7 +12919,7 @@
       <w:r>
         <w:t xml:space="preserve"> </w:t>
       </w:r>
-      <w:hyperlink r:id="rId141">
+      <w:hyperlink r:id="rId143">
         <w:r>
           <w:rPr>
             <w:rStyle w:val="Hyperlink"/>
@@ -12917,8 +12928,8 @@
         </w:r>
       </w:hyperlink>
     </w:p>
-    <w:bookmarkEnd w:id="142"/>
-    <w:bookmarkStart w:id="144" w:name="ref-scheufeleFramingTheoryMedia1999"/>
+    <w:bookmarkEnd w:id="144"/>
+    <w:bookmarkStart w:id="146" w:name="ref-scheufeleFramingTheoryMedia1999"/>
     <w:p>
       <w:pPr>
         <w:pStyle w:val="Bibliography"/>
@@ -12976,7 +12987,7 @@
       <w:r>
         <w:t xml:space="preserve"> </w:t>
       </w:r>
-      <w:hyperlink r:id="rId143">
+      <w:hyperlink r:id="rId145">
         <w:r>
           <w:rPr>
             <w:rStyle w:val="Hyperlink"/>
@@ -12985,8 +12996,8 @@
         </w:r>
       </w:hyperlink>
     </w:p>
-    <w:bookmarkEnd w:id="144"/>
-    <w:bookmarkStart w:id="146" w:name="ref-MostVisitedWebsites"/>
+    <w:bookmarkEnd w:id="146"/>
+    <w:bookmarkStart w:id="148" w:name="ref-MostVisitedWebsites"/>
     <w:p>
       <w:pPr>
         <w:pStyle w:val="Bibliography"/>
@@ -13108,7 +13119,7 @@
       <w:r>
         <w:t xml:space="preserve"> </w:t>
       </w:r>
-      <w:hyperlink r:id="rId145">
+      <w:hyperlink r:id="rId147">
         <w:r>
           <w:rPr>
             <w:rStyle w:val="Hyperlink"/>
@@ -13117,8 +13128,8 @@
         </w:r>
       </w:hyperlink>
     </w:p>
-    <w:bookmarkEnd w:id="146"/>
-    <w:bookmarkStart w:id="148" w:name="ref-sentenceTransformersAllMiniLML6v2"/>
+    <w:bookmarkEnd w:id="148"/>
+    <w:bookmarkStart w:id="150" w:name="ref-sentenceTransformersAllMiniLML6v2"/>
     <w:p>
       <w:pPr>
         <w:pStyle w:val="Bibliography"/>
@@ -13149,7 +13160,7 @@
       <w:r>
         <w:t xml:space="preserve"> </w:t>
       </w:r>
-      <w:hyperlink r:id="rId147">
+      <w:hyperlink r:id="rId149">
         <w:r>
           <w:rPr>
             <w:rStyle w:val="Hyperlink"/>
@@ -13158,8 +13169,8 @@
         </w:r>
       </w:hyperlink>
     </w:p>
-    <w:bookmarkEnd w:id="148"/>
-    <w:bookmarkStart w:id="150" w:name="ref-smallCOCITATIONCONTEXTANALYSIS1980"/>
+    <w:bookmarkEnd w:id="150"/>
+    <w:bookmarkStart w:id="152" w:name="ref-smallCOCITATIONCONTEXTANALYSIS1980"/>
     <w:p>
       <w:pPr>
         <w:pStyle w:val="Bibliography"/>
@@ -13211,7 +13222,7 @@
       <w:r>
         <w:t xml:space="preserve"> </w:t>
       </w:r>
-      <w:hyperlink r:id="rId149">
+      <w:hyperlink r:id="rId151">
         <w:r>
           <w:rPr>
             <w:rStyle w:val="Hyperlink"/>
@@ -13220,8 +13231,8 @@
         </w:r>
       </w:hyperlink>
     </w:p>
-    <w:bookmarkEnd w:id="150"/>
-    <w:bookmarkStart w:id="151" w:name="ref-aigeneratedalgorithm2026"/>
+    <w:bookmarkEnd w:id="152"/>
+    <w:bookmarkStart w:id="153" w:name="ref-aigeneratedalgorithm2026"/>
     <w:p>
       <w:pPr>
         <w:pStyle w:val="Bibliography"/>
@@ -13252,8 +13263,8 @@
         <w:t xml:space="preserve">.</w:t>
       </w:r>
     </w:p>
-    <w:bookmarkEnd w:id="151"/>
-    <w:bookmarkStart w:id="153" w:name="X19b8dd2f280f6120269f36e58656b3b5b75516c"/>
+    <w:bookmarkEnd w:id="153"/>
+    <w:bookmarkStart w:id="155" w:name="X19b8dd2f280f6120269f36e58656b3b5b75516c"/>
     <w:p>
       <w:pPr>
         <w:pStyle w:val="Bibliography"/>
@@ -13366,7 +13377,7 @@
       <w:r>
         <w:t xml:space="preserve"> </w:t>
       </w:r>
-      <w:hyperlink r:id="rId152">
+      <w:hyperlink r:id="rId154">
         <w:r>
           <w:rPr>
             <w:rStyle w:val="Hyperlink"/>
@@ -13375,8 +13386,8 @@
         </w:r>
       </w:hyperlink>
     </w:p>
-    <w:bookmarkEnd w:id="153"/>
-    <w:bookmarkStart w:id="155" w:name="ref-wangEditorialChangingLandscape2026"/>
+    <w:bookmarkEnd w:id="155"/>
+    <w:bookmarkStart w:id="157" w:name="ref-wangEditorialChangingLandscape2026"/>
     <w:p>
       <w:pPr>
         <w:pStyle w:val="Bibliography"/>
@@ -13437,7 +13448,7 @@
       <w:r>
         <w:t xml:space="preserve"> </w:t>
       </w:r>
-      <w:hyperlink r:id="rId154">
+      <w:hyperlink r:id="rId156">
         <w:r>
           <w:rPr>
             <w:rStyle w:val="Hyperlink"/>
@@ -13446,8 +13457,8 @@
         </w:r>
       </w:hyperlink>
     </w:p>
-    <w:bookmarkEnd w:id="155"/>
-    <w:bookmarkStart w:id="156" w:name="ref-wang2020minilm"/>
+    <w:bookmarkEnd w:id="157"/>
+    <w:bookmarkStart w:id="158" w:name="ref-wang2020minilm"/>
     <w:p>
       <w:pPr>
         <w:pStyle w:val="Bibliography"/>
@@ -13503,8 +13514,8 @@
         <w:t xml:space="preserve">, 5776–5788.</w:t>
       </w:r>
     </w:p>
-    <w:bookmarkEnd w:id="156"/>
-    <w:bookmarkStart w:id="158" w:name="ref-winderBiasedEchoesLarge2025"/>
+    <w:bookmarkEnd w:id="158"/>
+    <w:bookmarkStart w:id="160" w:name="ref-winderBiasedEchoesLarge2025"/>
     <w:p>
       <w:pPr>
         <w:pStyle w:val="Bibliography"/>
@@ -13553,7 +13564,7 @@
       <w:r>
         <w:t xml:space="preserve"> </w:t>
       </w:r>
-      <w:hyperlink r:id="rId157">
+      <w:hyperlink r:id="rId159">
         <w:r>
           <w:rPr>
             <w:rStyle w:val="Hyperlink"/>
@@ -13562,8 +13573,8 @@
         </w:r>
       </w:hyperlink>
     </w:p>
-    <w:bookmarkEnd w:id="158"/>
-    <w:bookmarkStart w:id="160" w:name="ref-wulffEscapingJingleJangleJungle2026"/>
+    <w:bookmarkEnd w:id="160"/>
+    <w:bookmarkStart w:id="162" w:name="ref-wulffEscapingJingleJangleJungle2026"/>
     <w:p>
       <w:pPr>
         <w:pStyle w:val="Bibliography"/>
@@ -13630,7 +13641,7 @@
       <w:r>
         <w:t xml:space="preserve"> </w:t>
       </w:r>
-      <w:hyperlink r:id="rId159">
+      <w:hyperlink r:id="rId161">
         <w:r>
           <w:rPr>
             <w:rStyle w:val="Hyperlink"/>
@@ -13639,8 +13650,8 @@
         </w:r>
       </w:hyperlink>
     </w:p>
-    <w:bookmarkEnd w:id="160"/>
-    <w:bookmarkStart w:id="162" w:name="ref-zacharyAIRevolutionLatest2026"/>
+    <w:bookmarkEnd w:id="162"/>
+    <w:bookmarkStart w:id="164" w:name="ref-zacharyAIRevolutionLatest2026"/>
     <w:p>
       <w:pPr>
         <w:pStyle w:val="Bibliography"/>
@@ -13769,7 +13780,7 @@
       <w:r>
         <w:t xml:space="preserve"> </w:t>
       </w:r>
-      <w:hyperlink r:id="rId161">
+      <w:hyperlink r:id="rId163">
         <w:r>
           <w:rPr>
             <w:rStyle w:val="Hyperlink"/>
@@ -13778,16 +13789,16 @@
         </w:r>
       </w:hyperlink>
     </w:p>
-    <w:bookmarkEnd w:id="162"/>
-    <w:bookmarkEnd w:id="163"/>
     <w:bookmarkEnd w:id="164"/>
+    <w:bookmarkEnd w:id="165"/>
+    <w:bookmarkEnd w:id="166"/>
     <w:sectPr>
-      <w:headerReference r:id="rId9" w:type="even"/>
-      <w:headerReference r:id="rId11" w:type="default"/>
-      <w:footerReference r:id="rId14" w:type="even"/>
-      <w:footerReference r:id="rId13" w:type="default"/>
-      <w:headerReference r:id="rId10" w:type="first"/>
-      <w:footerReference r:id="rId12" w:type="first"/>
+      <w:headerReference r:id="rId8" w:type="even"/>
+      <w:headerReference r:id="rId9" w:type="default"/>
+      <w:footerReference r:id="rId10" w:type="even"/>
+      <w:footerReference r:id="rId11" w:type="default"/>
+      <w:headerReference r:id="rId12" w:type="first"/>
+      <w:footerReference r:id="rId13" w:type="first"/>
       <w:pgSz w:h="15840" w:w="12240"/>
       <w:pgMar w:bottom="1440" w:footer="720" w:gutter="0" w:header="720" w:left="1440" w:right="1440" w:top="1440"/>
       <w:cols w:space="720"/>
@@ -13846,7 +13857,7 @@
       </w:r>
     </w:p>
   </w:footnote>
-  <w:footnote w:id="33">
+  <w:footnote w:id="35">
     <w:p>
       <w:pPr>
         <w:pStyle w:val="FootnoteText"/>

</xml_diff>

<commit_message>
Publish website from 5a4b591
</commit_message>
<xml_diff>
--- a/99_writing/mapping-the-field-manuscript.docx
+++ b/99_writing/mapping-the-field-manuscript.docx
@@ -2709,7 +2709,7 @@
     </w:p>
     <w:bookmarkEnd w:id="37"/>
     <w:bookmarkEnd w:id="38"/>
-    <w:bookmarkStart w:id="69" w:name="results"/>
+    <w:bookmarkStart w:id="71" w:name="results"/>
     <w:p>
       <w:pPr>
         <w:pStyle w:val="Heading1"/>
@@ -6539,7 +6539,7 @@
     </w:p>
     <w:bookmarkEnd w:id="58"/>
     <w:bookmarkEnd w:id="59"/>
-    <w:bookmarkStart w:id="68" w:name="sec-analysis-3"/>
+    <w:bookmarkStart w:id="70" w:name="sec-analysis-3"/>
     <w:p>
       <w:pPr>
         <w:pStyle w:val="Heading2"/>
@@ -6556,7 +6556,7 @@
         <w:t xml:space="preserve">In Analysis 3, we contrast the academic attention devoted to consumer technologies with the media attention devoted to these same technologies. Our goal in this study is to identify and quantify the relationship between interests in research, and what concerns the public.</w:t>
       </w:r>
     </w:p>
-    <w:bookmarkStart w:id="66" w:name="the-field-at-large-2"/>
+    <w:bookmarkStart w:id="68" w:name="the-field-at-large-2"/>
     <w:p>
       <w:pPr>
         <w:pStyle w:val="Heading3"/>
@@ -6648,79 +6648,7 @@
         <w:t xml:space="preserve"> </w:t>
       </w:r>
       <w:r>
-        <w:t xml:space="preserve">unique media titles. Across all sixteen technology clusters, academic attention is spread differently from media attention (</w:t>
-      </w:r>
-      <m:oMath>
-        <m:r>
-          <m:t>G</m:t>
-        </m:r>
-        <m:r>
-          <m:rPr>
-            <m:sty m:val="p"/>
-          </m:rPr>
-          <m:t>(</m:t>
-        </m:r>
-        <m:r>
-          <m:t>15</m:t>
-        </m:r>
-        <m:r>
-          <m:rPr>
-            <m:sty m:val="p"/>
-          </m:rPr>
-          <m:t>)</m:t>
-        </m:r>
-        <m:r>
-          <m:rPr>
-            <m:sty m:val="p"/>
-          </m:rPr>
-          <m:t>=</m:t>
-        </m:r>
-        <m:r>
-          <m:t>1033.62</m:t>
-        </m:r>
-      </m:oMath>
-      <w:r>
-        <w:t xml:space="preserve">,</w:t>
-      </w:r>
-      <w:r>
-        <w:t xml:space="preserve"> </w:t>
-      </w:r>
-      <m:oMath>
-        <m:r>
-          <m:t>p</m:t>
-        </m:r>
-        <m:r>
-          <m:rPr>
-            <m:sty m:val="p"/>
-          </m:rPr>
-          <m:t>&lt;</m:t>
-        </m:r>
-        <m:r>
-          <m:t>.001</m:t>
-        </m:r>
-      </m:oMath>
-      <w:r>
-        <w:t xml:space="preserve">,</w:t>
-      </w:r>
-      <w:r>
-        <w:t xml:space="preserve"> </w:t>
-      </w:r>
-      <m:oMath>
-        <m:r>
-          <m:t>w</m:t>
-        </m:r>
-        <m:r>
-          <m:rPr>
-            <m:sty m:val="p"/>
-          </m:rPr>
-          <m:t>=</m:t>
-        </m:r>
-        <m:r>
-          <m:t>.86</m:t>
-        </m:r>
-      </m:oMath>
-      <w:r>
-        <w:t xml:space="preserve">). Nine of the sixteen clusters hold a larger share in academic attention, seven in media attention. Measured in percentage points, the largest differences on the media side are Internet &amp; Broadcasting (</w:t>
+        <w:t xml:space="preserve">unique media titles. Across all sixteen technology clusters, academic attention is spread differently from media attention. Nine of the sixteen clusters hold a larger share in academic attention, seven in media attention. Measured in percentage points, the largest differences on the media side are Internet &amp; Broadcasting (</w:t>
       </w:r>
       <m:oMath>
         <m:r>
@@ -6805,7 +6733,24 @@
         <w:t xml:space="preserve"> </w:t>
       </w:r>
       <w:r>
-        <w:t xml:space="preserve">reports all clusters. All gaps diverge credibly from the media distribution, which is used as the prior. The gaps are not uniform across journals, since not all journals focus on the clusters equally.</w:t>
+        <w:t xml:space="preserve">and</w:t>
+      </w:r>
+      <w:r>
+        <w:t xml:space="preserve"> </w:t>
+      </w:r>
+      <w:hyperlink w:anchor="tbl-coverage-gap">
+        <w:r>
+          <w:rPr>
+            <w:rStyle w:val="Hyperlink"/>
+          </w:rPr>
+          <w:t xml:space="preserve">Table 3</w:t>
+        </w:r>
+      </w:hyperlink>
+      <w:r>
+        <w:t xml:space="preserve"> </w:t>
+      </w:r>
+      <w:r>
+        <w:t xml:space="preserve">report all clusters. All gaps diverge credibly from the media distribution, which is used as the prior. The gaps are not uniform across journals, since not all journals focus on the clusters equally.</w:t>
       </w:r>
     </w:p>
     <w:p>
@@ -6874,7 +6819,7 @@
           <w:rPr>
             <w:rStyle w:val="Hyperlink"/>
           </w:rPr>
-          <w:t xml:space="preserve">Table 3</w:t>
+          <w:t xml:space="preserve">Table 4</w:t>
         </w:r>
       </w:hyperlink>
       <w:r>
@@ -7007,10 +6952,13 @@
     <w:bookmarkEnd w:id="63"/>
     <w:p>
       <w:pPr>
-        <w:sectPr/>
-      </w:pPr>
+        <w:pStyle w:val="AfterWithoutNote"/>
+      </w:pPr>
+      <w:r>
+        <w:t xml:space="preserve"> </w:t>
+      </w:r>
     </w:p>
-    <w:bookmarkStart w:id="65" w:name="tbl-lag-pvalues"/>
+    <w:bookmarkStart w:id="65" w:name="tbl-coverage-gap"/>
     <w:p>
       <w:pPr>
         <w:pStyle w:val="FigureTitle"/>
@@ -7024,10 +6972,1295 @@
         <w:pStyle w:val="Caption"/>
       </w:pPr>
       <w:r>
+        <w:t xml:space="preserve">Academic and media attention to consumer-technology clusters, 2008–2026. Academic share and media share are the pooled share of attention that each cluster received within all consumer-technology mentions of its respective corpus, pooled across the whole period rather than averaged over years. The gap is the academic share minus the media share, in percentage points. The ratio divides each cluster’s share of all academic technology mentions by its share of all media technology mentions; values above 1 indicate a cluster that draws more academic than media attention and values below 1 the reverse. For each cluster we draw a Dirichlet posterior of the academic share vector, using the media distribution as the baseline; Credibly higher marks a cluster whose 95% credible interval for the academic-to-media ratio lies entirely above 1, Credibly lower one that lies entirely below it.</w:t>
+      </w:r>
+    </w:p>
+    <w:bookmarkStart w:id="64" w:name="tbl-coverage-gap"/>
+    <w:tbl>
+      <w:tblPr>
+        <w:tblStyle w:val="Table"/>
+        <w:tblW w:type="pct" w:w="5000"/>
+        <w:tblLayout w:type="fixed"/>
+        <w:tblLook w:firstRow="1" w:lastRow="0" w:firstColumn="0" w:lastColumn="0" w:noHBand="0" w:noVBand="0" w:val="0020"/>
+      </w:tblPr>
+      <w:tblGrid>
+        <w:gridCol w:w="990"/>
+        <w:gridCol w:w="1320"/>
+        <w:gridCol w:w="1320"/>
+        <w:gridCol w:w="1320"/>
+        <w:gridCol w:w="1320"/>
+        <w:gridCol w:w="1650"/>
+      </w:tblGrid>
+      <w:tr>
+        <w:trPr>
+          <w:tblHeader w:val="on"/>
+        </w:trPr>
+        <w:tc>
+          <w:tcPr/>
+          <w:p>
+            <w:pPr>
+              <w:pStyle w:val="Compact"/>
+            </w:pPr>
+            <w:r>
+              <w:t xml:space="preserve">Technology cluster</w:t>
+            </w:r>
+          </w:p>
+        </w:tc>
+        <w:tc>
+          <w:tcPr/>
+          <w:p>
+            <w:pPr>
+              <w:pStyle w:val="Compact"/>
+              <w:jc w:val="right"/>
+            </w:pPr>
+            <w:r>
+              <w:t xml:space="preserve">Academic share</w:t>
+            </w:r>
+          </w:p>
+        </w:tc>
+        <w:tc>
+          <w:tcPr/>
+          <w:p>
+            <w:pPr>
+              <w:pStyle w:val="Compact"/>
+              <w:jc w:val="right"/>
+            </w:pPr>
+            <w:r>
+              <w:t xml:space="preserve">Media share</w:t>
+            </w:r>
+          </w:p>
+        </w:tc>
+        <w:tc>
+          <w:tcPr/>
+          <w:p>
+            <w:pPr>
+              <w:pStyle w:val="Compact"/>
+              <w:jc w:val="right"/>
+            </w:pPr>
+            <w:r>
+              <w:t xml:space="preserve">Gap</w:t>
+            </w:r>
+          </w:p>
+        </w:tc>
+        <w:tc>
+          <w:tcPr/>
+          <w:p>
+            <w:pPr>
+              <w:pStyle w:val="Compact"/>
+              <w:jc w:val="right"/>
+            </w:pPr>
+            <w:r>
+              <w:t xml:space="preserve">Ratio</w:t>
+            </w:r>
+          </w:p>
+        </w:tc>
+        <w:tc>
+          <w:tcPr/>
+          <w:p>
+            <w:pPr>
+              <w:pStyle w:val="Compact"/>
+              <w:jc w:val="center"/>
+            </w:pPr>
+            <w:r>
+              <w:t xml:space="preserve">Mark</w:t>
+            </w:r>
+          </w:p>
+        </w:tc>
+      </w:tr>
+      <w:tr>
+        <w:tc>
+          <w:tcPr/>
+          <w:p>
+            <w:pPr>
+              <w:pStyle w:val="Compact"/>
+            </w:pPr>
+            <w:r>
+              <w:t xml:space="preserve">AR, VR &amp; Robots</w:t>
+            </w:r>
+          </w:p>
+        </w:tc>
+        <w:tc>
+          <w:tcPr/>
+          <w:p>
+            <w:pPr>
+              <w:pStyle w:val="Compact"/>
+              <w:jc w:val="right"/>
+            </w:pPr>
+            <w:r>
+              <w:t xml:space="preserve">3.72%</w:t>
+            </w:r>
+          </w:p>
+        </w:tc>
+        <w:tc>
+          <w:tcPr/>
+          <w:p>
+            <w:pPr>
+              <w:pStyle w:val="Compact"/>
+              <w:jc w:val="right"/>
+            </w:pPr>
+            <w:r>
+              <w:t xml:space="preserve">2.18%</w:t>
+            </w:r>
+          </w:p>
+        </w:tc>
+        <w:tc>
+          <w:tcPr/>
+          <w:p>
+            <w:pPr>
+              <w:pStyle w:val="Compact"/>
+              <w:jc w:val="right"/>
+            </w:pPr>
+            <w:r>
+              <w:t xml:space="preserve">+1.5</w:t>
+            </w:r>
+          </w:p>
+        </w:tc>
+        <w:tc>
+          <w:tcPr/>
+          <w:p>
+            <w:pPr>
+              <w:pStyle w:val="Compact"/>
+              <w:jc w:val="right"/>
+            </w:pPr>
+            <w:r>
+              <w:t xml:space="preserve">1.70</w:t>
+            </w:r>
+          </w:p>
+        </w:tc>
+        <w:tc>
+          <w:tcPr/>
+          <w:p>
+            <w:pPr>
+              <w:pStyle w:val="Compact"/>
+              <w:jc w:val="center"/>
+            </w:pPr>
+            <w:r>
+              <w:t xml:space="preserve">Credibly higher</w:t>
+            </w:r>
+          </w:p>
+        </w:tc>
+      </w:tr>
+      <w:tr>
+        <w:tc>
+          <w:tcPr/>
+          <w:p>
+            <w:pPr>
+              <w:pStyle w:val="Compact"/>
+            </w:pPr>
+            <w:r>
+              <w:t xml:space="preserve">Algorithms &amp; Recommendations</w:t>
+            </w:r>
+          </w:p>
+        </w:tc>
+        <w:tc>
+          <w:tcPr/>
+          <w:p>
+            <w:pPr>
+              <w:pStyle w:val="Compact"/>
+              <w:jc w:val="right"/>
+            </w:pPr>
+            <w:r>
+              <w:t xml:space="preserve">6.58%</w:t>
+            </w:r>
+          </w:p>
+        </w:tc>
+        <w:tc>
+          <w:tcPr/>
+          <w:p>
+            <w:pPr>
+              <w:pStyle w:val="Compact"/>
+              <w:jc w:val="right"/>
+            </w:pPr>
+            <w:r>
+              <w:t xml:space="preserve">1.32%</w:t>
+            </w:r>
+          </w:p>
+        </w:tc>
+        <w:tc>
+          <w:tcPr/>
+          <w:p>
+            <w:pPr>
+              <w:pStyle w:val="Compact"/>
+              <w:jc w:val="right"/>
+            </w:pPr>
+            <w:r>
+              <w:t xml:space="preserve">+5.3</w:t>
+            </w:r>
+          </w:p>
+        </w:tc>
+        <w:tc>
+          <w:tcPr/>
+          <w:p>
+            <w:pPr>
+              <w:pStyle w:val="Compact"/>
+              <w:jc w:val="right"/>
+            </w:pPr>
+            <w:r>
+              <w:t xml:space="preserve">4.97</w:t>
+            </w:r>
+          </w:p>
+        </w:tc>
+        <w:tc>
+          <w:tcPr/>
+          <w:p>
+            <w:pPr>
+              <w:pStyle w:val="Compact"/>
+              <w:jc w:val="center"/>
+            </w:pPr>
+            <w:r>
+              <w:t xml:space="preserve">Credibly higher</w:t>
+            </w:r>
+          </w:p>
+        </w:tc>
+      </w:tr>
+      <w:tr>
+        <w:tc>
+          <w:tcPr/>
+          <w:p>
+            <w:pPr>
+              <w:pStyle w:val="Compact"/>
+            </w:pPr>
+            <w:r>
+              <w:t xml:space="preserve">Auctions &amp; Pricing</w:t>
+            </w:r>
+          </w:p>
+        </w:tc>
+        <w:tc>
+          <w:tcPr/>
+          <w:p>
+            <w:pPr>
+              <w:pStyle w:val="Compact"/>
+              <w:jc w:val="right"/>
+            </w:pPr>
+            <w:r>
+              <w:t xml:space="preserve">1.29%</w:t>
+            </w:r>
+          </w:p>
+        </w:tc>
+        <w:tc>
+          <w:tcPr/>
+          <w:p>
+            <w:pPr>
+              <w:pStyle w:val="Compact"/>
+              <w:jc w:val="right"/>
+            </w:pPr>
+            <w:r>
+              <w:t xml:space="preserve">0.02%</w:t>
+            </w:r>
+          </w:p>
+        </w:tc>
+        <w:tc>
+          <w:tcPr/>
+          <w:p>
+            <w:pPr>
+              <w:pStyle w:val="Compact"/>
+              <w:jc w:val="right"/>
+            </w:pPr>
+            <w:r>
+              <w:t xml:space="preserve">+1.3</w:t>
+            </w:r>
+          </w:p>
+        </w:tc>
+        <w:tc>
+          <w:tcPr/>
+          <w:p>
+            <w:pPr>
+              <w:pStyle w:val="Compact"/>
+              <w:jc w:val="right"/>
+            </w:pPr>
+            <w:r>
+              <w:t xml:space="preserve">57.10</w:t>
+            </w:r>
+          </w:p>
+        </w:tc>
+        <w:tc>
+          <w:tcPr/>
+          <w:p>
+            <w:pPr>
+              <w:pStyle w:val="Compact"/>
+              <w:jc w:val="center"/>
+            </w:pPr>
+            <w:r>
+              <w:t xml:space="preserve">Credibly higher</w:t>
+            </w:r>
+          </w:p>
+        </w:tc>
+      </w:tr>
+      <w:tr>
+        <w:tc>
+          <w:tcPr/>
+          <w:p>
+            <w:pPr>
+              <w:pStyle w:val="Compact"/>
+            </w:pPr>
+            <w:r>
+              <w:t xml:space="preserve">Computers &amp; Software</w:t>
+            </w:r>
+          </w:p>
+        </w:tc>
+        <w:tc>
+          <w:tcPr/>
+          <w:p>
+            <w:pPr>
+              <w:pStyle w:val="Compact"/>
+              <w:jc w:val="right"/>
+            </w:pPr>
+            <w:r>
+              <w:t xml:space="preserve">7.01%</w:t>
+            </w:r>
+          </w:p>
+        </w:tc>
+        <w:tc>
+          <w:tcPr/>
+          <w:p>
+            <w:pPr>
+              <w:pStyle w:val="Compact"/>
+              <w:jc w:val="right"/>
+            </w:pPr>
+            <w:r>
+              <w:t xml:space="preserve">9.21%</w:t>
+            </w:r>
+          </w:p>
+        </w:tc>
+        <w:tc>
+          <w:tcPr/>
+          <w:p>
+            <w:pPr>
+              <w:pStyle w:val="Compact"/>
+              <w:jc w:val="right"/>
+            </w:pPr>
+            <w:r>
+              <w:t xml:space="preserve">-2.2</w:t>
+            </w:r>
+          </w:p>
+        </w:tc>
+        <w:tc>
+          <w:tcPr/>
+          <w:p>
+            <w:pPr>
+              <w:pStyle w:val="Compact"/>
+              <w:jc w:val="right"/>
+            </w:pPr>
+            <w:r>
+              <w:t xml:space="preserve">0.76</w:t>
+            </w:r>
+          </w:p>
+        </w:tc>
+        <w:tc>
+          <w:tcPr/>
+          <w:p>
+            <w:pPr>
+              <w:pStyle w:val="Compact"/>
+              <w:jc w:val="center"/>
+            </w:pPr>
+            <w:r>
+              <w:t xml:space="preserve">Credibly lower</w:t>
+            </w:r>
+          </w:p>
+        </w:tc>
+      </w:tr>
+      <w:tr>
+        <w:tc>
+          <w:tcPr/>
+          <w:p>
+            <w:pPr>
+              <w:pStyle w:val="Compact"/>
+            </w:pPr>
+            <w:r>
+              <w:t xml:space="preserve">Crypto &amp; Fintech</w:t>
+            </w:r>
+          </w:p>
+        </w:tc>
+        <w:tc>
+          <w:tcPr/>
+          <w:p>
+            <w:pPr>
+              <w:pStyle w:val="Compact"/>
+              <w:jc w:val="right"/>
+            </w:pPr>
+            <w:r>
+              <w:t xml:space="preserve">6.22%</w:t>
+            </w:r>
+          </w:p>
+        </w:tc>
+        <w:tc>
+          <w:tcPr/>
+          <w:p>
+            <w:pPr>
+              <w:pStyle w:val="Compact"/>
+              <w:jc w:val="right"/>
+            </w:pPr>
+            <w:r>
+              <w:t xml:space="preserve">3.15%</w:t>
+            </w:r>
+          </w:p>
+        </w:tc>
+        <w:tc>
+          <w:tcPr/>
+          <w:p>
+            <w:pPr>
+              <w:pStyle w:val="Compact"/>
+              <w:jc w:val="right"/>
+            </w:pPr>
+            <w:r>
+              <w:t xml:space="preserve">+3.1</w:t>
+            </w:r>
+          </w:p>
+        </w:tc>
+        <w:tc>
+          <w:tcPr/>
+          <w:p>
+            <w:pPr>
+              <w:pStyle w:val="Compact"/>
+              <w:jc w:val="right"/>
+            </w:pPr>
+            <w:r>
+              <w:t xml:space="preserve">1.97</w:t>
+            </w:r>
+          </w:p>
+        </w:tc>
+        <w:tc>
+          <w:tcPr/>
+          <w:p>
+            <w:pPr>
+              <w:pStyle w:val="Compact"/>
+              <w:jc w:val="center"/>
+            </w:pPr>
+            <w:r>
+              <w:t xml:space="preserve">Credibly higher</w:t>
+            </w:r>
+          </w:p>
+        </w:tc>
+      </w:tr>
+      <w:tr>
+        <w:tc>
+          <w:tcPr/>
+          <w:p>
+            <w:pPr>
+              <w:pStyle w:val="Compact"/>
+            </w:pPr>
+            <w:r>
+              <w:t xml:space="preserve">E-Commerce</w:t>
+            </w:r>
+          </w:p>
+        </w:tc>
+        <w:tc>
+          <w:tcPr/>
+          <w:p>
+            <w:pPr>
+              <w:pStyle w:val="Compact"/>
+              <w:jc w:val="right"/>
+            </w:pPr>
+            <w:r>
+              <w:t xml:space="preserve">4.51%</w:t>
+            </w:r>
+          </w:p>
+        </w:tc>
+        <w:tc>
+          <w:tcPr/>
+          <w:p>
+            <w:pPr>
+              <w:pStyle w:val="Compact"/>
+              <w:jc w:val="right"/>
+            </w:pPr>
+            <w:r>
+              <w:t xml:space="preserve">1.10%</w:t>
+            </w:r>
+          </w:p>
+        </w:tc>
+        <w:tc>
+          <w:tcPr/>
+          <w:p>
+            <w:pPr>
+              <w:pStyle w:val="Compact"/>
+              <w:jc w:val="right"/>
+            </w:pPr>
+            <w:r>
+              <w:t xml:space="preserve">+3.4</w:t>
+            </w:r>
+          </w:p>
+        </w:tc>
+        <w:tc>
+          <w:tcPr/>
+          <w:p>
+            <w:pPr>
+              <w:pStyle w:val="Compact"/>
+              <w:jc w:val="right"/>
+            </w:pPr>
+            <w:r>
+              <w:t xml:space="preserve">4.11</w:t>
+            </w:r>
+          </w:p>
+        </w:tc>
+        <w:tc>
+          <w:tcPr/>
+          <w:p>
+            <w:pPr>
+              <w:pStyle w:val="Compact"/>
+              <w:jc w:val="center"/>
+            </w:pPr>
+            <w:r>
+              <w:t xml:space="preserve">Credibly higher</w:t>
+            </w:r>
+          </w:p>
+        </w:tc>
+      </w:tr>
+      <w:tr>
+        <w:tc>
+          <w:tcPr/>
+          <w:p>
+            <w:pPr>
+              <w:pStyle w:val="Compact"/>
+            </w:pPr>
+            <w:r>
+              <w:t xml:space="preserve">Gaming &amp; Digital Platforms</w:t>
+            </w:r>
+          </w:p>
+        </w:tc>
+        <w:tc>
+          <w:tcPr/>
+          <w:p>
+            <w:pPr>
+              <w:pStyle w:val="Compact"/>
+              <w:jc w:val="right"/>
+            </w:pPr>
+            <w:r>
+              <w:t xml:space="preserve">7.15%</w:t>
+            </w:r>
+          </w:p>
+        </w:tc>
+        <w:tc>
+          <w:tcPr/>
+          <w:p>
+            <w:pPr>
+              <w:pStyle w:val="Compact"/>
+              <w:jc w:val="right"/>
+            </w:pPr>
+            <w:r>
+              <w:t xml:space="preserve">2.37%</w:t>
+            </w:r>
+          </w:p>
+        </w:tc>
+        <w:tc>
+          <w:tcPr/>
+          <w:p>
+            <w:pPr>
+              <w:pStyle w:val="Compact"/>
+              <w:jc w:val="right"/>
+            </w:pPr>
+            <w:r>
+              <w:t xml:space="preserve">+4.8</w:t>
+            </w:r>
+          </w:p>
+        </w:tc>
+        <w:tc>
+          <w:tcPr/>
+          <w:p>
+            <w:pPr>
+              <w:pStyle w:val="Compact"/>
+              <w:jc w:val="right"/>
+            </w:pPr>
+            <w:r>
+              <w:t xml:space="preserve">3.02</w:t>
+            </w:r>
+          </w:p>
+        </w:tc>
+        <w:tc>
+          <w:tcPr/>
+          <w:p>
+            <w:pPr>
+              <w:pStyle w:val="Compact"/>
+              <w:jc w:val="center"/>
+            </w:pPr>
+            <w:r>
+              <w:t xml:space="preserve">Credibly higher</w:t>
+            </w:r>
+          </w:p>
+        </w:tc>
+      </w:tr>
+      <w:tr>
+        <w:tc>
+          <w:tcPr/>
+          <w:p>
+            <w:pPr>
+              <w:pStyle w:val="Compact"/>
+            </w:pPr>
+            <w:r>
+              <w:t xml:space="preserve">Generative AI</w:t>
+            </w:r>
+          </w:p>
+        </w:tc>
+        <w:tc>
+          <w:tcPr/>
+          <w:p>
+            <w:pPr>
+              <w:pStyle w:val="Compact"/>
+              <w:jc w:val="right"/>
+            </w:pPr>
+            <w:r>
+              <w:t xml:space="preserve">15.52%</w:t>
+            </w:r>
+          </w:p>
+        </w:tc>
+        <w:tc>
+          <w:tcPr/>
+          <w:p>
+            <w:pPr>
+              <w:pStyle w:val="Compact"/>
+              <w:jc w:val="right"/>
+            </w:pPr>
+            <w:r>
+              <w:t xml:space="preserve">5.44%</w:t>
+            </w:r>
+          </w:p>
+        </w:tc>
+        <w:tc>
+          <w:tcPr/>
+          <w:p>
+            <w:pPr>
+              <w:pStyle w:val="Compact"/>
+              <w:jc w:val="right"/>
+            </w:pPr>
+            <w:r>
+              <w:t xml:space="preserve">+10.1</w:t>
+            </w:r>
+          </w:p>
+        </w:tc>
+        <w:tc>
+          <w:tcPr/>
+          <w:p>
+            <w:pPr>
+              <w:pStyle w:val="Compact"/>
+              <w:jc w:val="right"/>
+            </w:pPr>
+            <w:r>
+              <w:t xml:space="preserve">2.85</w:t>
+            </w:r>
+          </w:p>
+        </w:tc>
+        <w:tc>
+          <w:tcPr/>
+          <w:p>
+            <w:pPr>
+              <w:pStyle w:val="Compact"/>
+              <w:jc w:val="center"/>
+            </w:pPr>
+            <w:r>
+              <w:t xml:space="preserve">Credibly higher</w:t>
+            </w:r>
+          </w:p>
+        </w:tc>
+      </w:tr>
+      <w:tr>
+        <w:tc>
+          <w:tcPr/>
+          <w:p>
+            <w:pPr>
+              <w:pStyle w:val="Compact"/>
+            </w:pPr>
+            <w:r>
+              <w:t xml:space="preserve">Internet &amp; Broadcasting</w:t>
+            </w:r>
+          </w:p>
+        </w:tc>
+        <w:tc>
+          <w:tcPr/>
+          <w:p>
+            <w:pPr>
+              <w:pStyle w:val="Compact"/>
+              <w:jc w:val="right"/>
+            </w:pPr>
+            <w:r>
+              <w:t xml:space="preserve">6.22%</w:t>
+            </w:r>
+          </w:p>
+        </w:tc>
+        <w:tc>
+          <w:tcPr/>
+          <w:p>
+            <w:pPr>
+              <w:pStyle w:val="Compact"/>
+              <w:jc w:val="right"/>
+            </w:pPr>
+            <w:r>
+              <w:t xml:space="preserve">16.79%</w:t>
+            </w:r>
+          </w:p>
+        </w:tc>
+        <w:tc>
+          <w:tcPr/>
+          <w:p>
+            <w:pPr>
+              <w:pStyle w:val="Compact"/>
+              <w:jc w:val="right"/>
+            </w:pPr>
+            <w:r>
+              <w:t xml:space="preserve">-10.6</w:t>
+            </w:r>
+          </w:p>
+        </w:tc>
+        <w:tc>
+          <w:tcPr/>
+          <w:p>
+            <w:pPr>
+              <w:pStyle w:val="Compact"/>
+              <w:jc w:val="right"/>
+            </w:pPr>
+            <w:r>
+              <w:t xml:space="preserve">0.37</w:t>
+            </w:r>
+          </w:p>
+        </w:tc>
+        <w:tc>
+          <w:tcPr/>
+          <w:p>
+            <w:pPr>
+              <w:pStyle w:val="Compact"/>
+              <w:jc w:val="center"/>
+            </w:pPr>
+            <w:r>
+              <w:t xml:space="preserve">Credibly lower</w:t>
+            </w:r>
+          </w:p>
+        </w:tc>
+      </w:tr>
+      <w:tr>
+        <w:tc>
+          <w:tcPr/>
+          <w:p>
+            <w:pPr>
+              <w:pStyle w:val="Compact"/>
+            </w:pPr>
+            <w:r>
+              <w:t xml:space="preserve">Mobility &amp; Transportation</w:t>
+            </w:r>
+          </w:p>
+        </w:tc>
+        <w:tc>
+          <w:tcPr/>
+          <w:p>
+            <w:pPr>
+              <w:pStyle w:val="Compact"/>
+              <w:jc w:val="right"/>
+            </w:pPr>
+            <w:r>
+              <w:t xml:space="preserve">1.79%</w:t>
+            </w:r>
+          </w:p>
+        </w:tc>
+        <w:tc>
+          <w:tcPr/>
+          <w:p>
+            <w:pPr>
+              <w:pStyle w:val="Compact"/>
+              <w:jc w:val="right"/>
+            </w:pPr>
+            <w:r>
+              <w:t xml:space="preserve">0.73%</w:t>
+            </w:r>
+          </w:p>
+        </w:tc>
+        <w:tc>
+          <w:tcPr/>
+          <w:p>
+            <w:pPr>
+              <w:pStyle w:val="Compact"/>
+              <w:jc w:val="right"/>
+            </w:pPr>
+            <w:r>
+              <w:t xml:space="preserve">+1.1</w:t>
+            </w:r>
+          </w:p>
+        </w:tc>
+        <w:tc>
+          <w:tcPr/>
+          <w:p>
+            <w:pPr>
+              <w:pStyle w:val="Compact"/>
+              <w:jc w:val="right"/>
+            </w:pPr>
+            <w:r>
+              <w:t xml:space="preserve">2.45</w:t>
+            </w:r>
+          </w:p>
+        </w:tc>
+        <w:tc>
+          <w:tcPr/>
+          <w:p>
+            <w:pPr>
+              <w:pStyle w:val="Compact"/>
+              <w:jc w:val="center"/>
+            </w:pPr>
+            <w:r>
+              <w:t xml:space="preserve">Credibly higher</w:t>
+            </w:r>
+          </w:p>
+        </w:tc>
+      </w:tr>
+      <w:tr>
+        <w:tc>
+          <w:tcPr/>
+          <w:p>
+            <w:pPr>
+              <w:pStyle w:val="Compact"/>
+            </w:pPr>
+            <w:r>
+              <w:t xml:space="preserve">Search &amp; Advertising</w:t>
+            </w:r>
+          </w:p>
+        </w:tc>
+        <w:tc>
+          <w:tcPr/>
+          <w:p>
+            <w:pPr>
+              <w:pStyle w:val="Compact"/>
+              <w:jc w:val="right"/>
+            </w:pPr>
+            <w:r>
+              <w:t xml:space="preserve">5.94%</w:t>
+            </w:r>
+          </w:p>
+        </w:tc>
+        <w:tc>
+          <w:tcPr/>
+          <w:p>
+            <w:pPr>
+              <w:pStyle w:val="Compact"/>
+              <w:jc w:val="right"/>
+            </w:pPr>
+            <w:r>
+              <w:t xml:space="preserve">7.61%</w:t>
+            </w:r>
+          </w:p>
+        </w:tc>
+        <w:tc>
+          <w:tcPr/>
+          <w:p>
+            <w:pPr>
+              <w:pStyle w:val="Compact"/>
+              <w:jc w:val="right"/>
+            </w:pPr>
+            <w:r>
+              <w:t xml:space="preserve">-1.7</w:t>
+            </w:r>
+          </w:p>
+        </w:tc>
+        <w:tc>
+          <w:tcPr/>
+          <w:p>
+            <w:pPr>
+              <w:pStyle w:val="Compact"/>
+              <w:jc w:val="right"/>
+            </w:pPr>
+            <w:r>
+              <w:t xml:space="preserve">0.78</w:t>
+            </w:r>
+          </w:p>
+        </w:tc>
+        <w:tc>
+          <w:tcPr/>
+          <w:p>
+            <w:pPr>
+              <w:pStyle w:val="Compact"/>
+              <w:jc w:val="center"/>
+            </w:pPr>
+            <w:r>
+              <w:t xml:space="preserve">Credibly lower</w:t>
+            </w:r>
+          </w:p>
+        </w:tc>
+      </w:tr>
+      <w:tr>
+        <w:tc>
+          <w:tcPr/>
+          <w:p>
+            <w:pPr>
+              <w:pStyle w:val="Compact"/>
+            </w:pPr>
+            <w:r>
+              <w:t xml:space="preserve">Smartphones &amp; Apps</w:t>
+            </w:r>
+          </w:p>
+        </w:tc>
+        <w:tc>
+          <w:tcPr/>
+          <w:p>
+            <w:pPr>
+              <w:pStyle w:val="Compact"/>
+              <w:jc w:val="right"/>
+            </w:pPr>
+            <w:r>
+              <w:t xml:space="preserve">8.08%</w:t>
+            </w:r>
+          </w:p>
+        </w:tc>
+        <w:tc>
+          <w:tcPr/>
+          <w:p>
+            <w:pPr>
+              <w:pStyle w:val="Compact"/>
+              <w:jc w:val="right"/>
+            </w:pPr>
+            <w:r>
+              <w:t xml:space="preserve">10.80%</w:t>
+            </w:r>
+          </w:p>
+        </w:tc>
+        <w:tc>
+          <w:tcPr/>
+          <w:p>
+            <w:pPr>
+              <w:pStyle w:val="Compact"/>
+              <w:jc w:val="right"/>
+            </w:pPr>
+            <w:r>
+              <w:t xml:space="preserve">-2.7</w:t>
+            </w:r>
+          </w:p>
+        </w:tc>
+        <w:tc>
+          <w:tcPr/>
+          <w:p>
+            <w:pPr>
+              <w:pStyle w:val="Compact"/>
+              <w:jc w:val="right"/>
+            </w:pPr>
+            <w:r>
+              <w:t xml:space="preserve">0.75</w:t>
+            </w:r>
+          </w:p>
+        </w:tc>
+        <w:tc>
+          <w:tcPr/>
+          <w:p>
+            <w:pPr>
+              <w:pStyle w:val="Compact"/>
+              <w:jc w:val="center"/>
+            </w:pPr>
+            <w:r>
+              <w:t xml:space="preserve">Credibly lower</w:t>
+            </w:r>
+          </w:p>
+        </w:tc>
+      </w:tr>
+      <w:tr>
+        <w:tc>
+          <w:tcPr/>
+          <w:p>
+            <w:pPr>
+              <w:pStyle w:val="Compact"/>
+            </w:pPr>
+            <w:r>
+              <w:t xml:space="preserve">Social Media</w:t>
+            </w:r>
+          </w:p>
+        </w:tc>
+        <w:tc>
+          <w:tcPr/>
+          <w:p>
+            <w:pPr>
+              <w:pStyle w:val="Compact"/>
+              <w:jc w:val="right"/>
+            </w:pPr>
+            <w:r>
+              <w:t xml:space="preserve">12.95%</w:t>
+            </w:r>
+          </w:p>
+        </w:tc>
+        <w:tc>
+          <w:tcPr/>
+          <w:p>
+            <w:pPr>
+              <w:pStyle w:val="Compact"/>
+              <w:jc w:val="right"/>
+            </w:pPr>
+            <w:r>
+              <w:t xml:space="preserve">21.42%</w:t>
+            </w:r>
+          </w:p>
+        </w:tc>
+        <w:tc>
+          <w:tcPr/>
+          <w:p>
+            <w:pPr>
+              <w:pStyle w:val="Compact"/>
+              <w:jc w:val="right"/>
+            </w:pPr>
+            <w:r>
+              <w:t xml:space="preserve">-8.5</w:t>
+            </w:r>
+          </w:p>
+        </w:tc>
+        <w:tc>
+          <w:tcPr/>
+          <w:p>
+            <w:pPr>
+              <w:pStyle w:val="Compact"/>
+              <w:jc w:val="right"/>
+            </w:pPr>
+            <w:r>
+              <w:t xml:space="preserve">0.60</w:t>
+            </w:r>
+          </w:p>
+        </w:tc>
+        <w:tc>
+          <w:tcPr/>
+          <w:p>
+            <w:pPr>
+              <w:pStyle w:val="Compact"/>
+              <w:jc w:val="center"/>
+            </w:pPr>
+            <w:r>
+              <w:t xml:space="preserve">Credibly lower</w:t>
+            </w:r>
+          </w:p>
+        </w:tc>
+      </w:tr>
+      <w:tr>
+        <w:tc>
+          <w:tcPr/>
+          <w:p>
+            <w:pPr>
+              <w:pStyle w:val="Compact"/>
+            </w:pPr>
+            <w:r>
+              <w:t xml:space="preserve">Streaming, Audio &amp; Video</w:t>
+            </w:r>
+          </w:p>
+        </w:tc>
+        <w:tc>
+          <w:tcPr/>
+          <w:p>
+            <w:pPr>
+              <w:pStyle w:val="Compact"/>
+              <w:jc w:val="right"/>
+            </w:pPr>
+            <w:r>
+              <w:t xml:space="preserve">3.79%</w:t>
+            </w:r>
+          </w:p>
+        </w:tc>
+        <w:tc>
+          <w:tcPr/>
+          <w:p>
+            <w:pPr>
+              <w:pStyle w:val="Compact"/>
+              <w:jc w:val="right"/>
+            </w:pPr>
+            <w:r>
+              <w:t xml:space="preserve">6.47%</w:t>
+            </w:r>
+          </w:p>
+        </w:tc>
+        <w:tc>
+          <w:tcPr/>
+          <w:p>
+            <w:pPr>
+              <w:pStyle w:val="Compact"/>
+              <w:jc w:val="right"/>
+            </w:pPr>
+            <w:r>
+              <w:t xml:space="preserve">-2.7</w:t>
+            </w:r>
+          </w:p>
+        </w:tc>
+        <w:tc>
+          <w:tcPr/>
+          <w:p>
+            <w:pPr>
+              <w:pStyle w:val="Compact"/>
+              <w:jc w:val="right"/>
+            </w:pPr>
+            <w:r>
+              <w:t xml:space="preserve">0.59</w:t>
+            </w:r>
+          </w:p>
+        </w:tc>
+        <w:tc>
+          <w:tcPr/>
+          <w:p>
+            <w:pPr>
+              <w:pStyle w:val="Compact"/>
+              <w:jc w:val="center"/>
+            </w:pPr>
+            <w:r>
+              <w:t xml:space="preserve">Credibly lower</w:t>
+            </w:r>
+          </w:p>
+        </w:tc>
+      </w:tr>
+      <w:tr>
+        <w:tc>
+          <w:tcPr/>
+          <w:p>
+            <w:pPr>
+              <w:pStyle w:val="Compact"/>
+            </w:pPr>
+            <w:r>
+              <w:t xml:space="preserve">Tracking &amp; Wearables</w:t>
+            </w:r>
+          </w:p>
+        </w:tc>
+        <w:tc>
+          <w:tcPr/>
+          <w:p>
+            <w:pPr>
+              <w:pStyle w:val="Compact"/>
+              <w:jc w:val="right"/>
+            </w:pPr>
+            <w:r>
+              <w:t xml:space="preserve">3.65%</w:t>
+            </w:r>
+          </w:p>
+        </w:tc>
+        <w:tc>
+          <w:tcPr/>
+          <w:p>
+            <w:pPr>
+              <w:pStyle w:val="Compact"/>
+              <w:jc w:val="right"/>
+            </w:pPr>
+            <w:r>
+              <w:t xml:space="preserve">0.53%</w:t>
+            </w:r>
+          </w:p>
+        </w:tc>
+        <w:tc>
+          <w:tcPr/>
+          <w:p>
+            <w:pPr>
+              <w:pStyle w:val="Compact"/>
+              <w:jc w:val="right"/>
+            </w:pPr>
+            <w:r>
+              <w:t xml:space="preserve">+3.1</w:t>
+            </w:r>
+          </w:p>
+        </w:tc>
+        <w:tc>
+          <w:tcPr/>
+          <w:p>
+            <w:pPr>
+              <w:pStyle w:val="Compact"/>
+              <w:jc w:val="right"/>
+            </w:pPr>
+            <w:r>
+              <w:t xml:space="preserve">6.85</w:t>
+            </w:r>
+          </w:p>
+        </w:tc>
+        <w:tc>
+          <w:tcPr/>
+          <w:p>
+            <w:pPr>
+              <w:pStyle w:val="Compact"/>
+              <w:jc w:val="center"/>
+            </w:pPr>
+            <w:r>
+              <w:t xml:space="preserve">Credibly higher</w:t>
+            </w:r>
+          </w:p>
+        </w:tc>
+      </w:tr>
+      <w:tr>
+        <w:tc>
+          <w:tcPr/>
+          <w:p>
+            <w:pPr>
+              <w:pStyle w:val="Compact"/>
+            </w:pPr>
+            <w:r>
+              <w:t xml:space="preserve">Other</w:t>
+            </w:r>
+          </w:p>
+        </w:tc>
+        <w:tc>
+          <w:tcPr/>
+          <w:p>
+            <w:pPr>
+              <w:pStyle w:val="Compact"/>
+              <w:jc w:val="right"/>
+            </w:pPr>
+            <w:r>
+              <w:t xml:space="preserve">5.58%</w:t>
+            </w:r>
+          </w:p>
+        </w:tc>
+        <w:tc>
+          <w:tcPr/>
+          <w:p>
+            <w:pPr>
+              <w:pStyle w:val="Compact"/>
+              <w:jc w:val="right"/>
+            </w:pPr>
+            <w:r>
+              <w:t xml:space="preserve">10.84%</w:t>
+            </w:r>
+          </w:p>
+        </w:tc>
+        <w:tc>
+          <w:tcPr/>
+          <w:p>
+            <w:pPr>
+              <w:pStyle w:val="Compact"/>
+              <w:jc w:val="right"/>
+            </w:pPr>
+            <w:r>
+              <w:t xml:space="preserve">-5.3</w:t>
+            </w:r>
+          </w:p>
+        </w:tc>
+        <w:tc>
+          <w:tcPr/>
+          <w:p>
+            <w:pPr>
+              <w:pStyle w:val="Compact"/>
+              <w:jc w:val="right"/>
+            </w:pPr>
+            <w:r>
+              <w:t xml:space="preserve">0.51</w:t>
+            </w:r>
+          </w:p>
+        </w:tc>
+        <w:tc>
+          <w:tcPr/>
+          <w:p>
+            <w:pPr>
+              <w:pStyle w:val="Compact"/>
+              <w:jc w:val="center"/>
+            </w:pPr>
+            <w:r>
+              <w:t xml:space="preserve">Credibly lower</w:t>
+            </w:r>
+          </w:p>
+        </w:tc>
+      </w:tr>
+    </w:tbl>
+    <w:bookmarkEnd w:id="64"/>
+    <w:bookmarkEnd w:id="65"/>
+    <w:p>
+      <w:pPr>
+        <w:sectPr/>
+      </w:pPr>
+    </w:p>
+    <w:bookmarkStart w:id="67" w:name="tbl-lag-pvalues"/>
+    <w:p>
+      <w:pPr>
+        <w:pStyle w:val="FigureTitle"/>
+      </w:pPr>
+      <w:r>
+        <w:t xml:space="preserve">Table 4</w:t>
+      </w:r>
+    </w:p>
+    <w:p>
+      <w:pPr>
+        <w:pStyle w:val="Caption"/>
+      </w:pPr>
+      <w:r>
         <w:t xml:space="preserve">Correlation between annual academic and media attention at each lag, with the exact two-sided circular-shift permutation p-value in parentheses. The highest correlation in each row is set in bold and corresponds to the best lag. The smallest attainable p-value ranges from .053 at lag 0 to .071 at lag -5 and +5.</w:t>
       </w:r>
     </w:p>
-    <w:bookmarkStart w:id="64" w:name="tbl-lag-pvalues"/>
+    <w:bookmarkStart w:id="66" w:name="tbl-lag-pvalues"/>
     <w:tbl>
       <w:tblPr>
         <w:tblStyle w:val="Table"/>
@@ -9787,8 +11020,8 @@
         </w:tc>
       </w:tr>
     </w:tbl>
-    <w:bookmarkEnd w:id="64"/>
-    <w:bookmarkEnd w:id="65"/>
+    <w:bookmarkEnd w:id="66"/>
+    <w:bookmarkEnd w:id="67"/>
     <w:p>
       <w:pPr>
         <w:sectPr>
@@ -9796,8 +11029,8 @@
         </w:sectPr>
       </w:pPr>
     </w:p>
-    <w:bookmarkEnd w:id="66"/>
-    <w:bookmarkStart w:id="67" w:name="the-case-of-generative-ai-2"/>
+    <w:bookmarkEnd w:id="68"/>
+    <w:bookmarkStart w:id="69" w:name="the-case-of-generative-ai-2"/>
     <w:p>
       <w:pPr>
         <w:pStyle w:val="Heading3"/>
@@ -9879,27 +11112,18 @@
         <w:t xml:space="preserve"> </w:t>
       </w:r>
       <w:r>
-        <w:t xml:space="preserve">pp,</w:t>
+        <w:t xml:space="preserve">pp, ratio</w:t>
       </w:r>
       <w:r>
         <w:t xml:space="preserve"> </w:t>
       </w:r>
       <m:oMath>
         <m:r>
-          <m:t>q</m:t>
-        </m:r>
-        <m:r>
-          <m:rPr>
-            <m:sty m:val="p"/>
-          </m:rPr>
-          <m:t>&lt;</m:t>
-        </m:r>
-        <m:r>
-          <m:t>.001</m:t>
+          <m:t>2.85</m:t>
         </m:r>
       </m:oMath>
       <w:r>
-        <w:t xml:space="preserve">). Media attention towards Generative AI has rapidly increased in recent years, but not at the pace seen in our corpus, where it became the most discussed cluster overall and more dominant still in the current publication agenda. It is also the only cluster whose annual academic and media series correlate above</w:t>
+        <w:t xml:space="preserve">, credibly higher). Media attention towards Generative AI has rapidly increased in recent years, but not at the pace seen in our corpus, where it became the most discussed cluster overall and more dominant still in the current publication agenda. It is also the only cluster whose annual academic and media series correlate above</w:t>
       </w:r>
       <w:r>
         <w:t xml:space="preserve"> </w:t>
@@ -9960,10 +11184,10 @@
         <w:br w:type="page"/>
       </w:r>
     </w:p>
-    <w:bookmarkEnd w:id="67"/>
-    <w:bookmarkEnd w:id="68"/>
     <w:bookmarkEnd w:id="69"/>
-    <w:bookmarkStart w:id="71" w:name="general-discussion"/>
+    <w:bookmarkEnd w:id="70"/>
+    <w:bookmarkEnd w:id="71"/>
+    <w:bookmarkStart w:id="73" w:name="general-discussion"/>
     <w:p>
       <w:pPr>
         <w:pStyle w:val="Heading1"/>
@@ -9996,7 +11220,7 @@
         <w:t xml:space="preserve">Academic attention has so far only weakly aligned with public attention (Analysis 3): although the relative attention assigned to technologies is moderately correlated across the two corpora, their temporal relationships are weak. Generative AI departs from this historical pattern, carrying the largest academic over-representation of any cluster, and being the only cluster whose academic and media attention correlate highly across time.</w:t>
       </w:r>
     </w:p>
-    <w:bookmarkStart w:id="70" w:name="the-case-of-generative-ai-3"/>
+    <w:bookmarkStart w:id="72" w:name="the-case-of-generative-ai-3"/>
     <w:p>
       <w:pPr>
         <w:pStyle w:val="Heading2"/>
@@ -10202,9 +11426,9 @@
         <w:t xml:space="preserve">to consumer experience: fields such as relationships, or online virality and word of mouth are currently credibly below the overall baseline, yet developments in AI call for a better understanding of its impact on these aspects of consumer behavior [sources].</w:t>
       </w:r>
     </w:p>
-    <w:bookmarkEnd w:id="70"/>
-    <w:bookmarkEnd w:id="71"/>
-    <w:bookmarkStart w:id="72" w:name="implications"/>
+    <w:bookmarkEnd w:id="72"/>
+    <w:bookmarkEnd w:id="73"/>
+    <w:bookmarkStart w:id="74" w:name="implications"/>
     <w:p>
       <w:pPr>
         <w:pStyle w:val="Heading1"/>
@@ -10399,8 +11623,8 @@
         <w:t xml:space="preserve">For journals and their editors, we derive a different, yet related set of implications. First, our analyses imply a strong relationship between the priorities set by journals and the research agendas that stem from them. Generative AI has universally been adopted as the next consumer technology to study, from theory building to applied research. It is however important for journals to condition their publication agenda on how we can actually advance our understanding of this technology: just as for researchers, we recommend that journal editors assess propositions on Generative AI not in isolation, but also with regard to how they contribute to our understanding of how this technology builds on, and diverges from, earlier work on consumer technologies. Constructing a parsimonious and integrated network of theories and technology understanding might be our best chance as a field to keep up with a subject matter that evolves faster than we are able to publish. Beyond Generative AI, we also recommend that journals not chase novelty at the cost of cumulative knowledge advancement. Our analysis shows that early-dominant technology clusters have fallen out of academic focus, yet remain relevant in the media and offer further theoretical angles from which they can be approached. Understanding the latent technologies that shape more specific applications, such as Algorithms &amp; Recommendations as a broader baseline influencing more specific technologies such as E-Commerce, or Social Media as a particular family of algorithms, may further contribute to a substantive and sustainable understanding of the technological world consumers operate in.</w:t>
       </w:r>
     </w:p>
-    <w:bookmarkEnd w:id="72"/>
-    <w:bookmarkStart w:id="73" w:name="limitations-and-further-research"/>
+    <w:bookmarkEnd w:id="74"/>
+    <w:bookmarkStart w:id="75" w:name="limitations-and-further-research"/>
     <w:p>
       <w:pPr>
         <w:pStyle w:val="Heading1"/>
@@ -10425,8 +11649,8 @@
         <w:t xml:space="preserve">In three analyses, we provide an overview of 26 years of consumer technology research in marketing, and compare this baseline against the case of Generative AI. This foundation provides opportunities for further research: First, we assessed the body of empirical work on consumer technologies. It is worthwhile asking if our findings generalize to consumer technology research beyond empirical work, especially in terms of divergences from public attention. We might lag behind or disregard public attention in our empirical work, but conceptual work may be anticipating future trends. A second, natural extension would be to not only look at the technologies studied, and the intellectual foundation in terms of bibliometric analyses, but to extend our analysis to a full-text analysis identifying the mechansims studied in connection to these technologies. Lastly, we treat semantic information from consumer technology descriptions as the authors of articles provide them as a basis to form our bottom-up, empirical clustering of consumer technologies. This finding could be extended and validated from a more theoretical perspective, as semantic modeling is subject to subtle semantic changes, whereas a theoretical taxonomy of consumer technologies may prove useful for further understanding and advancing our field.</w:t>
       </w:r>
     </w:p>
-    <w:bookmarkEnd w:id="73"/>
-    <w:bookmarkStart w:id="166" w:name="references"/>
+    <w:bookmarkEnd w:id="75"/>
+    <w:bookmarkStart w:id="168" w:name="references"/>
     <w:p>
       <w:pPr>
         <w:pStyle w:val="Heading1"/>
@@ -10435,8 +11659,8 @@
         <w:t xml:space="preserve">References</w:t>
       </w:r>
     </w:p>
-    <w:bookmarkStart w:id="165" w:name="refs"/>
-    <w:bookmarkStart w:id="74" w:name="ref-andrewBayesianDataAnalysis"/>
+    <w:bookmarkStart w:id="167" w:name="refs"/>
+    <w:bookmarkStart w:id="76" w:name="ref-andrewBayesianDataAnalysis"/>
     <w:p>
       <w:pPr>
         <w:pStyle w:val="Bibliography"/>
@@ -10493,8 +11717,8 @@
         <w:t xml:space="preserve">.</w:t>
       </w:r>
     </w:p>
-    <w:bookmarkEnd w:id="74"/>
-    <w:bookmarkStart w:id="76" w:name="X77c6a6fb7e9371a37a306d4adddd389bde7954b"/>
+    <w:bookmarkEnd w:id="76"/>
+    <w:bookmarkStart w:id="78" w:name="X77c6a6fb7e9371a37a306d4adddd389bde7954b"/>
     <w:p>
       <w:pPr>
         <w:pStyle w:val="Bibliography"/>
@@ -10543,7 +11767,7 @@
       <w:r>
         <w:t xml:space="preserve"> </w:t>
       </w:r>
-      <w:hyperlink r:id="rId75">
+      <w:hyperlink r:id="rId77">
         <w:r>
           <w:rPr>
             <w:rStyle w:val="Hyperlink"/>
@@ -10552,8 +11776,8 @@
         </w:r>
       </w:hyperlink>
     </w:p>
-    <w:bookmarkEnd w:id="76"/>
-    <w:bookmarkStart w:id="78" w:name="ref-specialissue2026"/>
+    <w:bookmarkEnd w:id="78"/>
+    <w:bookmarkStart w:id="80" w:name="ref-specialissue2026"/>
     <w:p>
       <w:pPr>
         <w:pStyle w:val="Bibliography"/>
@@ -10675,7 +11899,7 @@
       <w:r>
         <w:t xml:space="preserve"> </w:t>
       </w:r>
-      <w:hyperlink r:id="rId77">
+      <w:hyperlink r:id="rId79">
         <w:r>
           <w:rPr>
             <w:rStyle w:val="Hyperlink"/>
@@ -10684,8 +11908,8 @@
         </w:r>
       </w:hyperlink>
     </w:p>
-    <w:bookmarkEnd w:id="78"/>
-    <w:bookmarkStart w:id="80" w:name="ref-bermejoMediaCloud202026"/>
+    <w:bookmarkEnd w:id="80"/>
+    <w:bookmarkStart w:id="82" w:name="ref-bermejoMediaCloud202026"/>
     <w:p>
       <w:pPr>
         <w:pStyle w:val="Bibliography"/>
@@ -10743,7 +11967,7 @@
       <w:r>
         <w:t xml:space="preserve"> </w:t>
       </w:r>
-      <w:hyperlink r:id="rId79">
+      <w:hyperlink r:id="rId81">
         <w:r>
           <w:rPr>
             <w:rStyle w:val="Hyperlink"/>
@@ -10752,8 +11976,8 @@
         </w:r>
       </w:hyperlink>
     </w:p>
-    <w:bookmarkEnd w:id="80"/>
-    <w:bookmarkStart w:id="82" w:name="ref-binzHowShouldAdvancement2025"/>
+    <w:bookmarkEnd w:id="82"/>
+    <w:bookmarkStart w:id="84" w:name="ref-binzHowShouldAdvancement2025"/>
     <w:p>
       <w:pPr>
         <w:pStyle w:val="Bibliography"/>
@@ -10790,7 +12014,7 @@
       <w:r>
         <w:t xml:space="preserve"> </w:t>
       </w:r>
-      <w:hyperlink r:id="rId81">
+      <w:hyperlink r:id="rId83">
         <w:r>
           <w:rPr>
             <w:rStyle w:val="Hyperlink"/>
@@ -10799,8 +12023,8 @@
         </w:r>
       </w:hyperlink>
     </w:p>
-    <w:bookmarkEnd w:id="82"/>
-    <w:bookmarkStart w:id="84" w:name="ref-bjorkPublishingDelayScholarly2013"/>
+    <w:bookmarkEnd w:id="84"/>
+    <w:bookmarkStart w:id="86" w:name="ref-bjorkPublishingDelayScholarly2013"/>
     <w:p>
       <w:pPr>
         <w:pStyle w:val="Bibliography"/>
@@ -10837,7 +12061,7 @@
       <w:r>
         <w:t xml:space="preserve"> </w:t>
       </w:r>
-      <w:hyperlink r:id="rId83">
+      <w:hyperlink r:id="rId85">
         <w:r>
           <w:rPr>
             <w:rStyle w:val="Hyperlink"/>
@@ -10846,8 +12070,8 @@
         </w:r>
       </w:hyperlink>
     </w:p>
-    <w:bookmarkEnd w:id="84"/>
-    <w:bookmarkStart w:id="86" w:name="ref-blondelFastUnfoldingCommunities2008"/>
+    <w:bookmarkEnd w:id="86"/>
+    <w:bookmarkStart w:id="88" w:name="ref-blondelFastUnfoldingCommunities2008"/>
     <w:p>
       <w:pPr>
         <w:pStyle w:val="Bibliography"/>
@@ -10884,7 +12108,7 @@
       <w:r>
         <w:t xml:space="preserve"> </w:t>
       </w:r>
-      <w:hyperlink r:id="rId85">
+      <w:hyperlink r:id="rId87">
         <w:r>
           <w:rPr>
             <w:rStyle w:val="Hyperlink"/>
@@ -10893,8 +12117,8 @@
         </w:r>
       </w:hyperlink>
     </w:p>
-    <w:bookmarkEnd w:id="86"/>
-    <w:bookmarkStart w:id="88" w:name="ref-calinskiDendriteMethodCluster1974"/>
+    <w:bookmarkEnd w:id="88"/>
+    <w:bookmarkStart w:id="90" w:name="ref-calinskiDendriteMethodCluster1974"/>
     <w:p>
       <w:pPr>
         <w:pStyle w:val="Bibliography"/>
@@ -10931,7 +12155,7 @@
       <w:r>
         <w:t xml:space="preserve"> </w:t>
       </w:r>
-      <w:hyperlink r:id="rId87">
+      <w:hyperlink r:id="rId89">
         <w:r>
           <w:rPr>
             <w:rStyle w:val="Hyperlink"/>
@@ -10940,8 +12164,8 @@
         </w:r>
       </w:hyperlink>
     </w:p>
-    <w:bookmarkEnd w:id="88"/>
-    <w:bookmarkStart w:id="90" w:name="ref-cilloGenerativeAIInnovation2025"/>
+    <w:bookmarkEnd w:id="90"/>
+    <w:bookmarkStart w:id="92" w:name="ref-cilloGenerativeAIInnovation2025"/>
     <w:p>
       <w:pPr>
         <w:pStyle w:val="Bibliography"/>
@@ -11002,7 +12226,7 @@
       <w:r>
         <w:t xml:space="preserve"> </w:t>
       </w:r>
-      <w:hyperlink r:id="rId89">
+      <w:hyperlink r:id="rId91">
         <w:r>
           <w:rPr>
             <w:rStyle w:val="Hyperlink"/>
@@ -11011,8 +12235,8 @@
         </w:r>
       </w:hyperlink>
     </w:p>
-    <w:bookmarkEnd w:id="90"/>
-    <w:bookmarkStart w:id="92" w:name="ref-daviesClusterSeparationMeasure1979"/>
+    <w:bookmarkEnd w:id="92"/>
+    <w:bookmarkStart w:id="94" w:name="ref-daviesClusterSeparationMeasure1979"/>
     <w:p>
       <w:pPr>
         <w:pStyle w:val="Bibliography"/>
@@ -11058,7 +12282,7 @@
       <w:r>
         <w:t xml:space="preserve"> </w:t>
       </w:r>
-      <w:hyperlink r:id="rId91">
+      <w:hyperlink r:id="rId93">
         <w:r>
           <w:rPr>
             <w:rStyle w:val="Hyperlink"/>
@@ -11067,8 +12291,8 @@
         </w:r>
       </w:hyperlink>
     </w:p>
-    <w:bookmarkEnd w:id="92"/>
-    <w:bookmarkStart w:id="93" w:name="ref-VisibleMeasurableImmediate"/>
+    <w:bookmarkEnd w:id="94"/>
+    <w:bookmarkStart w:id="95" w:name="ref-VisibleMeasurableImmediate"/>
     <w:p>
       <w:pPr>
         <w:pStyle w:val="Bibliography"/>
@@ -11146,8 +12370,8 @@
         <w:t xml:space="preserve">.</w:t>
       </w:r>
     </w:p>
-    <w:bookmarkEnd w:id="93"/>
-    <w:bookmarkStart w:id="95" w:name="ref-donthuHowConductBibliometric2021"/>
+    <w:bookmarkEnd w:id="95"/>
+    <w:bookmarkStart w:id="97" w:name="ref-donthuHowConductBibliometric2021"/>
     <w:p>
       <w:pPr>
         <w:pStyle w:val="Bibliography"/>
@@ -11196,7 +12420,7 @@
       <w:r>
         <w:t xml:space="preserve"> </w:t>
       </w:r>
-      <w:hyperlink r:id="rId94">
+      <w:hyperlink r:id="rId96">
         <w:r>
           <w:rPr>
             <w:rStyle w:val="Hyperlink"/>
@@ -11205,8 +12429,8 @@
         </w:r>
       </w:hyperlink>
     </w:p>
-    <w:bookmarkEnd w:id="95"/>
-    <w:bookmarkStart w:id="97" w:name="Xe2d6bc7484b7c2393b057240f09a7c5cc958e61"/>
+    <w:bookmarkEnd w:id="97"/>
+    <w:bookmarkStart w:id="99" w:name="Xe2d6bc7484b7c2393b057240f09a7c5cc958e61"/>
     <w:p>
       <w:pPr>
         <w:pStyle w:val="Bibliography"/>
@@ -11243,7 +12467,7 @@
       <w:r>
         <w:t xml:space="preserve"> </w:t>
       </w:r>
-      <w:hyperlink r:id="rId96">
+      <w:hyperlink r:id="rId98">
         <w:r>
           <w:rPr>
             <w:rStyle w:val="Hyperlink"/>
@@ -11252,8 +12476,8 @@
         </w:r>
       </w:hyperlink>
     </w:p>
-    <w:bookmarkEnd w:id="97"/>
-    <w:bookmarkStart w:id="99" w:name="Xe87f13889cec6d7c1674b0e46cf32c9a203961a"/>
+    <w:bookmarkEnd w:id="99"/>
+    <w:bookmarkStart w:id="101" w:name="Xe87f13889cec6d7c1674b0e46cf32c9a203961a"/>
     <w:p>
       <w:pPr>
         <w:pStyle w:val="Bibliography"/>
@@ -11332,7 +12556,7 @@
       <w:r>
         <w:t xml:space="preserve"> </w:t>
       </w:r>
-      <w:hyperlink r:id="rId98">
+      <w:hyperlink r:id="rId100">
         <w:r>
           <w:rPr>
             <w:rStyle w:val="Hyperlink"/>
@@ -11341,8 +12565,8 @@
         </w:r>
       </w:hyperlink>
     </w:p>
-    <w:bookmarkEnd w:id="99"/>
-    <w:bookmarkStart w:id="101" w:name="ref-fischerReuseNeedlePay2024"/>
+    <w:bookmarkEnd w:id="101"/>
+    <w:bookmarkStart w:id="103" w:name="ref-fischerReuseNeedlePay2024"/>
     <w:p>
       <w:pPr>
         <w:pStyle w:val="Bibliography"/>
@@ -11415,7 +12639,7 @@
       <w:r>
         <w:t xml:space="preserve"> </w:t>
       </w:r>
-      <w:hyperlink r:id="rId100">
+      <w:hyperlink r:id="rId102">
         <w:r>
           <w:rPr>
             <w:rStyle w:val="Hyperlink"/>
@@ -11424,8 +12648,8 @@
         </w:r>
       </w:hyperlink>
     </w:p>
-    <w:bookmarkEnd w:id="101"/>
-    <w:bookmarkStart w:id="103" w:name="X18974fea3fe182b56cf39c321495ac6ff97ecd7"/>
+    <w:bookmarkEnd w:id="103"/>
+    <w:bookmarkStart w:id="105" w:name="X18974fea3fe182b56cf39c321495ac6ff97ecd7"/>
     <w:p>
       <w:pPr>
         <w:pStyle w:val="Bibliography"/>
@@ -11483,7 +12707,7 @@
       <w:r>
         <w:t xml:space="preserve"> </w:t>
       </w:r>
-      <w:hyperlink r:id="rId102">
+      <w:hyperlink r:id="rId104">
         <w:r>
           <w:rPr>
             <w:rStyle w:val="Hyperlink"/>
@@ -11492,8 +12716,8 @@
         </w:r>
       </w:hyperlink>
     </w:p>
-    <w:bookmarkEnd w:id="103"/>
-    <w:bookmarkStart w:id="105" w:name="ref-grewalHowGenerativeAI2025"/>
+    <w:bookmarkEnd w:id="105"/>
+    <w:bookmarkStart w:id="107" w:name="ref-grewalHowGenerativeAI2025"/>
     <w:p>
       <w:pPr>
         <w:pStyle w:val="Bibliography"/>
@@ -11542,7 +12766,7 @@
       <w:r>
         <w:t xml:space="preserve"> </w:t>
       </w:r>
-      <w:hyperlink r:id="rId104">
+      <w:hyperlink r:id="rId106">
         <w:r>
           <w:rPr>
             <w:rStyle w:val="Hyperlink"/>
@@ -11551,8 +12775,8 @@
         </w:r>
       </w:hyperlink>
     </w:p>
-    <w:bookmarkEnd w:id="105"/>
-    <w:bookmarkStart w:id="107" w:name="ref-hoffmanRiseNewTechnologies2022"/>
+    <w:bookmarkEnd w:id="107"/>
+    <w:bookmarkStart w:id="109" w:name="ref-hoffmanRiseNewTechnologies2022"/>
     <w:p>
       <w:pPr>
         <w:pStyle w:val="Bibliography"/>
@@ -11643,7 +12867,7 @@
       <w:r>
         <w:t xml:space="preserve"> </w:t>
       </w:r>
-      <w:hyperlink r:id="rId106">
+      <w:hyperlink r:id="rId108">
         <w:r>
           <w:rPr>
             <w:rStyle w:val="Hyperlink"/>
@@ -11652,8 +12876,8 @@
         </w:r>
       </w:hyperlink>
     </w:p>
-    <w:bookmarkEnd w:id="107"/>
-    <w:bookmarkStart w:id="109" w:name="ref-huChatGPTSetsRecord2023"/>
+    <w:bookmarkEnd w:id="109"/>
+    <w:bookmarkStart w:id="111" w:name="ref-huChatGPTSetsRecord2023"/>
     <w:p>
       <w:pPr>
         <w:pStyle w:val="Bibliography"/>
@@ -11689,7 +12913,7 @@
       <w:r>
         <w:t xml:space="preserve"> </w:t>
       </w:r>
-      <w:hyperlink r:id="rId108">
+      <w:hyperlink r:id="rId110">
         <w:r>
           <w:rPr>
             <w:rStyle w:val="Hyperlink"/>
@@ -11698,8 +12922,8 @@
         </w:r>
       </w:hyperlink>
     </w:p>
-    <w:bookmarkEnd w:id="109"/>
-    <w:bookmarkStart w:id="111" w:name="X4bfed5635d964a1a6a21f3afa9bf4834a89002d"/>
+    <w:bookmarkEnd w:id="111"/>
+    <w:bookmarkStart w:id="113" w:name="X4bfed5635d964a1a6a21f3afa9bf4834a89002d"/>
     <w:p>
       <w:pPr>
         <w:pStyle w:val="Bibliography"/>
@@ -11760,7 +12984,7 @@
       <w:r>
         <w:t xml:space="preserve"> </w:t>
       </w:r>
-      <w:hyperlink r:id="rId110">
+      <w:hyperlink r:id="rId112">
         <w:r>
           <w:rPr>
             <w:rStyle w:val="Hyperlink"/>
@@ -11769,8 +12993,8 @@
         </w:r>
       </w:hyperlink>
     </w:p>
-    <w:bookmarkEnd w:id="111"/>
-    <w:bookmarkStart w:id="113" w:name="X7433f4f71f98d02ca93f48fa89ef156863d0469"/>
+    <w:bookmarkEnd w:id="113"/>
+    <w:bookmarkStart w:id="115" w:name="X7433f4f71f98d02ca93f48fa89ef156863d0469"/>
     <w:p>
       <w:pPr>
         <w:pStyle w:val="Bibliography"/>
@@ -11831,7 +13055,7 @@
       <w:r>
         <w:t xml:space="preserve"> </w:t>
       </w:r>
-      <w:hyperlink r:id="rId112">
+      <w:hyperlink r:id="rId114">
         <w:r>
           <w:rPr>
             <w:rStyle w:val="Hyperlink"/>
@@ -11840,8 +13064,8 @@
         </w:r>
       </w:hyperlink>
     </w:p>
-    <w:bookmarkEnd w:id="113"/>
-    <w:bookmarkStart w:id="115" w:name="ref-kennedyHowAmericansView2025"/>
+    <w:bookmarkEnd w:id="115"/>
+    <w:bookmarkStart w:id="117" w:name="ref-kennedyHowAmericansView2025"/>
     <w:p>
       <w:pPr>
         <w:pStyle w:val="Bibliography"/>
@@ -11963,7 +13187,7 @@
       <w:r>
         <w:t xml:space="preserve"> </w:t>
       </w:r>
-      <w:hyperlink r:id="rId114">
+      <w:hyperlink r:id="rId116">
         <w:r>
           <w:rPr>
             <w:rStyle w:val="Hyperlink"/>
@@ -11972,8 +13196,8 @@
         </w:r>
       </w:hyperlink>
     </w:p>
-    <w:bookmarkEnd w:id="115"/>
-    <w:bookmarkStart w:id="117" w:name="ref-kirkWhyHumanAI2025"/>
+    <w:bookmarkEnd w:id="117"/>
+    <w:bookmarkStart w:id="119" w:name="ref-kirkWhyHumanAI2025"/>
     <w:p>
       <w:pPr>
         <w:pStyle w:val="Bibliography"/>
@@ -12019,7 +13243,7 @@
       <w:r>
         <w:t xml:space="preserve"> </w:t>
       </w:r>
-      <w:hyperlink r:id="rId116">
+      <w:hyperlink r:id="rId118">
         <w:r>
           <w:rPr>
             <w:rStyle w:val="Hyperlink"/>
@@ -12028,8 +13252,8 @@
         </w:r>
       </w:hyperlink>
     </w:p>
-    <w:bookmarkEnd w:id="117"/>
-    <w:bookmarkStart w:id="118" w:name="X1ee6c0be2793064c85ed6527d182657f89961b8"/>
+    <w:bookmarkEnd w:id="119"/>
+    <w:bookmarkStart w:id="120" w:name="X1ee6c0be2793064c85ed6527d182657f89961b8"/>
     <w:p>
       <w:pPr>
         <w:pStyle w:val="Bibliography"/>
@@ -12054,8 +13278,8 @@
         <w:t xml:space="preserve">(Vol. 1, pp. 281–297). University of California Press.</w:t>
       </w:r>
     </w:p>
-    <w:bookmarkEnd w:id="118"/>
-    <w:bookmarkStart w:id="120" w:name="ref-malterPresentFutureConsumer2020"/>
+    <w:bookmarkEnd w:id="120"/>
+    <w:bookmarkStart w:id="122" w:name="ref-malterPresentFutureConsumer2020"/>
     <w:p>
       <w:pPr>
         <w:pStyle w:val="Bibliography"/>
@@ -12092,7 +13316,7 @@
       <w:r>
         <w:t xml:space="preserve"> </w:t>
       </w:r>
-      <w:hyperlink r:id="rId119">
+      <w:hyperlink r:id="rId121">
         <w:r>
           <w:rPr>
             <w:rStyle w:val="Hyperlink"/>
@@ -12101,8 +13325,8 @@
         </w:r>
       </w:hyperlink>
     </w:p>
-    <w:bookmarkEnd w:id="120"/>
-    <w:bookmarkStart w:id="122" w:name="ref-mcinnesUMAPUniformManifold2018"/>
+    <w:bookmarkEnd w:id="122"/>
+    <w:bookmarkStart w:id="124" w:name="ref-mcinnesUMAPUniformManifold2018"/>
     <w:p>
       <w:pPr>
         <w:pStyle w:val="Bibliography"/>
@@ -12169,7 +13393,7 @@
       <w:r>
         <w:t xml:space="preserve"> </w:t>
       </w:r>
-      <w:hyperlink r:id="rId121">
+      <w:hyperlink r:id="rId123">
         <w:r>
           <w:rPr>
             <w:rStyle w:val="Hyperlink"/>
@@ -12178,8 +13402,8 @@
         </w:r>
       </w:hyperlink>
     </w:p>
-    <w:bookmarkEnd w:id="122"/>
-    <w:bookmarkStart w:id="124" w:name="ref-mogajiHowGenerativeAI2024"/>
+    <w:bookmarkEnd w:id="124"/>
+    <w:bookmarkStart w:id="126" w:name="ref-mogajiHowGenerativeAI2024"/>
     <w:p>
       <w:pPr>
         <w:pStyle w:val="Bibliography"/>
@@ -12243,7 +13467,7 @@
       <w:r>
         <w:t xml:space="preserve"> </w:t>
       </w:r>
-      <w:hyperlink r:id="rId123">
+      <w:hyperlink r:id="rId125">
         <w:r>
           <w:rPr>
             <w:rStyle w:val="Hyperlink"/>
@@ -12252,8 +13476,8 @@
         </w:r>
       </w:hyperlink>
     </w:p>
-    <w:bookmarkEnd w:id="124"/>
-    <w:bookmarkStart w:id="126" w:name="ref-mollerImpactGenerativeAI2026"/>
+    <w:bookmarkEnd w:id="126"/>
+    <w:bookmarkStart w:id="128" w:name="ref-mollerImpactGenerativeAI2026"/>
     <w:p>
       <w:pPr>
         <w:pStyle w:val="Bibliography"/>
@@ -12302,7 +13526,7 @@
       <w:r>
         <w:t xml:space="preserve"> </w:t>
       </w:r>
-      <w:hyperlink r:id="rId125">
+      <w:hyperlink r:id="rId127">
         <w:r>
           <w:rPr>
             <w:rStyle w:val="Hyperlink"/>
@@ -12311,8 +13535,8 @@
         </w:r>
       </w:hyperlink>
     </w:p>
-    <w:bookmarkEnd w:id="126"/>
-    <w:bookmarkStart w:id="128" w:name="ref-moschellaAIMuchMore2025"/>
+    <w:bookmarkEnd w:id="128"/>
+    <w:bookmarkStart w:id="130" w:name="ref-moschellaAIMuchMore2025"/>
     <w:p>
       <w:pPr>
         <w:pStyle w:val="Bibliography"/>
@@ -12336,7 +13560,7 @@
       <w:r>
         <w:t xml:space="preserve"> </w:t>
       </w:r>
-      <w:hyperlink r:id="rId127">
+      <w:hyperlink r:id="rId129">
         <w:r>
           <w:rPr>
             <w:rStyle w:val="Hyperlink"/>
@@ -12345,8 +13569,8 @@
         </w:r>
       </w:hyperlink>
     </w:p>
-    <w:bookmarkEnd w:id="128"/>
-    <w:bookmarkStart w:id="130" w:name="ref-muzumdarDeadInternetTheory2025"/>
+    <w:bookmarkEnd w:id="130"/>
+    <w:bookmarkStart w:id="132" w:name="ref-muzumdarDeadInternetTheory2025"/>
     <w:p>
       <w:pPr>
         <w:pStyle w:val="Bibliography"/>
@@ -12437,7 +13661,7 @@
       <w:r>
         <w:t xml:space="preserve"> </w:t>
       </w:r>
-      <w:hyperlink r:id="rId129">
+      <w:hyperlink r:id="rId131">
         <w:r>
           <w:rPr>
             <w:rStyle w:val="Hyperlink"/>
@@ -12446,8 +13670,8 @@
         </w:r>
       </w:hyperlink>
     </w:p>
-    <w:bookmarkEnd w:id="130"/>
-    <w:bookmarkStart w:id="132" w:name="ref-openai2022chatgpt"/>
+    <w:bookmarkEnd w:id="132"/>
+    <w:bookmarkStart w:id="134" w:name="ref-openai2022chatgpt"/>
     <w:p>
       <w:pPr>
         <w:pStyle w:val="Bibliography"/>
@@ -12485,7 +13709,7 @@
       <w:r>
         <w:t xml:space="preserve"> </w:t>
       </w:r>
-      <w:hyperlink r:id="rId131">
+      <w:hyperlink r:id="rId133">
         <w:r>
           <w:rPr>
             <w:rStyle w:val="Hyperlink"/>
@@ -12494,8 +13718,8 @@
         </w:r>
       </w:hyperlink>
     </w:p>
-    <w:bookmarkEnd w:id="132"/>
-    <w:bookmarkStart w:id="134" w:name="ref-ramanUnveilingDynamicsAI2024"/>
+    <w:bookmarkEnd w:id="134"/>
+    <w:bookmarkStart w:id="136" w:name="ref-ramanUnveilingDynamicsAI2024"/>
     <w:p>
       <w:pPr>
         <w:pStyle w:val="Bibliography"/>
@@ -12568,7 +13792,7 @@
       <w:r>
         <w:t xml:space="preserve"> </w:t>
       </w:r>
-      <w:hyperlink r:id="rId133">
+      <w:hyperlink r:id="rId135">
         <w:r>
           <w:rPr>
             <w:rStyle w:val="Hyperlink"/>
@@ -12577,8 +13801,8 @@
         </w:r>
       </w:hyperlink>
     </w:p>
-    <w:bookmarkEnd w:id="134"/>
-    <w:bookmarkStart w:id="136" w:name="ref-reimers2019sentencebert"/>
+    <w:bookmarkEnd w:id="136"/>
+    <w:bookmarkStart w:id="138" w:name="ref-reimers2019sentencebert"/>
     <w:p>
       <w:pPr>
         <w:pStyle w:val="Bibliography"/>
@@ -12629,7 +13853,7 @@
       <w:r>
         <w:t xml:space="preserve"> </w:t>
       </w:r>
-      <w:hyperlink r:id="rId135">
+      <w:hyperlink r:id="rId137">
         <w:r>
           <w:rPr>
             <w:rStyle w:val="Hyperlink"/>
@@ -12638,8 +13862,8 @@
         </w:r>
       </w:hyperlink>
     </w:p>
-    <w:bookmarkEnd w:id="136"/>
-    <w:bookmarkStart w:id="138" w:name="ref-riandhiAIConsumerBehavior2025"/>
+    <w:bookmarkEnd w:id="138"/>
+    <w:bookmarkStart w:id="140" w:name="ref-riandhiAIConsumerBehavior2025"/>
     <w:p>
       <w:pPr>
         <w:pStyle w:val="Bibliography"/>
@@ -12697,7 +13921,7 @@
       <w:r>
         <w:t xml:space="preserve"> </w:t>
       </w:r>
-      <w:hyperlink r:id="rId137">
+      <w:hyperlink r:id="rId139">
         <w:r>
           <w:rPr>
             <w:rStyle w:val="Hyperlink"/>
@@ -12706,8 +13930,8 @@
         </w:r>
       </w:hyperlink>
     </w:p>
-    <w:bookmarkEnd w:id="138"/>
-    <w:bookmarkStart w:id="140" w:name="ref-roberts2021mediacloud"/>
+    <w:bookmarkEnd w:id="140"/>
+    <w:bookmarkStart w:id="142" w:name="ref-roberts2021mediacloud"/>
     <w:p>
       <w:pPr>
         <w:pStyle w:val="Bibliography"/>
@@ -12787,7 +14011,7 @@
       <w:r>
         <w:t xml:space="preserve"> </w:t>
       </w:r>
-      <w:hyperlink r:id="rId139">
+      <w:hyperlink r:id="rId141">
         <w:r>
           <w:rPr>
             <w:rStyle w:val="Hyperlink"/>
@@ -12796,8 +14020,8 @@
         </w:r>
       </w:hyperlink>
     </w:p>
-    <w:bookmarkEnd w:id="140"/>
-    <w:bookmarkStart w:id="142" w:name="ref-roggenkampEXPRESSDICEAdvancing2025"/>
+    <w:bookmarkEnd w:id="142"/>
+    <w:bookmarkStart w:id="144" w:name="ref-roggenkampEXPRESSDICEAdvancing2025"/>
     <w:p>
       <w:pPr>
         <w:pStyle w:val="Bibliography"/>
@@ -12860,7 +14084,7 @@
       <w:r>
         <w:t xml:space="preserve"> </w:t>
       </w:r>
-      <w:hyperlink r:id="rId141">
+      <w:hyperlink r:id="rId143">
         <w:r>
           <w:rPr>
             <w:rStyle w:val="Hyperlink"/>
@@ -12869,8 +14093,8 @@
         </w:r>
       </w:hyperlink>
     </w:p>
-    <w:bookmarkEnd w:id="142"/>
-    <w:bookmarkStart w:id="144" w:name="ref-rousseeuwSilhouettesGraphicalAid1987"/>
+    <w:bookmarkEnd w:id="144"/>
+    <w:bookmarkStart w:id="146" w:name="ref-rousseeuwSilhouettesGraphicalAid1987"/>
     <w:p>
       <w:pPr>
         <w:pStyle w:val="Bibliography"/>
@@ -12919,7 +14143,7 @@
       <w:r>
         <w:t xml:space="preserve"> </w:t>
       </w:r>
-      <w:hyperlink r:id="rId143">
+      <w:hyperlink r:id="rId145">
         <w:r>
           <w:rPr>
             <w:rStyle w:val="Hyperlink"/>
@@ -12928,8 +14152,8 @@
         </w:r>
       </w:hyperlink>
     </w:p>
-    <w:bookmarkEnd w:id="144"/>
-    <w:bookmarkStart w:id="146" w:name="ref-scheufeleFramingTheoryMedia1999"/>
+    <w:bookmarkEnd w:id="146"/>
+    <w:bookmarkStart w:id="148" w:name="ref-scheufeleFramingTheoryMedia1999"/>
     <w:p>
       <w:pPr>
         <w:pStyle w:val="Bibliography"/>
@@ -12987,7 +14211,7 @@
       <w:r>
         <w:t xml:space="preserve"> </w:t>
       </w:r>
-      <w:hyperlink r:id="rId145">
+      <w:hyperlink r:id="rId147">
         <w:r>
           <w:rPr>
             <w:rStyle w:val="Hyperlink"/>
@@ -12996,8 +14220,8 @@
         </w:r>
       </w:hyperlink>
     </w:p>
-    <w:bookmarkEnd w:id="146"/>
-    <w:bookmarkStart w:id="148" w:name="ref-MostVisitedWebsites"/>
+    <w:bookmarkEnd w:id="148"/>
+    <w:bookmarkStart w:id="150" w:name="ref-MostVisitedWebsites"/>
     <w:p>
       <w:pPr>
         <w:pStyle w:val="Bibliography"/>
@@ -13119,7 +14343,7 @@
       <w:r>
         <w:t xml:space="preserve"> </w:t>
       </w:r>
-      <w:hyperlink r:id="rId147">
+      <w:hyperlink r:id="rId149">
         <w:r>
           <w:rPr>
             <w:rStyle w:val="Hyperlink"/>
@@ -13128,8 +14352,8 @@
         </w:r>
       </w:hyperlink>
     </w:p>
-    <w:bookmarkEnd w:id="148"/>
-    <w:bookmarkStart w:id="150" w:name="ref-sentenceTransformersAllMiniLML6v2"/>
+    <w:bookmarkEnd w:id="150"/>
+    <w:bookmarkStart w:id="152" w:name="ref-sentenceTransformersAllMiniLML6v2"/>
     <w:p>
       <w:pPr>
         <w:pStyle w:val="Bibliography"/>
@@ -13160,7 +14384,7 @@
       <w:r>
         <w:t xml:space="preserve"> </w:t>
       </w:r>
-      <w:hyperlink r:id="rId149">
+      <w:hyperlink r:id="rId151">
         <w:r>
           <w:rPr>
             <w:rStyle w:val="Hyperlink"/>
@@ -13169,8 +14393,8 @@
         </w:r>
       </w:hyperlink>
     </w:p>
-    <w:bookmarkEnd w:id="150"/>
-    <w:bookmarkStart w:id="152" w:name="ref-smallCOCITATIONCONTEXTANALYSIS1980"/>
+    <w:bookmarkEnd w:id="152"/>
+    <w:bookmarkStart w:id="154" w:name="ref-smallCOCITATIONCONTEXTANALYSIS1980"/>
     <w:p>
       <w:pPr>
         <w:pStyle w:val="Bibliography"/>
@@ -13222,7 +14446,7 @@
       <w:r>
         <w:t xml:space="preserve"> </w:t>
       </w:r>
-      <w:hyperlink r:id="rId151">
+      <w:hyperlink r:id="rId153">
         <w:r>
           <w:rPr>
             <w:rStyle w:val="Hyperlink"/>
@@ -13231,8 +14455,8 @@
         </w:r>
       </w:hyperlink>
     </w:p>
-    <w:bookmarkEnd w:id="152"/>
-    <w:bookmarkStart w:id="153" w:name="ref-aigeneratedalgorithm2026"/>
+    <w:bookmarkEnd w:id="154"/>
+    <w:bookmarkStart w:id="155" w:name="ref-aigeneratedalgorithm2026"/>
     <w:p>
       <w:pPr>
         <w:pStyle w:val="Bibliography"/>
@@ -13263,8 +14487,8 @@
         <w:t xml:space="preserve">.</w:t>
       </w:r>
     </w:p>
-    <w:bookmarkEnd w:id="153"/>
-    <w:bookmarkStart w:id="155" w:name="X19b8dd2f280f6120269f36e58656b3b5b75516c"/>
+    <w:bookmarkEnd w:id="155"/>
+    <w:bookmarkStart w:id="157" w:name="X19b8dd2f280f6120269f36e58656b3b5b75516c"/>
     <w:p>
       <w:pPr>
         <w:pStyle w:val="Bibliography"/>
@@ -13377,7 +14601,7 @@
       <w:r>
         <w:t xml:space="preserve"> </w:t>
       </w:r>
-      <w:hyperlink r:id="rId154">
+      <w:hyperlink r:id="rId156">
         <w:r>
           <w:rPr>
             <w:rStyle w:val="Hyperlink"/>
@@ -13386,8 +14610,8 @@
         </w:r>
       </w:hyperlink>
     </w:p>
-    <w:bookmarkEnd w:id="155"/>
-    <w:bookmarkStart w:id="157" w:name="ref-wangEditorialChangingLandscape2026"/>
+    <w:bookmarkEnd w:id="157"/>
+    <w:bookmarkStart w:id="159" w:name="ref-wangEditorialChangingLandscape2026"/>
     <w:p>
       <w:pPr>
         <w:pStyle w:val="Bibliography"/>
@@ -13448,7 +14672,7 @@
       <w:r>
         <w:t xml:space="preserve"> </w:t>
       </w:r>
-      <w:hyperlink r:id="rId156">
+      <w:hyperlink r:id="rId158">
         <w:r>
           <w:rPr>
             <w:rStyle w:val="Hyperlink"/>
@@ -13457,8 +14681,8 @@
         </w:r>
       </w:hyperlink>
     </w:p>
-    <w:bookmarkEnd w:id="157"/>
-    <w:bookmarkStart w:id="158" w:name="ref-wang2020minilm"/>
+    <w:bookmarkEnd w:id="159"/>
+    <w:bookmarkStart w:id="160" w:name="ref-wang2020minilm"/>
     <w:p>
       <w:pPr>
         <w:pStyle w:val="Bibliography"/>
@@ -13514,8 +14738,8 @@
         <w:t xml:space="preserve">, 5776–5788.</w:t>
       </w:r>
     </w:p>
-    <w:bookmarkEnd w:id="158"/>
-    <w:bookmarkStart w:id="160" w:name="ref-winderBiasedEchoesLarge2025"/>
+    <w:bookmarkEnd w:id="160"/>
+    <w:bookmarkStart w:id="162" w:name="ref-winderBiasedEchoesLarge2025"/>
     <w:p>
       <w:pPr>
         <w:pStyle w:val="Bibliography"/>
@@ -13564,7 +14788,7 @@
       <w:r>
         <w:t xml:space="preserve"> </w:t>
       </w:r>
-      <w:hyperlink r:id="rId159">
+      <w:hyperlink r:id="rId161">
         <w:r>
           <w:rPr>
             <w:rStyle w:val="Hyperlink"/>
@@ -13573,8 +14797,8 @@
         </w:r>
       </w:hyperlink>
     </w:p>
-    <w:bookmarkEnd w:id="160"/>
-    <w:bookmarkStart w:id="162" w:name="ref-wulffEscapingJingleJangleJungle2026"/>
+    <w:bookmarkEnd w:id="162"/>
+    <w:bookmarkStart w:id="164" w:name="ref-wulffEscapingJingleJangleJungle2026"/>
     <w:p>
       <w:pPr>
         <w:pStyle w:val="Bibliography"/>
@@ -13641,7 +14865,7 @@
       <w:r>
         <w:t xml:space="preserve"> </w:t>
       </w:r>
-      <w:hyperlink r:id="rId161">
+      <w:hyperlink r:id="rId163">
         <w:r>
           <w:rPr>
             <w:rStyle w:val="Hyperlink"/>
@@ -13650,8 +14874,8 @@
         </w:r>
       </w:hyperlink>
     </w:p>
-    <w:bookmarkEnd w:id="162"/>
-    <w:bookmarkStart w:id="164" w:name="ref-zacharyAIRevolutionLatest2026"/>
+    <w:bookmarkEnd w:id="164"/>
+    <w:bookmarkStart w:id="166" w:name="ref-zacharyAIRevolutionLatest2026"/>
     <w:p>
       <w:pPr>
         <w:pStyle w:val="Bibliography"/>
@@ -13780,7 +15004,7 @@
       <w:r>
         <w:t xml:space="preserve"> </w:t>
       </w:r>
-      <w:hyperlink r:id="rId163">
+      <w:hyperlink r:id="rId165">
         <w:r>
           <w:rPr>
             <w:rStyle w:val="Hyperlink"/>
@@ -13789,9 +15013,9 @@
         </w:r>
       </w:hyperlink>
     </w:p>
-    <w:bookmarkEnd w:id="164"/>
-    <w:bookmarkEnd w:id="165"/>
     <w:bookmarkEnd w:id="166"/>
+    <w:bookmarkEnd w:id="167"/>
+    <w:bookmarkEnd w:id="168"/>
     <w:sectPr>
       <w:headerReference r:id="rId8" w:type="even"/>
       <w:headerReference r:id="rId9" w:type="default"/>

</xml_diff>

<commit_message>
Publish website from b2618d8
</commit_message>
<xml_diff>
--- a/99_writing/mapping-the-field-manuscript.docx
+++ b/99_writing/mapping-the-field-manuscript.docx
@@ -3232,7 +3232,7 @@
         <w:pStyle w:val="Caption"/>
       </w:pPr>
       <w:r>
-        <w:t xml:space="preserve">Total mentions, peak year and peak share of each technology cluster within consumer-technology research, estimated with a negative-binomial generalized additive model of yearly mentions on a smooth of publication year, offset by all technology mentions of that year. Mentions are the cluster’s total mentions across 2000-2026, counted once per article and technology. The peak is the maximum of the fitted curve; a peak in the first or last year of the observation period indicates a cluster that declines or rises throughout rather than one that crests within it. The</w:t>
+        <w:t xml:space="preserve">Total mentions, peak year, observed and fitted share at the peak, effective degrees of freedom and</w:t>
       </w:r>
       <w:r>
         <w:t xml:space="preserve"> </w:t>
@@ -3243,22 +3243,57 @@
         </m:r>
       </m:oMath>
       <w:r>
-        <w:t xml:space="preserve">-value tests the smooth against a flat trend. The fitted curves for all clusters are shown in Appendix B.</w:t>
+        <w:t xml:space="preserve">-values of each technology cluster within consumer-technology research, estimated with one negative-binomial generalized additive model per cluster of yearly mentions on a smooth of publication year (k = 10), offset by all technology mentions of that year. Mentions are the cluster’s total mentions across 2000-2026. The peak is the maximum of the fitted curve. The</w:t>
+      </w:r>
+      <w:r>
+        <w:t xml:space="preserve"> </w:t>
+      </w:r>
+      <m:oMath>
+        <m:r>
+          <m:t>p</m:t>
+        </m:r>
+      </m:oMath>
+      <w:r>
+        <w:t xml:space="preserve">-value tests the smooth against a flat trend;</w:t>
+      </w:r>
+      <w:r>
+        <w:t xml:space="preserve"> </w:t>
+      </w:r>
+      <m:oMath>
+        <m:r>
+          <m:t>p</m:t>
+        </m:r>
+      </m:oMath>
+      <w:r>
+        <w:rPr>
+          <w:vertAlign w:val="subscript"/>
+        </w:rPr>
+        <w:t xml:space="preserve">BH</w:t>
+      </w:r>
+      <w:r>
+        <w:t xml:space="preserve"> </w:t>
+      </w:r>
+      <w:r>
+        <w:t xml:space="preserve">is Benjamini-Hochberg adjusted across the 16 clusters.</w:t>
       </w:r>
     </w:p>
     <w:bookmarkStart w:id="45" w:name="tbl-peaks"/>
     <w:tbl>
       <w:tblPr>
         <w:tblStyle w:val="Table"/>
-        <w:tblW w:type="auto" w:w="0"/>
+        <w:tblW w:type="pct" w:w="5000"/>
+        <w:tblLayout w:type="fixed"/>
         <w:tblLook w:firstRow="1" w:lastRow="0" w:firstColumn="0" w:lastColumn="0" w:noHBand="0" w:noVBand="0" w:val="0020"/>
       </w:tblPr>
       <w:tblGrid>
-        <w:gridCol w:w="1584"/>
-        <w:gridCol w:w="1584"/>
-        <w:gridCol w:w="1584"/>
-        <w:gridCol w:w="1584"/>
-        <w:gridCol w:w="1584"/>
+        <w:gridCol w:w="766"/>
+        <w:gridCol w:w="1021"/>
+        <w:gridCol w:w="1021"/>
+        <w:gridCol w:w="1021"/>
+        <w:gridCol w:w="1021"/>
+        <w:gridCol w:w="1021"/>
+        <w:gridCol w:w="1021"/>
+        <w:gridCol w:w="1021"/>
       </w:tblGrid>
       <w:tr>
         <w:trPr>
@@ -3271,6 +3306,18 @@
               <w:pStyle w:val="Compact"/>
             </w:pPr>
             <w:r>
+              <w:t xml:space="preserve">edf</w:t>
+            </w:r>
+          </w:p>
+        </w:tc>
+        <w:tc>
+          <w:tcPr/>
+          <w:p>
+            <w:pPr>
+              <w:pStyle w:val="Compact"/>
+              <w:jc w:val="right"/>
+            </w:pPr>
+            <w:r>
               <w:t xml:space="preserve">Technology cluster</w:t>
             </w:r>
           </w:p>
@@ -3307,7 +3354,19 @@
               <w:jc w:val="right"/>
             </w:pPr>
             <w:r>
-              <w:t xml:space="preserve">Peak share</w:t>
+              <w:t xml:space="preserve">Observed share</w:t>
+            </w:r>
+          </w:p>
+        </w:tc>
+        <w:tc>
+          <w:tcPr/>
+          <w:p>
+            <w:pPr>
+              <w:pStyle w:val="Compact"/>
+              <w:jc w:val="right"/>
+            </w:pPr>
+            <w:r>
+              <w:t xml:space="preserve">Fitted share</w:t>
             </w:r>
           </w:p>
         </w:tc>
@@ -3327,6 +3386,28 @@
             </w:r>
           </w:p>
         </w:tc>
+        <w:tc>
+          <w:tcPr/>
+          <w:p>
+            <w:pPr>
+              <w:pStyle w:val="Compact"/>
+              <w:jc w:val="right"/>
+            </w:pPr>
+            <w:r>
+              <w:rPr>
+                <w:i/>
+                <w:iCs/>
+              </w:rPr>
+              <w:t xml:space="preserve">p</w:t>
+            </w:r>
+            <w:r>
+              <w:rPr>
+                <w:vertAlign w:val="subscript"/>
+              </w:rPr>
+              <w:t xml:space="preserve">BH</w:t>
+            </w:r>
+          </w:p>
+        </w:tc>
       </w:tr>
       <w:tr>
         <w:tc>
@@ -3336,6 +3417,18 @@
               <w:pStyle w:val="Compact"/>
             </w:pPr>
             <w:r>
+              <w:t xml:space="preserve">1.30</w:t>
+            </w:r>
+          </w:p>
+        </w:tc>
+        <w:tc>
+          <w:tcPr/>
+          <w:p>
+            <w:pPr>
+              <w:pStyle w:val="Compact"/>
+              <w:jc w:val="right"/>
+            </w:pPr>
+            <w:r>
               <w:t xml:space="preserve">Algorithms &amp; Recommendations</w:t>
             </w:r>
           </w:p>
@@ -3372,6 +3465,18 @@
               <w:jc w:val="right"/>
             </w:pPr>
             <w:r>
+              <w:t xml:space="preserve">4.2%</w:t>
+            </w:r>
+          </w:p>
+        </w:tc>
+        <w:tc>
+          <w:tcPr/>
+          <w:p>
+            <w:pPr>
+              <w:pStyle w:val="Compact"/>
+              <w:jc w:val="right"/>
+            </w:pPr>
+            <w:r>
               <w:t xml:space="preserve">7.2%</w:t>
             </w:r>
           </w:p>
@@ -3384,7 +3489,19 @@
               <w:jc w:val="right"/>
             </w:pPr>
             <w:r>
-              <w:t xml:space="preserve">.604</w:t>
+              <w:t xml:space="preserve">.605</w:t>
+            </w:r>
+          </w:p>
+        </w:tc>
+        <w:tc>
+          <w:tcPr/>
+          <w:p>
+            <w:pPr>
+              <w:pStyle w:val="Compact"/>
+              <w:jc w:val="right"/>
+            </w:pPr>
+            <w:r>
+              <w:t xml:space="preserve">.646</w:t>
             </w:r>
           </w:p>
         </w:tc>
@@ -3397,6 +3514,18 @@
               <w:pStyle w:val="Compact"/>
             </w:pPr>
             <w:r>
+              <w:t xml:space="preserve">1.00</w:t>
+            </w:r>
+          </w:p>
+        </w:tc>
+        <w:tc>
+          <w:tcPr/>
+          <w:p>
+            <w:pPr>
+              <w:pStyle w:val="Compact"/>
+              <w:jc w:val="right"/>
+            </w:pPr>
+            <w:r>
               <w:t xml:space="preserve">AR, VR &amp; Robots</w:t>
             </w:r>
           </w:p>
@@ -3433,6 +3562,18 @@
               <w:jc w:val="right"/>
             </w:pPr>
             <w:r>
+              <w:t xml:space="preserve">7.6%</w:t>
+            </w:r>
+          </w:p>
+        </w:tc>
+        <w:tc>
+          <w:tcPr/>
+          <w:p>
+            <w:pPr>
+              <w:pStyle w:val="Compact"/>
+              <w:jc w:val="right"/>
+            </w:pPr>
+            <w:r>
               <w:t xml:space="preserve">6.0%</w:t>
             </w:r>
           </w:p>
@@ -3446,6 +3587,18 @@
             </w:pPr>
             <w:r>
               <w:t xml:space="preserve">&lt; .001</w:t>
+            </w:r>
+          </w:p>
+        </w:tc>
+        <w:tc>
+          <w:tcPr/>
+          <w:p>
+            <w:pPr>
+              <w:pStyle w:val="Compact"/>
+              <w:jc w:val="right"/>
+            </w:pPr>
+            <w:r>
+              <w:t xml:space="preserve">.003</w:t>
             </w:r>
           </w:p>
         </w:tc>
@@ -3458,6 +3611,18 @@
               <w:pStyle w:val="Compact"/>
             </w:pPr>
             <w:r>
+              <w:t xml:space="preserve">2.94</w:t>
+            </w:r>
+          </w:p>
+        </w:tc>
+        <w:tc>
+          <w:tcPr/>
+          <w:p>
+            <w:pPr>
+              <w:pStyle w:val="Compact"/>
+              <w:jc w:val="right"/>
+            </w:pPr>
+            <w:r>
               <w:t xml:space="preserve">Auctions &amp; Pricing</w:t>
             </w:r>
           </w:p>
@@ -3494,6 +3659,18 @@
               <w:jc w:val="right"/>
             </w:pPr>
             <w:r>
+              <w:t xml:space="preserve">10.7%</w:t>
+            </w:r>
+          </w:p>
+        </w:tc>
+        <w:tc>
+          <w:tcPr/>
+          <w:p>
+            <w:pPr>
+              <w:pStyle w:val="Compact"/>
+              <w:jc w:val="right"/>
+            </w:pPr>
+            <w:r>
               <w:t xml:space="preserve">5.4%</w:t>
             </w:r>
           </w:p>
@@ -3506,7 +3683,19 @@
               <w:jc w:val="right"/>
             </w:pPr>
             <w:r>
-              <w:t xml:space="preserve">.004</w:t>
+              <w:t xml:space="preserve">.006</w:t>
+            </w:r>
+          </w:p>
+        </w:tc>
+        <w:tc>
+          <w:tcPr/>
+          <w:p>
+            <w:pPr>
+              <w:pStyle w:val="Compact"/>
+              <w:jc w:val="right"/>
+            </w:pPr>
+            <w:r>
+              <w:t xml:space="preserve">.011</w:t>
             </w:r>
           </w:p>
         </w:tc>
@@ -3519,6 +3708,18 @@
               <w:pStyle w:val="Compact"/>
             </w:pPr>
             <w:r>
+              <w:t xml:space="preserve">1.77</w:t>
+            </w:r>
+          </w:p>
+        </w:tc>
+        <w:tc>
+          <w:tcPr/>
+          <w:p>
+            <w:pPr>
+              <w:pStyle w:val="Compact"/>
+              <w:jc w:val="right"/>
+            </w:pPr>
+            <w:r>
               <w:t xml:space="preserve">Computers &amp; Software</w:t>
             </w:r>
           </w:p>
@@ -3555,7 +3756,31 @@
               <w:jc w:val="right"/>
             </w:pPr>
             <w:r>
+              <w:t xml:space="preserve">19.2%</w:t>
+            </w:r>
+          </w:p>
+        </w:tc>
+        <w:tc>
+          <w:tcPr/>
+          <w:p>
+            <w:pPr>
+              <w:pStyle w:val="Compact"/>
+              <w:jc w:val="right"/>
+            </w:pPr>
+            <w:r>
               <w:t xml:space="preserve">21.5%</w:t>
+            </w:r>
+          </w:p>
+        </w:tc>
+        <w:tc>
+          <w:tcPr/>
+          <w:p>
+            <w:pPr>
+              <w:pStyle w:val="Compact"/>
+              <w:jc w:val="right"/>
+            </w:pPr>
+            <w:r>
+              <w:t xml:space="preserve">&lt; .001</w:t>
             </w:r>
           </w:p>
         </w:tc>
@@ -3580,6 +3805,18 @@
               <w:pStyle w:val="Compact"/>
             </w:pPr>
             <w:r>
+              <w:t xml:space="preserve">2.16</w:t>
+            </w:r>
+          </w:p>
+        </w:tc>
+        <w:tc>
+          <w:tcPr/>
+          <w:p>
+            <w:pPr>
+              <w:pStyle w:val="Compact"/>
+              <w:jc w:val="right"/>
+            </w:pPr>
+            <w:r>
               <w:t xml:space="preserve">Crypto &amp; Fintech</w:t>
             </w:r>
           </w:p>
@@ -3616,19 +3853,43 @@
               <w:jc w:val="right"/>
             </w:pPr>
             <w:r>
-              <w:t xml:space="preserve">10.5%</w:t>
-            </w:r>
-          </w:p>
-        </w:tc>
-        <w:tc>
-          <w:tcPr/>
-          <w:p>
-            <w:pPr>
-              <w:pStyle w:val="Compact"/>
-              <w:jc w:val="right"/>
-            </w:pPr>
-            <w:r>
-              <w:t xml:space="preserve">.034</w:t>
+              <w:t xml:space="preserve">7.6%</w:t>
+            </w:r>
+          </w:p>
+        </w:tc>
+        <w:tc>
+          <w:tcPr/>
+          <w:p>
+            <w:pPr>
+              <w:pStyle w:val="Compact"/>
+              <w:jc w:val="right"/>
+            </w:pPr>
+            <w:r>
+              <w:t xml:space="preserve">10.4%</w:t>
+            </w:r>
+          </w:p>
+        </w:tc>
+        <w:tc>
+          <w:tcPr/>
+          <w:p>
+            <w:pPr>
+              <w:pStyle w:val="Compact"/>
+              <w:jc w:val="right"/>
+            </w:pPr>
+            <w:r>
+              <w:t xml:space="preserve">.038</w:t>
+            </w:r>
+          </w:p>
+        </w:tc>
+        <w:tc>
+          <w:tcPr/>
+          <w:p>
+            <w:pPr>
+              <w:pStyle w:val="Compact"/>
+              <w:jc w:val="right"/>
+            </w:pPr>
+            <w:r>
+              <w:t xml:space="preserve">.061</w:t>
             </w:r>
           </w:p>
         </w:tc>
@@ -3641,6 +3902,18 @@
               <w:pStyle w:val="Compact"/>
             </w:pPr>
             <w:r>
+              <w:t xml:space="preserve">1.00</w:t>
+            </w:r>
+          </w:p>
+        </w:tc>
+        <w:tc>
+          <w:tcPr/>
+          <w:p>
+            <w:pPr>
+              <w:pStyle w:val="Compact"/>
+              <w:jc w:val="right"/>
+            </w:pPr>
+            <w:r>
               <w:t xml:space="preserve">E-Commerce</w:t>
             </w:r>
           </w:p>
@@ -3677,6 +3950,18 @@
               <w:jc w:val="right"/>
             </w:pPr>
             <w:r>
+              <w:t xml:space="preserve">15.4%</w:t>
+            </w:r>
+          </w:p>
+        </w:tc>
+        <w:tc>
+          <w:tcPr/>
+          <w:p>
+            <w:pPr>
+              <w:pStyle w:val="Compact"/>
+              <w:jc w:val="right"/>
+            </w:pPr>
+            <w:r>
               <w:t xml:space="preserve">11.6%</w:t>
             </w:r>
           </w:p>
@@ -3690,6 +3975,18 @@
             </w:pPr>
             <w:r>
               <w:t xml:space="preserve">.001</w:t>
+            </w:r>
+          </w:p>
+        </w:tc>
+        <w:tc>
+          <w:tcPr/>
+          <w:p>
+            <w:pPr>
+              <w:pStyle w:val="Compact"/>
+              <w:jc w:val="right"/>
+            </w:pPr>
+            <w:r>
+              <w:t xml:space="preserve">.003</w:t>
             </w:r>
           </w:p>
         </w:tc>
@@ -3702,6 +3999,18 @@
               <w:pStyle w:val="Compact"/>
             </w:pPr>
             <w:r>
+              <w:t xml:space="preserve">1.00</w:t>
+            </w:r>
+          </w:p>
+        </w:tc>
+        <w:tc>
+          <w:tcPr/>
+          <w:p>
+            <w:pPr>
+              <w:pStyle w:val="Compact"/>
+              <w:jc w:val="right"/>
+            </w:pPr>
+            <w:r>
               <w:t xml:space="preserve">Gaming &amp; Digital Platforms</w:t>
             </w:r>
           </w:p>
@@ -3738,6 +4047,18 @@
               <w:jc w:val="right"/>
             </w:pPr>
             <w:r>
+              <w:t xml:space="preserve">7.6%</w:t>
+            </w:r>
+          </w:p>
+        </w:tc>
+        <w:tc>
+          <w:tcPr/>
+          <w:p>
+            <w:pPr>
+              <w:pStyle w:val="Compact"/>
+              <w:jc w:val="right"/>
+            </w:pPr>
+            <w:r>
               <w:t xml:space="preserve">9.4%</w:t>
             </w:r>
           </w:p>
@@ -3751,6 +4072,18 @@
             </w:pPr>
             <w:r>
               <w:t xml:space="preserve">.002</w:t>
+            </w:r>
+          </w:p>
+        </w:tc>
+        <w:tc>
+          <w:tcPr/>
+          <w:p>
+            <w:pPr>
+              <w:pStyle w:val="Compact"/>
+              <w:jc w:val="right"/>
+            </w:pPr>
+            <w:r>
+              <w:t xml:space="preserve">.006</w:t>
             </w:r>
           </w:p>
         </w:tc>
@@ -3763,7 +4096,19 @@
               <w:pStyle w:val="Compact"/>
             </w:pPr>
             <w:r>
-              <w:t xml:space="preserve">Generative AI</w:t>
+              <w:t xml:space="preserve">2.72</w:t>
+            </w:r>
+          </w:p>
+        </w:tc>
+        <w:tc>
+          <w:tcPr/>
+          <w:p>
+            <w:pPr>
+              <w:pStyle w:val="Compact"/>
+              <w:jc w:val="right"/>
+            </w:pPr>
+            <w:r>
+              <w:t xml:space="preserve">(Generative) AI</w:t>
             </w:r>
           </w:p>
         </w:tc>
@@ -3799,7 +4144,31 @@
               <w:jc w:val="right"/>
             </w:pPr>
             <w:r>
-              <w:t xml:space="preserve">30.2%</w:t>
+              <w:t xml:space="preserve">28.6%</w:t>
+            </w:r>
+          </w:p>
+        </w:tc>
+        <w:tc>
+          <w:tcPr/>
+          <w:p>
+            <w:pPr>
+              <w:pStyle w:val="Compact"/>
+              <w:jc w:val="right"/>
+            </w:pPr>
+            <w:r>
+              <w:t xml:space="preserve">29.7%</w:t>
+            </w:r>
+          </w:p>
+        </w:tc>
+        <w:tc>
+          <w:tcPr/>
+          <w:p>
+            <w:pPr>
+              <w:pStyle w:val="Compact"/>
+              <w:jc w:val="right"/>
+            </w:pPr>
+            <w:r>
+              <w:t xml:space="preserve">&lt; .001</w:t>
             </w:r>
           </w:p>
         </w:tc>
@@ -3824,6 +4193,18 @@
               <w:pStyle w:val="Compact"/>
             </w:pPr>
             <w:r>
+              <w:t xml:space="preserve">1.00</w:t>
+            </w:r>
+          </w:p>
+        </w:tc>
+        <w:tc>
+          <w:tcPr/>
+          <w:p>
+            <w:pPr>
+              <w:pStyle w:val="Compact"/>
+              <w:jc w:val="right"/>
+            </w:pPr>
+            <w:r>
               <w:t xml:space="preserve">Internet &amp; Broadcasting</w:t>
             </w:r>
           </w:p>
@@ -3860,7 +4241,31 @@
               <w:jc w:val="right"/>
             </w:pPr>
             <w:r>
+              <w:t xml:space="preserve">23.1%</w:t>
+            </w:r>
+          </w:p>
+        </w:tc>
+        <w:tc>
+          <w:tcPr/>
+          <w:p>
+            <w:pPr>
+              <w:pStyle w:val="Compact"/>
+              <w:jc w:val="right"/>
+            </w:pPr>
+            <w:r>
               <w:t xml:space="preserve">29.4%</w:t>
+            </w:r>
+          </w:p>
+        </w:tc>
+        <w:tc>
+          <w:tcPr/>
+          <w:p>
+            <w:pPr>
+              <w:pStyle w:val="Compact"/>
+              <w:jc w:val="right"/>
+            </w:pPr>
+            <w:r>
+              <w:t xml:space="preserve">&lt; .001</w:t>
             </w:r>
           </w:p>
         </w:tc>
@@ -3885,6 +4290,18 @@
               <w:pStyle w:val="Compact"/>
             </w:pPr>
             <w:r>
+              <w:t xml:space="preserve">1.00</w:t>
+            </w:r>
+          </w:p>
+        </w:tc>
+        <w:tc>
+          <w:tcPr/>
+          <w:p>
+            <w:pPr>
+              <w:pStyle w:val="Compact"/>
+              <w:jc w:val="right"/>
+            </w:pPr>
+            <w:r>
               <w:t xml:space="preserve">Mobility &amp; Transportation</w:t>
             </w:r>
           </w:p>
@@ -3921,7 +4338,31 @@
               <w:jc w:val="right"/>
             </w:pPr>
             <w:r>
+              <w:t xml:space="preserve">3.8%</w:t>
+            </w:r>
+          </w:p>
+        </w:tc>
+        <w:tc>
+          <w:tcPr/>
+          <w:p>
+            <w:pPr>
+              <w:pStyle w:val="Compact"/>
+              <w:jc w:val="right"/>
+            </w:pPr>
+            <w:r>
               <w:t xml:space="preserve">1.8%</w:t>
+            </w:r>
+          </w:p>
+        </w:tc>
+        <w:tc>
+          <w:tcPr/>
+          <w:p>
+            <w:pPr>
+              <w:pStyle w:val="Compact"/>
+              <w:jc w:val="right"/>
+            </w:pPr>
+            <w:r>
+              <w:t xml:space="preserve">.942</w:t>
             </w:r>
           </w:p>
         </w:tc>
@@ -3946,6 +4387,18 @@
               <w:pStyle w:val="Compact"/>
             </w:pPr>
             <w:r>
+              <w:t xml:space="preserve">1.00</w:t>
+            </w:r>
+          </w:p>
+        </w:tc>
+        <w:tc>
+          <w:tcPr/>
+          <w:p>
+            <w:pPr>
+              <w:pStyle w:val="Compact"/>
+              <w:jc w:val="right"/>
+            </w:pPr>
+            <w:r>
               <w:t xml:space="preserve">Search &amp; Advertising</w:t>
             </w:r>
           </w:p>
@@ -3982,6 +4435,18 @@
               <w:jc w:val="right"/>
             </w:pPr>
             <w:r>
+              <w:t xml:space="preserve">3.8%</w:t>
+            </w:r>
+          </w:p>
+        </w:tc>
+        <w:tc>
+          <w:tcPr/>
+          <w:p>
+            <w:pPr>
+              <w:pStyle w:val="Compact"/>
+              <w:jc w:val="right"/>
+            </w:pPr>
+            <w:r>
               <w:t xml:space="preserve">12.2%</w:t>
             </w:r>
           </w:p>
@@ -3995,6 +4460,18 @@
             </w:pPr>
             <w:r>
               <w:t xml:space="preserve">.012</w:t>
+            </w:r>
+          </w:p>
+        </w:tc>
+        <w:tc>
+          <w:tcPr/>
+          <w:p>
+            <w:pPr>
+              <w:pStyle w:val="Compact"/>
+              <w:jc w:val="right"/>
+            </w:pPr>
+            <w:r>
+              <w:t xml:space="preserve">.022</w:t>
             </w:r>
           </w:p>
         </w:tc>
@@ -4007,6 +4484,18 @@
               <w:pStyle w:val="Compact"/>
             </w:pPr>
             <w:r>
+              <w:t xml:space="preserve">3.35</w:t>
+            </w:r>
+          </w:p>
+        </w:tc>
+        <w:tc>
+          <w:tcPr/>
+          <w:p>
+            <w:pPr>
+              <w:pStyle w:val="Compact"/>
+              <w:jc w:val="right"/>
+            </w:pPr>
+            <w:r>
               <w:t xml:space="preserve">Smartphones &amp; Apps</w:t>
             </w:r>
           </w:p>
@@ -4031,31 +4520,55 @@
               <w:jc w:val="right"/>
             </w:pPr>
             <w:r>
-              <w:t xml:space="preserve">2017</w:t>
-            </w:r>
-          </w:p>
-        </w:tc>
-        <w:tc>
-          <w:tcPr/>
-          <w:p>
-            <w:pPr>
-              <w:pStyle w:val="Compact"/>
-              <w:jc w:val="right"/>
-            </w:pPr>
-            <w:r>
-              <w:t xml:space="preserve">11.9%</w:t>
-            </w:r>
-          </w:p>
-        </w:tc>
-        <w:tc>
-          <w:tcPr/>
-          <w:p>
-            <w:pPr>
-              <w:pStyle w:val="Compact"/>
-              <w:jc w:val="right"/>
-            </w:pPr>
-            <w:r>
-              <w:t xml:space="preserve">.041</w:t>
+              <w:t xml:space="preserve">2018</w:t>
+            </w:r>
+          </w:p>
+        </w:tc>
+        <w:tc>
+          <w:tcPr/>
+          <w:p>
+            <w:pPr>
+              <w:pStyle w:val="Compact"/>
+              <w:jc w:val="right"/>
+            </w:pPr>
+            <w:r>
+              <w:t xml:space="preserve">15.6%</w:t>
+            </w:r>
+          </w:p>
+        </w:tc>
+        <w:tc>
+          <w:tcPr/>
+          <w:p>
+            <w:pPr>
+              <w:pStyle w:val="Compact"/>
+              <w:jc w:val="right"/>
+            </w:pPr>
+            <w:r>
+              <w:t xml:space="preserve">12.4%</w:t>
+            </w:r>
+          </w:p>
+        </w:tc>
+        <w:tc>
+          <w:tcPr/>
+          <w:p>
+            <w:pPr>
+              <w:pStyle w:val="Compact"/>
+              <w:jc w:val="right"/>
+            </w:pPr>
+            <w:r>
+              <w:t xml:space="preserve">.048</w:t>
+            </w:r>
+          </w:p>
+        </w:tc>
+        <w:tc>
+          <w:tcPr/>
+          <w:p>
+            <w:pPr>
+              <w:pStyle w:val="Compact"/>
+              <w:jc w:val="right"/>
+            </w:pPr>
+            <w:r>
+              <w:t xml:space="preserve">.069</w:t>
             </w:r>
           </w:p>
         </w:tc>
@@ -4068,6 +4581,18 @@
               <w:pStyle w:val="Compact"/>
             </w:pPr>
             <w:r>
+              <w:t xml:space="preserve">4.55</w:t>
+            </w:r>
+          </w:p>
+        </w:tc>
+        <w:tc>
+          <w:tcPr/>
+          <w:p>
+            <w:pPr>
+              <w:pStyle w:val="Compact"/>
+              <w:jc w:val="right"/>
+            </w:pPr>
+            <w:r>
               <w:t xml:space="preserve">Social Media</w:t>
             </w:r>
           </w:p>
@@ -4092,19 +4617,43 @@
               <w:jc w:val="right"/>
             </w:pPr>
             <w:r>
-              <w:t xml:space="preserve">2016</w:t>
-            </w:r>
-          </w:p>
-        </w:tc>
-        <w:tc>
-          <w:tcPr/>
-          <w:p>
-            <w:pPr>
-              <w:pStyle w:val="Compact"/>
-              <w:jc w:val="right"/>
-            </w:pPr>
-            <w:r>
-              <w:t xml:space="preserve">24.1%</w:t>
+              <w:t xml:space="preserve">2017</w:t>
+            </w:r>
+          </w:p>
+        </w:tc>
+        <w:tc>
+          <w:tcPr/>
+          <w:p>
+            <w:pPr>
+              <w:pStyle w:val="Compact"/>
+              <w:jc w:val="right"/>
+            </w:pPr>
+            <w:r>
+              <w:t xml:space="preserve">31.9%</w:t>
+            </w:r>
+          </w:p>
+        </w:tc>
+        <w:tc>
+          <w:tcPr/>
+          <w:p>
+            <w:pPr>
+              <w:pStyle w:val="Compact"/>
+              <w:jc w:val="right"/>
+            </w:pPr>
+            <w:r>
+              <w:t xml:space="preserve">24.4%</w:t>
+            </w:r>
+          </w:p>
+        </w:tc>
+        <w:tc>
+          <w:tcPr/>
+          <w:p>
+            <w:pPr>
+              <w:pStyle w:val="Compact"/>
+              <w:jc w:val="right"/>
+            </w:pPr>
+            <w:r>
+              <w:t xml:space="preserve">&lt; .001</w:t>
             </w:r>
           </w:p>
         </w:tc>
@@ -4129,6 +4678,18 @@
               <w:pStyle w:val="Compact"/>
             </w:pPr>
             <w:r>
+              <w:t xml:space="preserve">1.00</w:t>
+            </w:r>
+          </w:p>
+        </w:tc>
+        <w:tc>
+          <w:tcPr/>
+          <w:p>
+            <w:pPr>
+              <w:pStyle w:val="Compact"/>
+              <w:jc w:val="right"/>
+            </w:pPr>
+            <w:r>
               <w:t xml:space="preserve">Streaming, Audio &amp; Video</w:t>
             </w:r>
           </w:p>
@@ -4165,6 +4726,18 @@
               <w:jc w:val="right"/>
             </w:pPr>
             <w:r>
+              <w:t xml:space="preserve">6.7%</w:t>
+            </w:r>
+          </w:p>
+        </w:tc>
+        <w:tc>
+          <w:tcPr/>
+          <w:p>
+            <w:pPr>
+              <w:pStyle w:val="Compact"/>
+              <w:jc w:val="right"/>
+            </w:pPr>
+            <w:r>
               <w:t xml:space="preserve">4.6%</w:t>
             </w:r>
           </w:p>
@@ -4178,6 +4751,18 @@
             </w:pPr>
             <w:r>
               <w:t xml:space="preserve">.153</w:t>
+            </w:r>
+          </w:p>
+        </w:tc>
+        <w:tc>
+          <w:tcPr/>
+          <w:p>
+            <w:pPr>
+              <w:pStyle w:val="Compact"/>
+              <w:jc w:val="right"/>
+            </w:pPr>
+            <w:r>
+              <w:t xml:space="preserve">.204</w:t>
             </w:r>
           </w:p>
         </w:tc>
@@ -4190,6 +4775,18 @@
               <w:pStyle w:val="Compact"/>
             </w:pPr>
             <w:r>
+              <w:t xml:space="preserve">2.00</w:t>
+            </w:r>
+          </w:p>
+        </w:tc>
+        <w:tc>
+          <w:tcPr/>
+          <w:p>
+            <w:pPr>
+              <w:pStyle w:val="Compact"/>
+              <w:jc w:val="right"/>
+            </w:pPr>
+            <w:r>
               <w:t xml:space="preserve">Tracking &amp; Wearables</w:t>
             </w:r>
           </w:p>
@@ -4226,6 +4823,18 @@
               <w:jc w:val="right"/>
             </w:pPr>
             <w:r>
+              <w:t xml:space="preserve">6.2%</w:t>
+            </w:r>
+          </w:p>
+        </w:tc>
+        <w:tc>
+          <w:tcPr/>
+          <w:p>
+            <w:pPr>
+              <w:pStyle w:val="Compact"/>
+              <w:jc w:val="right"/>
+            </w:pPr>
+            <w:r>
               <w:t xml:space="preserve">4.5%</w:t>
             </w:r>
           </w:p>
@@ -4238,7 +4847,19 @@
               <w:jc w:val="right"/>
             </w:pPr>
             <w:r>
-              <w:t xml:space="preserve">.388</w:t>
+              <w:t xml:space="preserve">.413</w:t>
+            </w:r>
+          </w:p>
+        </w:tc>
+        <w:tc>
+          <w:tcPr/>
+          <w:p>
+            <w:pPr>
+              <w:pStyle w:val="Compact"/>
+              <w:jc w:val="right"/>
+            </w:pPr>
+            <w:r>
+              <w:t xml:space="preserve">.508</w:t>
             </w:r>
           </w:p>
         </w:tc>
@@ -4251,6 +4872,18 @@
               <w:pStyle w:val="Compact"/>
             </w:pPr>
             <w:r>
+              <w:t xml:space="preserve">1.84</w:t>
+            </w:r>
+          </w:p>
+        </w:tc>
+        <w:tc>
+          <w:tcPr/>
+          <w:p>
+            <w:pPr>
+              <w:pStyle w:val="Compact"/>
+              <w:jc w:val="right"/>
+            </w:pPr>
+            <w:r>
               <w:t xml:space="preserve">Other</w:t>
             </w:r>
           </w:p>
@@ -4287,6 +4920,18 @@
               <w:jc w:val="right"/>
             </w:pPr>
             <w:r>
+              <w:t xml:space="preserve">31.2%</w:t>
+            </w:r>
+          </w:p>
+        </w:tc>
+        <w:tc>
+          <w:tcPr/>
+          <w:p>
+            <w:pPr>
+              <w:pStyle w:val="Compact"/>
+              <w:jc w:val="right"/>
+            </w:pPr>
+            <w:r>
               <w:t xml:space="preserve">7.3%</w:t>
             </w:r>
           </w:p>
@@ -4299,7 +4944,19 @@
               <w:jc w:val="right"/>
             </w:pPr>
             <w:r>
-              <w:t xml:space="preserve">.440</w:t>
+              <w:t xml:space="preserve">.458</w:t>
+            </w:r>
+          </w:p>
+        </w:tc>
+        <w:tc>
+          <w:tcPr/>
+          <w:p>
+            <w:pPr>
+              <w:pStyle w:val="Compact"/>
+              <w:jc w:val="right"/>
+            </w:pPr>
+            <w:r>
+              <w:t xml:space="preserve">.523</w:t>
             </w:r>
           </w:p>
         </w:tc>
@@ -6972,7 +7629,7 @@
         <w:pStyle w:val="Caption"/>
       </w:pPr>
       <w:r>
-        <w:t xml:space="preserve">Academic and media attention to consumer-technology clusters, 2008–2026. Academic share and media share are the pooled share of attention that each cluster received within all consumer-technology mentions of its respective corpus, pooled across the whole period rather than averaged over years. The gap is the academic share minus the media share, in percentage points. The ratio divides each cluster’s share of all academic technology mentions by its share of all media technology mentions; values above 1 indicate a cluster that draws more academic than media attention and values below 1 the reverse. For each cluster we draw a Dirichlet posterior of the academic share vector, using the media distribution as the baseline; Credibly higher marks a cluster whose 95% credible interval for the academic-to-media ratio lies entirely above 1, Credibly lower one that lies entirely below it.</w:t>
+        <w:t xml:space="preserve">Academic and media attention to consumer-technology clusters, 2008–2026. Academic share and media share are the pooled share of attention that each cluster received within all consumer-technology mentions of its respective corpus, pooled across the whole period rather than averaged over years. The gap is the academic share minus the media share, in percentage points. Academic rank and media rank order the clusters by their pooled share within each corpus, with 1 the largest share and tied shares given their average rank. The ratio divides each cluster’s share of all academic technology mentions by its share of all media technology mentions; values above 1 indicate a cluster that draws more academic than media attention and values below 1 the reverse. For each cluster we draw a Dirichlet posterior of the academic share vector, using the media distribution as the baseline; Credibly higher marks a cluster whose 95% credible interval for the academic-to-media ratio lies entirely above 1, Credibly lower one that lies entirely below it.</w:t>
       </w:r>
     </w:p>
     <w:bookmarkStart w:id="64" w:name="tbl-coverage-gap"/>
@@ -6984,12 +7641,14 @@
         <w:tblLook w:firstRow="1" w:lastRow="0" w:firstColumn="0" w:lastColumn="0" w:noHBand="0" w:noVBand="0" w:val="0020"/>
       </w:tblPr>
       <w:tblGrid>
+        <w:gridCol w:w="742"/>
         <w:gridCol w:w="990"/>
-        <w:gridCol w:w="1320"/>
-        <w:gridCol w:w="1320"/>
-        <w:gridCol w:w="1320"/>
-        <w:gridCol w:w="1320"/>
-        <w:gridCol w:w="1650"/>
+        <w:gridCol w:w="990"/>
+        <w:gridCol w:w="990"/>
+        <w:gridCol w:w="990"/>
+        <w:gridCol w:w="990"/>
+        <w:gridCol w:w="990"/>
+        <w:gridCol w:w="1237"/>
       </w:tblGrid>
       <w:tr>
         <w:trPr>
@@ -7026,7 +7685,31 @@
               <w:jc w:val="right"/>
             </w:pPr>
             <w:r>
+              <w:t xml:space="preserve">Academic rank</w:t>
+            </w:r>
+          </w:p>
+        </w:tc>
+        <w:tc>
+          <w:tcPr/>
+          <w:p>
+            <w:pPr>
+              <w:pStyle w:val="Compact"/>
+              <w:jc w:val="right"/>
+            </w:pPr>
+            <w:r>
               <w:t xml:space="preserve">Media share</w:t>
+            </w:r>
+          </w:p>
+        </w:tc>
+        <w:tc>
+          <w:tcPr/>
+          <w:p>
+            <w:pPr>
+              <w:pStyle w:val="Compact"/>
+              <w:jc w:val="right"/>
+            </w:pPr>
+            <w:r>
+              <w:t xml:space="preserve">Media rank</w:t>
             </w:r>
           </w:p>
         </w:tc>
@@ -7075,55 +7758,79 @@
               <w:pStyle w:val="Compact"/>
             </w:pPr>
             <w:r>
-              <w:t xml:space="preserve">AR, VR &amp; Robots</w:t>
-            </w:r>
-          </w:p>
-        </w:tc>
-        <w:tc>
-          <w:tcPr/>
-          <w:p>
-            <w:pPr>
-              <w:pStyle w:val="Compact"/>
-              <w:jc w:val="right"/>
-            </w:pPr>
-            <w:r>
-              <w:t xml:space="preserve">3.72%</w:t>
-            </w:r>
-          </w:p>
-        </w:tc>
-        <w:tc>
-          <w:tcPr/>
-          <w:p>
-            <w:pPr>
-              <w:pStyle w:val="Compact"/>
-              <w:jc w:val="right"/>
-            </w:pPr>
-            <w:r>
-              <w:t xml:space="preserve">2.18%</w:t>
-            </w:r>
-          </w:p>
-        </w:tc>
-        <w:tc>
-          <w:tcPr/>
-          <w:p>
-            <w:pPr>
-              <w:pStyle w:val="Compact"/>
-              <w:jc w:val="right"/>
-            </w:pPr>
-            <w:r>
-              <w:t xml:space="preserve">+1.5</w:t>
-            </w:r>
-          </w:p>
-        </w:tc>
-        <w:tc>
-          <w:tcPr/>
-          <w:p>
-            <w:pPr>
-              <w:pStyle w:val="Compact"/>
-              <w:jc w:val="right"/>
-            </w:pPr>
-            <w:r>
-              <w:t xml:space="preserve">1.70</w:t>
+              <w:t xml:space="preserve">Algorithms &amp; Recommendations</w:t>
+            </w:r>
+          </w:p>
+        </w:tc>
+        <w:tc>
+          <w:tcPr/>
+          <w:p>
+            <w:pPr>
+              <w:pStyle w:val="Compact"/>
+              <w:jc w:val="right"/>
+            </w:pPr>
+            <w:r>
+              <w:t xml:space="preserve">6.58%</w:t>
+            </w:r>
+          </w:p>
+        </w:tc>
+        <w:tc>
+          <w:tcPr/>
+          <w:p>
+            <w:pPr>
+              <w:pStyle w:val="Compact"/>
+              <w:jc w:val="right"/>
+            </w:pPr>
+            <w:r>
+              <w:t xml:space="preserve">6</w:t>
+            </w:r>
+          </w:p>
+        </w:tc>
+        <w:tc>
+          <w:tcPr/>
+          <w:p>
+            <w:pPr>
+              <w:pStyle w:val="Compact"/>
+              <w:jc w:val="right"/>
+            </w:pPr>
+            <w:r>
+              <w:t xml:space="preserve">1.32%</w:t>
+            </w:r>
+          </w:p>
+        </w:tc>
+        <w:tc>
+          <w:tcPr/>
+          <w:p>
+            <w:pPr>
+              <w:pStyle w:val="Compact"/>
+              <w:jc w:val="right"/>
+            </w:pPr>
+            <w:r>
+              <w:t xml:space="preserve">12</w:t>
+            </w:r>
+          </w:p>
+        </w:tc>
+        <w:tc>
+          <w:tcPr/>
+          <w:p>
+            <w:pPr>
+              <w:pStyle w:val="Compact"/>
+              <w:jc w:val="right"/>
+            </w:pPr>
+            <w:r>
+              <w:t xml:space="preserve">+5.3</w:t>
+            </w:r>
+          </w:p>
+        </w:tc>
+        <w:tc>
+          <w:tcPr/>
+          <w:p>
+            <w:pPr>
+              <w:pStyle w:val="Compact"/>
+              <w:jc w:val="right"/>
+            </w:pPr>
+            <w:r>
+              <w:t xml:space="preserve">4.97</w:t>
             </w:r>
           </w:p>
         </w:tc>
@@ -7148,55 +7855,79 @@
               <w:pStyle w:val="Compact"/>
             </w:pPr>
             <w:r>
-              <w:t xml:space="preserve">Algorithms &amp; Recommendations</w:t>
-            </w:r>
-          </w:p>
-        </w:tc>
-        <w:tc>
-          <w:tcPr/>
-          <w:p>
-            <w:pPr>
-              <w:pStyle w:val="Compact"/>
-              <w:jc w:val="right"/>
-            </w:pPr>
-            <w:r>
-              <w:t xml:space="preserve">6.58%</w:t>
-            </w:r>
-          </w:p>
-        </w:tc>
-        <w:tc>
-          <w:tcPr/>
-          <w:p>
-            <w:pPr>
-              <w:pStyle w:val="Compact"/>
-              <w:jc w:val="right"/>
-            </w:pPr>
-            <w:r>
-              <w:t xml:space="preserve">1.32%</w:t>
-            </w:r>
-          </w:p>
-        </w:tc>
-        <w:tc>
-          <w:tcPr/>
-          <w:p>
-            <w:pPr>
-              <w:pStyle w:val="Compact"/>
-              <w:jc w:val="right"/>
-            </w:pPr>
-            <w:r>
-              <w:t xml:space="preserve">+5.3</w:t>
-            </w:r>
-          </w:p>
-        </w:tc>
-        <w:tc>
-          <w:tcPr/>
-          <w:p>
-            <w:pPr>
-              <w:pStyle w:val="Compact"/>
-              <w:jc w:val="right"/>
-            </w:pPr>
-            <w:r>
-              <w:t xml:space="preserve">4.97</w:t>
+              <w:t xml:space="preserve">AR, VR &amp; Robots</w:t>
+            </w:r>
+          </w:p>
+        </w:tc>
+        <w:tc>
+          <w:tcPr/>
+          <w:p>
+            <w:pPr>
+              <w:pStyle w:val="Compact"/>
+              <w:jc w:val="right"/>
+            </w:pPr>
+            <w:r>
+              <w:t xml:space="preserve">3.72%</w:t>
+            </w:r>
+          </w:p>
+        </w:tc>
+        <w:tc>
+          <w:tcPr/>
+          <w:p>
+            <w:pPr>
+              <w:pStyle w:val="Compact"/>
+              <w:jc w:val="right"/>
+            </w:pPr>
+            <w:r>
+              <w:t xml:space="preserve">13</w:t>
+            </w:r>
+          </w:p>
+        </w:tc>
+        <w:tc>
+          <w:tcPr/>
+          <w:p>
+            <w:pPr>
+              <w:pStyle w:val="Compact"/>
+              <w:jc w:val="right"/>
+            </w:pPr>
+            <w:r>
+              <w:t xml:space="preserve">2.18%</w:t>
+            </w:r>
+          </w:p>
+        </w:tc>
+        <w:tc>
+          <w:tcPr/>
+          <w:p>
+            <w:pPr>
+              <w:pStyle w:val="Compact"/>
+              <w:jc w:val="right"/>
+            </w:pPr>
+            <w:r>
+              <w:t xml:space="preserve">11</w:t>
+            </w:r>
+          </w:p>
+        </w:tc>
+        <w:tc>
+          <w:tcPr/>
+          <w:p>
+            <w:pPr>
+              <w:pStyle w:val="Compact"/>
+              <w:jc w:val="right"/>
+            </w:pPr>
+            <w:r>
+              <w:t xml:space="preserve">+1.5</w:t>
+            </w:r>
+          </w:p>
+        </w:tc>
+        <w:tc>
+          <w:tcPr/>
+          <w:p>
+            <w:pPr>
+              <w:pStyle w:val="Compact"/>
+              <w:jc w:val="right"/>
+            </w:pPr>
+            <w:r>
+              <w:t xml:space="preserve">1.70</w:t>
             </w:r>
           </w:p>
         </w:tc>
@@ -7245,7 +7976,31 @@
               <w:jc w:val="right"/>
             </w:pPr>
             <w:r>
+              <w:t xml:space="preserve">16</w:t>
+            </w:r>
+          </w:p>
+        </w:tc>
+        <w:tc>
+          <w:tcPr/>
+          <w:p>
+            <w:pPr>
+              <w:pStyle w:val="Compact"/>
+              <w:jc w:val="right"/>
+            </w:pPr>
+            <w:r>
               <w:t xml:space="preserve">0.02%</w:t>
+            </w:r>
+          </w:p>
+        </w:tc>
+        <w:tc>
+          <w:tcPr/>
+          <w:p>
+            <w:pPr>
+              <w:pStyle w:val="Compact"/>
+              <w:jc w:val="right"/>
+            </w:pPr>
+            <w:r>
+              <w:t xml:space="preserve">16</w:t>
             </w:r>
           </w:p>
         </w:tc>
@@ -7318,7 +8073,31 @@
               <w:jc w:val="right"/>
             </w:pPr>
             <w:r>
+              <w:t xml:space="preserve">5</w:t>
+            </w:r>
+          </w:p>
+        </w:tc>
+        <w:tc>
+          <w:tcPr/>
+          <w:p>
+            <w:pPr>
+              <w:pStyle w:val="Compact"/>
+              <w:jc w:val="right"/>
+            </w:pPr>
+            <w:r>
               <w:t xml:space="preserve">9.21%</w:t>
+            </w:r>
+          </w:p>
+        </w:tc>
+        <w:tc>
+          <w:tcPr/>
+          <w:p>
+            <w:pPr>
+              <w:pStyle w:val="Compact"/>
+              <w:jc w:val="right"/>
+            </w:pPr>
+            <w:r>
+              <w:t xml:space="preserve">5</w:t>
             </w:r>
           </w:p>
         </w:tc>
@@ -7391,7 +8170,31 @@
               <w:jc w:val="right"/>
             </w:pPr>
             <w:r>
+              <w:t xml:space="preserve">7.5</w:t>
+            </w:r>
+          </w:p>
+        </w:tc>
+        <w:tc>
+          <w:tcPr/>
+          <w:p>
+            <w:pPr>
+              <w:pStyle w:val="Compact"/>
+              <w:jc w:val="right"/>
+            </w:pPr>
+            <w:r>
               <w:t xml:space="preserve">3.15%</w:t>
+            </w:r>
+          </w:p>
+        </w:tc>
+        <w:tc>
+          <w:tcPr/>
+          <w:p>
+            <w:pPr>
+              <w:pStyle w:val="Compact"/>
+              <w:jc w:val="right"/>
+            </w:pPr>
+            <w:r>
+              <w:t xml:space="preserve">9</w:t>
             </w:r>
           </w:p>
         </w:tc>
@@ -7464,7 +8267,31 @@
               <w:jc w:val="right"/>
             </w:pPr>
             <w:r>
+              <w:t xml:space="preserve">11</w:t>
+            </w:r>
+          </w:p>
+        </w:tc>
+        <w:tc>
+          <w:tcPr/>
+          <w:p>
+            <w:pPr>
+              <w:pStyle w:val="Compact"/>
+              <w:jc w:val="right"/>
+            </w:pPr>
+            <w:r>
               <w:t xml:space="preserve">1.10%</w:t>
+            </w:r>
+          </w:p>
+        </w:tc>
+        <w:tc>
+          <w:tcPr/>
+          <w:p>
+            <w:pPr>
+              <w:pStyle w:val="Compact"/>
+              <w:jc w:val="right"/>
+            </w:pPr>
+            <w:r>
+              <w:t xml:space="preserve">13</w:t>
             </w:r>
           </w:p>
         </w:tc>
@@ -7537,7 +8364,31 @@
               <w:jc w:val="right"/>
             </w:pPr>
             <w:r>
+              <w:t xml:space="preserve">4</w:t>
+            </w:r>
+          </w:p>
+        </w:tc>
+        <w:tc>
+          <w:tcPr/>
+          <w:p>
+            <w:pPr>
+              <w:pStyle w:val="Compact"/>
+              <w:jc w:val="right"/>
+            </w:pPr>
+            <w:r>
               <w:t xml:space="preserve">2.37%</w:t>
+            </w:r>
+          </w:p>
+        </w:tc>
+        <w:tc>
+          <w:tcPr/>
+          <w:p>
+            <w:pPr>
+              <w:pStyle w:val="Compact"/>
+              <w:jc w:val="right"/>
+            </w:pPr>
+            <w:r>
+              <w:t xml:space="preserve">10</w:t>
             </w:r>
           </w:p>
         </w:tc>
@@ -7586,7 +8437,7 @@
               <w:pStyle w:val="Compact"/>
             </w:pPr>
             <w:r>
-              <w:t xml:space="preserve">Generative AI</w:t>
+              <w:t xml:space="preserve">(Generative) AI</w:t>
             </w:r>
           </w:p>
         </w:tc>
@@ -7610,7 +8461,31 @@
               <w:jc w:val="right"/>
             </w:pPr>
             <w:r>
+              <w:t xml:space="preserve">1</w:t>
+            </w:r>
+          </w:p>
+        </w:tc>
+        <w:tc>
+          <w:tcPr/>
+          <w:p>
+            <w:pPr>
+              <w:pStyle w:val="Compact"/>
+              <w:jc w:val="right"/>
+            </w:pPr>
+            <w:r>
               <w:t xml:space="preserve">5.44%</w:t>
+            </w:r>
+          </w:p>
+        </w:tc>
+        <w:tc>
+          <w:tcPr/>
+          <w:p>
+            <w:pPr>
+              <w:pStyle w:val="Compact"/>
+              <w:jc w:val="right"/>
+            </w:pPr>
+            <w:r>
+              <w:t xml:space="preserve">8</w:t>
             </w:r>
           </w:p>
         </w:tc>
@@ -7683,7 +8558,31 @@
               <w:jc w:val="right"/>
             </w:pPr>
             <w:r>
+              <w:t xml:space="preserve">7.5</w:t>
+            </w:r>
+          </w:p>
+        </w:tc>
+        <w:tc>
+          <w:tcPr/>
+          <w:p>
+            <w:pPr>
+              <w:pStyle w:val="Compact"/>
+              <w:jc w:val="right"/>
+            </w:pPr>
+            <w:r>
               <w:t xml:space="preserve">16.79%</w:t>
+            </w:r>
+          </w:p>
+        </w:tc>
+        <w:tc>
+          <w:tcPr/>
+          <w:p>
+            <w:pPr>
+              <w:pStyle w:val="Compact"/>
+              <w:jc w:val="right"/>
+            </w:pPr>
+            <w:r>
+              <w:t xml:space="preserve">2</w:t>
             </w:r>
           </w:p>
         </w:tc>
@@ -7756,7 +8655,31 @@
               <w:jc w:val="right"/>
             </w:pPr>
             <w:r>
+              <w:t xml:space="preserve">15</w:t>
+            </w:r>
+          </w:p>
+        </w:tc>
+        <w:tc>
+          <w:tcPr/>
+          <w:p>
+            <w:pPr>
+              <w:pStyle w:val="Compact"/>
+              <w:jc w:val="right"/>
+            </w:pPr>
+            <w:r>
               <w:t xml:space="preserve">0.73%</w:t>
+            </w:r>
+          </w:p>
+        </w:tc>
+        <w:tc>
+          <w:tcPr/>
+          <w:p>
+            <w:pPr>
+              <w:pStyle w:val="Compact"/>
+              <w:jc w:val="right"/>
+            </w:pPr>
+            <w:r>
+              <w:t xml:space="preserve">14</w:t>
             </w:r>
           </w:p>
         </w:tc>
@@ -7829,7 +8752,31 @@
               <w:jc w:val="right"/>
             </w:pPr>
             <w:r>
+              <w:t xml:space="preserve">9</w:t>
+            </w:r>
+          </w:p>
+        </w:tc>
+        <w:tc>
+          <w:tcPr/>
+          <w:p>
+            <w:pPr>
+              <w:pStyle w:val="Compact"/>
+              <w:jc w:val="right"/>
+            </w:pPr>
+            <w:r>
               <w:t xml:space="preserve">7.61%</w:t>
+            </w:r>
+          </w:p>
+        </w:tc>
+        <w:tc>
+          <w:tcPr/>
+          <w:p>
+            <w:pPr>
+              <w:pStyle w:val="Compact"/>
+              <w:jc w:val="right"/>
+            </w:pPr>
+            <w:r>
+              <w:t xml:space="preserve">6</w:t>
             </w:r>
           </w:p>
         </w:tc>
@@ -7902,7 +8849,31 @@
               <w:jc w:val="right"/>
             </w:pPr>
             <w:r>
+              <w:t xml:space="preserve">3</w:t>
+            </w:r>
+          </w:p>
+        </w:tc>
+        <w:tc>
+          <w:tcPr/>
+          <w:p>
+            <w:pPr>
+              <w:pStyle w:val="Compact"/>
+              <w:jc w:val="right"/>
+            </w:pPr>
+            <w:r>
               <w:t xml:space="preserve">10.80%</w:t>
+            </w:r>
+          </w:p>
+        </w:tc>
+        <w:tc>
+          <w:tcPr/>
+          <w:p>
+            <w:pPr>
+              <w:pStyle w:val="Compact"/>
+              <w:jc w:val="right"/>
+            </w:pPr>
+            <w:r>
+              <w:t xml:space="preserve">4</w:t>
             </w:r>
           </w:p>
         </w:tc>
@@ -7975,7 +8946,31 @@
               <w:jc w:val="right"/>
             </w:pPr>
             <w:r>
+              <w:t xml:space="preserve">2</w:t>
+            </w:r>
+          </w:p>
+        </w:tc>
+        <w:tc>
+          <w:tcPr/>
+          <w:p>
+            <w:pPr>
+              <w:pStyle w:val="Compact"/>
+              <w:jc w:val="right"/>
+            </w:pPr>
+            <w:r>
               <w:t xml:space="preserve">21.42%</w:t>
+            </w:r>
+          </w:p>
+        </w:tc>
+        <w:tc>
+          <w:tcPr/>
+          <w:p>
+            <w:pPr>
+              <w:pStyle w:val="Compact"/>
+              <w:jc w:val="right"/>
+            </w:pPr>
+            <w:r>
+              <w:t xml:space="preserve">1</w:t>
             </w:r>
           </w:p>
         </w:tc>
@@ -8048,7 +9043,31 @@
               <w:jc w:val="right"/>
             </w:pPr>
             <w:r>
+              <w:t xml:space="preserve">12</w:t>
+            </w:r>
+          </w:p>
+        </w:tc>
+        <w:tc>
+          <w:tcPr/>
+          <w:p>
+            <w:pPr>
+              <w:pStyle w:val="Compact"/>
+              <w:jc w:val="right"/>
+            </w:pPr>
+            <w:r>
               <w:t xml:space="preserve">6.47%</w:t>
+            </w:r>
+          </w:p>
+        </w:tc>
+        <w:tc>
+          <w:tcPr/>
+          <w:p>
+            <w:pPr>
+              <w:pStyle w:val="Compact"/>
+              <w:jc w:val="right"/>
+            </w:pPr>
+            <w:r>
+              <w:t xml:space="preserve">7</w:t>
             </w:r>
           </w:p>
         </w:tc>
@@ -8121,7 +9140,31 @@
               <w:jc w:val="right"/>
             </w:pPr>
             <w:r>
+              <w:t xml:space="preserve">14</w:t>
+            </w:r>
+          </w:p>
+        </w:tc>
+        <w:tc>
+          <w:tcPr/>
+          <w:p>
+            <w:pPr>
+              <w:pStyle w:val="Compact"/>
+              <w:jc w:val="right"/>
+            </w:pPr>
+            <w:r>
               <w:t xml:space="preserve">0.53%</w:t>
+            </w:r>
+          </w:p>
+        </w:tc>
+        <w:tc>
+          <w:tcPr/>
+          <w:p>
+            <w:pPr>
+              <w:pStyle w:val="Compact"/>
+              <w:jc w:val="right"/>
+            </w:pPr>
+            <w:r>
+              <w:t xml:space="preserve">15</w:t>
             </w:r>
           </w:p>
         </w:tc>
@@ -8194,7 +9237,31 @@
               <w:jc w:val="right"/>
             </w:pPr>
             <w:r>
+              <w:t xml:space="preserve">10</w:t>
+            </w:r>
+          </w:p>
+        </w:tc>
+        <w:tc>
+          <w:tcPr/>
+          <w:p>
+            <w:pPr>
+              <w:pStyle w:val="Compact"/>
+              <w:jc w:val="right"/>
+            </w:pPr>
+            <w:r>
               <w:t xml:space="preserve">10.84%</w:t>
+            </w:r>
+          </w:p>
+        </w:tc>
+        <w:tc>
+          <w:tcPr/>
+          <w:p>
+            <w:pPr>
+              <w:pStyle w:val="Compact"/>
+              <w:jc w:val="right"/>
+            </w:pPr>
+            <w:r>
+              <w:t xml:space="preserve">3</w:t>
             </w:r>
           </w:p>
         </w:tc>
@@ -8451,6 +9518,167 @@
               <w:pStyle w:val="Compact"/>
             </w:pPr>
             <w:r>
+              <w:t xml:space="preserve">(Generative) AI</w:t>
+            </w:r>
+          </w:p>
+        </w:tc>
+        <w:tc>
+          <w:tcPr/>
+          <w:p>
+            <w:pPr>
+              <w:pStyle w:val="Compact"/>
+              <w:jc w:val="right"/>
+            </w:pPr>
+            <w:r>
+              <w:t xml:space="preserve">0.727 (p = .071)</w:t>
+            </w:r>
+          </w:p>
+        </w:tc>
+        <w:tc>
+          <w:tcPr/>
+          <w:p>
+            <w:pPr>
+              <w:pStyle w:val="Compact"/>
+              <w:jc w:val="right"/>
+            </w:pPr>
+            <w:r>
+              <w:t xml:space="preserve">0.824 (p = .067)</w:t>
+            </w:r>
+          </w:p>
+        </w:tc>
+        <w:tc>
+          <w:tcPr/>
+          <w:p>
+            <w:pPr>
+              <w:pStyle w:val="Compact"/>
+              <w:jc w:val="right"/>
+            </w:pPr>
+            <w:r>
+              <w:t xml:space="preserve">0.862 (p = .062)</w:t>
+            </w:r>
+          </w:p>
+        </w:tc>
+        <w:tc>
+          <w:tcPr/>
+          <w:p>
+            <w:pPr>
+              <w:pStyle w:val="Compact"/>
+              <w:jc w:val="right"/>
+            </w:pPr>
+            <w:r>
+              <w:t xml:space="preserve">0.852 (p = .059)</w:t>
+            </w:r>
+          </w:p>
+        </w:tc>
+        <w:tc>
+          <w:tcPr/>
+          <w:p>
+            <w:pPr>
+              <w:pStyle w:val="Compact"/>
+              <w:jc w:val="right"/>
+            </w:pPr>
+            <w:r>
+              <w:t xml:space="preserve">0.876 (p = .056)</w:t>
+            </w:r>
+          </w:p>
+        </w:tc>
+        <w:tc>
+          <w:tcPr/>
+          <w:p>
+            <w:pPr>
+              <w:pStyle w:val="Compact"/>
+              <w:jc w:val="right"/>
+            </w:pPr>
+            <w:r>
+              <w:t xml:space="preserve">0.873 (p = .053)</w:t>
+            </w:r>
+          </w:p>
+        </w:tc>
+        <w:tc>
+          <w:tcPr/>
+          <w:p>
+            <w:pPr>
+              <w:pStyle w:val="Compact"/>
+              <w:jc w:val="right"/>
+            </w:pPr>
+            <w:r>
+              <w:t xml:space="preserve">0.741 (p = .056)</w:t>
+            </w:r>
+          </w:p>
+        </w:tc>
+        <w:tc>
+          <w:tcPr/>
+          <w:p>
+            <w:pPr>
+              <w:pStyle w:val="Compact"/>
+              <w:jc w:val="right"/>
+            </w:pPr>
+            <w:r>
+              <w:t xml:space="preserve">0.726 (p = .059)</w:t>
+            </w:r>
+          </w:p>
+        </w:tc>
+        <w:tc>
+          <w:tcPr/>
+          <w:p>
+            <w:pPr>
+              <w:pStyle w:val="Compact"/>
+              <w:jc w:val="right"/>
+            </w:pPr>
+            <w:r>
+              <w:t xml:space="preserve">0.657 (p = .062)</w:t>
+            </w:r>
+          </w:p>
+        </w:tc>
+        <w:tc>
+          <w:tcPr/>
+          <w:p>
+            <w:pPr>
+              <w:pStyle w:val="Compact"/>
+              <w:jc w:val="right"/>
+            </w:pPr>
+            <w:r>
+              <w:rPr>
+                <w:b/>
+                <w:bCs/>
+              </w:rPr>
+              <w:t xml:space="preserve">0.905 (p = .067)</w:t>
+            </w:r>
+          </w:p>
+        </w:tc>
+        <w:tc>
+          <w:tcPr/>
+          <w:p>
+            <w:pPr>
+              <w:pStyle w:val="Compact"/>
+              <w:jc w:val="right"/>
+            </w:pPr>
+            <w:r>
+              <w:t xml:space="preserve">0.891 (p = .071)</w:t>
+            </w:r>
+          </w:p>
+        </w:tc>
+        <w:tc>
+          <w:tcPr/>
+          <w:p>
+            <w:pPr>
+              <w:pStyle w:val="Compact"/>
+              <w:jc w:val="right"/>
+            </w:pPr>
+            <w:r>
+              <w:t xml:space="preserve">4</w:t>
+            </w:r>
+          </w:p>
+        </w:tc>
+      </w:tr>
+      <w:tr>
+        <w:tc>
+          <w:tcPr/>
+          <w:p>
+            <w:pPr>
+              <w:pStyle w:val="Compact"/>
+            </w:pPr>
+            <w:r>
               <w:t xml:space="preserve">AR, VR &amp; Robots</w:t>
             </w:r>
           </w:p>
@@ -9554,167 +10782,6 @@
             </w:pPr>
             <w:r>
               <w:t xml:space="preserve">0.433 (p = .214)</w:t>
-            </w:r>
-          </w:p>
-        </w:tc>
-        <w:tc>
-          <w:tcPr/>
-          <w:p>
-            <w:pPr>
-              <w:pStyle w:val="Compact"/>
-              <w:jc w:val="right"/>
-            </w:pPr>
-            <w:r>
-              <w:t xml:space="preserve">4</w:t>
-            </w:r>
-          </w:p>
-        </w:tc>
-      </w:tr>
-      <w:tr>
-        <w:tc>
-          <w:tcPr/>
-          <w:p>
-            <w:pPr>
-              <w:pStyle w:val="Compact"/>
-            </w:pPr>
-            <w:r>
-              <w:t xml:space="preserve">Generative AI</w:t>
-            </w:r>
-          </w:p>
-        </w:tc>
-        <w:tc>
-          <w:tcPr/>
-          <w:p>
-            <w:pPr>
-              <w:pStyle w:val="Compact"/>
-              <w:jc w:val="right"/>
-            </w:pPr>
-            <w:r>
-              <w:t xml:space="preserve">0.727 (p = .071)</w:t>
-            </w:r>
-          </w:p>
-        </w:tc>
-        <w:tc>
-          <w:tcPr/>
-          <w:p>
-            <w:pPr>
-              <w:pStyle w:val="Compact"/>
-              <w:jc w:val="right"/>
-            </w:pPr>
-            <w:r>
-              <w:t xml:space="preserve">0.824 (p = .067)</w:t>
-            </w:r>
-          </w:p>
-        </w:tc>
-        <w:tc>
-          <w:tcPr/>
-          <w:p>
-            <w:pPr>
-              <w:pStyle w:val="Compact"/>
-              <w:jc w:val="right"/>
-            </w:pPr>
-            <w:r>
-              <w:t xml:space="preserve">0.862 (p = .062)</w:t>
-            </w:r>
-          </w:p>
-        </w:tc>
-        <w:tc>
-          <w:tcPr/>
-          <w:p>
-            <w:pPr>
-              <w:pStyle w:val="Compact"/>
-              <w:jc w:val="right"/>
-            </w:pPr>
-            <w:r>
-              <w:t xml:space="preserve">0.852 (p = .059)</w:t>
-            </w:r>
-          </w:p>
-        </w:tc>
-        <w:tc>
-          <w:tcPr/>
-          <w:p>
-            <w:pPr>
-              <w:pStyle w:val="Compact"/>
-              <w:jc w:val="right"/>
-            </w:pPr>
-            <w:r>
-              <w:t xml:space="preserve">0.876 (p = .056)</w:t>
-            </w:r>
-          </w:p>
-        </w:tc>
-        <w:tc>
-          <w:tcPr/>
-          <w:p>
-            <w:pPr>
-              <w:pStyle w:val="Compact"/>
-              <w:jc w:val="right"/>
-            </w:pPr>
-            <w:r>
-              <w:t xml:space="preserve">0.873 (p = .053)</w:t>
-            </w:r>
-          </w:p>
-        </w:tc>
-        <w:tc>
-          <w:tcPr/>
-          <w:p>
-            <w:pPr>
-              <w:pStyle w:val="Compact"/>
-              <w:jc w:val="right"/>
-            </w:pPr>
-            <w:r>
-              <w:t xml:space="preserve">0.741 (p = .056)</w:t>
-            </w:r>
-          </w:p>
-        </w:tc>
-        <w:tc>
-          <w:tcPr/>
-          <w:p>
-            <w:pPr>
-              <w:pStyle w:val="Compact"/>
-              <w:jc w:val="right"/>
-            </w:pPr>
-            <w:r>
-              <w:t xml:space="preserve">0.726 (p = .059)</w:t>
-            </w:r>
-          </w:p>
-        </w:tc>
-        <w:tc>
-          <w:tcPr/>
-          <w:p>
-            <w:pPr>
-              <w:pStyle w:val="Compact"/>
-              <w:jc w:val="right"/>
-            </w:pPr>
-            <w:r>
-              <w:t xml:space="preserve">0.657 (p = .062)</w:t>
-            </w:r>
-          </w:p>
-        </w:tc>
-        <w:tc>
-          <w:tcPr/>
-          <w:p>
-            <w:pPr>
-              <w:pStyle w:val="Compact"/>
-              <w:jc w:val="right"/>
-            </w:pPr>
-            <w:r>
-              <w:rPr>
-                <w:b/>
-                <w:bCs/>
-              </w:rPr>
-              <w:t xml:space="preserve">0.905 (p = .067)</w:t>
-            </w:r>
-          </w:p>
-        </w:tc>
-        <w:tc>
-          <w:tcPr/>
-          <w:p>
-            <w:pPr>
-              <w:pStyle w:val="Compact"/>
-              <w:jc w:val="right"/>
-            </w:pPr>
-            <w:r>
-              <w:t xml:space="preserve">0.891 (p = .071)</w:t>
             </w:r>
           </w:p>
         </w:tc>

</xml_diff>